<commit_message>
Reassess LME036 mapping confidence and preserve map model controls
</commit_message>
<xml_diff>
--- a/regions/LME_036/Model_validation_36_1_South_China_Sea_SCS-2007_Northern_South_China_Sea_(2000s).docx
+++ b/regions/LME_036/Model_validation_36_1_South_China_Sea_SCS-2007_Northern_South_China_Sea_(2000s).docx
@@ -11,7 +11,6 @@
       </w:r>
     </w:p>
     <w:p>
-      <w:pPr/>
       <w:r>
         <w:t>Validation record for the selected 2000s northern South China Sea model. The linked Excel appendix lists all 374 taxa, with mapping confidence and assumptions. Estimates remain provisional.</w:t>
       </w:r>
@@ -24,7 +23,7 @@
         <w:tblLook w:val="04A0" w:firstRow="1" w:lastRow="0" w:firstColumn="1" w:lastColumn="0" w:noHBand="0" w:noVBand="1"/>
       </w:tblPr>
       <w:tblGrid>
-        <w:gridCol w:w="1800"/>
+        <w:gridCol w:w="2203"/>
         <w:gridCol w:w="8237"/>
       </w:tblGrid>
       <w:tr>
@@ -59,7 +58,6 @@
               <w:rPr>
                 <w:b/>
                 <w:sz w:val="21"/>
-                <w:b/>
               </w:rPr>
               <w:t>Field</w:t>
             </w:r>
@@ -89,12 +87,11 @@
             </w:pPr>
             <w:r>
               <w:rPr>
-                <w:rFonts w:ascii="Calibri" w:hAnsi="Calibri"/>
+                <w:b/>
+                <w:color w:val="000000"/>
                 <w:sz w:val="21"/>
-                <w:color w:val="000000"/>
-                <w:b/>
               </w:rPr>
-              <w:t xml:space="preserve">Entry</w:t>
+              <w:t>Entry</w:t>
             </w:r>
           </w:p>
         </w:tc>
@@ -300,11 +297,10 @@
             </w:pPr>
             <w:r>
               <w:rPr>
-                <w:rFonts w:ascii="Calibri" w:hAnsi="Calibri"/>
+                <w:color w:val="000000"/>
                 <w:sz w:val="21"/>
-                <w:color w:val="000000"/>
               </w:rPr>
-              <w:t xml:space="preserve">Assessment: 2019 landings, as recorded in Overview / Settings. Total catch includes landings + discards.</w:t>
+              <w:t>Assessment: 2019 landings, as recorded in Overview / Settings. Total catch includes landings + discards.</w:t>
             </w:r>
           </w:p>
         </w:tc>
@@ -596,7 +592,35 @@
               <w:rPr>
                 <w:sz w:val="21"/>
               </w:rPr>
-              <w:t xml:space="preserve">• Jiang et al. (2023). A preliminary model of the mangrove ecosystem of Dongzhaigang Bay, Hainan, (China) based on Ecopath and Ecospace. </w:t>
+              <w:t xml:space="preserve">• Jiang et al. (2023). A preliminary model of the mangrove ecosystem of </w:t>
+            </w:r>
+            <w:proofErr w:type="spellStart"/>
+            <w:r>
+              <w:rPr>
+                <w:sz w:val="21"/>
+              </w:rPr>
+              <w:t>Dongzhaigang</w:t>
+            </w:r>
+            <w:proofErr w:type="spellEnd"/>
+            <w:r>
+              <w:rPr>
+                <w:sz w:val="21"/>
+              </w:rPr>
+              <w:t xml:space="preserve"> Bay, Hainan, (China) based on Ecopath and </w:t>
+            </w:r>
+            <w:proofErr w:type="spellStart"/>
+            <w:r>
+              <w:rPr>
+                <w:sz w:val="21"/>
+              </w:rPr>
+              <w:t>Ecospace</w:t>
+            </w:r>
+            <w:proofErr w:type="spellEnd"/>
+            <w:r>
+              <w:rPr>
+                <w:sz w:val="21"/>
+              </w:rPr>
+              <w:t xml:space="preserve">. </w:t>
             </w:r>
             <w:hyperlink r:id="rId19">
               <w:r>
@@ -633,7 +657,21 @@
               <w:rPr>
                 <w:sz w:val="21"/>
               </w:rPr>
-              <w:t xml:space="preserve">• Feng et al. (2026). Ecosystem characteristics and ecological carrying capacity of a subtropical marine ranch in the pearl river estuary: an ecopath modeling approach. </w:t>
+              <w:t xml:space="preserve">• Feng et al. (2026). Ecosystem characteristics and ecological carrying capacity of a subtropical marine ranch in the pearl river estuary: an </w:t>
+            </w:r>
+            <w:proofErr w:type="spellStart"/>
+            <w:r>
+              <w:rPr>
+                <w:sz w:val="21"/>
+              </w:rPr>
+              <w:t>ecopath</w:t>
+            </w:r>
+            <w:proofErr w:type="spellEnd"/>
+            <w:r>
+              <w:rPr>
+                <w:sz w:val="21"/>
+              </w:rPr>
+              <w:t xml:space="preserve"> modeling approach. </w:t>
             </w:r>
             <w:hyperlink r:id="rId21">
               <w:r>
@@ -745,21 +783,7 @@
                   <w:rStyle w:val="Hyperlink"/>
                   <w:sz w:val="21"/>
                 </w:rPr>
-                <w:t>Fold</w:t>
-              </w:r>
-              <w:r>
-                <w:rPr>
-                  <w:rStyle w:val="Hyperlink"/>
-                  <w:sz w:val="21"/>
-                </w:rPr>
-                <w:t>e</w:t>
-              </w:r>
-              <w:r>
-                <w:rPr>
-                  <w:rStyle w:val="Hyperlink"/>
-                  <w:sz w:val="21"/>
-                </w:rPr>
-                <w:t>r</w:t>
+                <w:t>Folder</w:t>
               </w:r>
             </w:hyperlink>
             <w:r>
@@ -774,21 +798,7 @@
                   <w:rStyle w:val="Hyperlink"/>
                   <w:sz w:val="21"/>
                 </w:rPr>
-                <w:t>JS</w:t>
-              </w:r>
-              <w:r>
-                <w:rPr>
-                  <w:rStyle w:val="Hyperlink"/>
-                  <w:sz w:val="21"/>
-                </w:rPr>
-                <w:t>O</w:t>
-              </w:r>
-              <w:r>
-                <w:rPr>
-                  <w:rStyle w:val="Hyperlink"/>
-                  <w:sz w:val="21"/>
-                </w:rPr>
-                <w:t>N</w:t>
+                <w:t>JSON</w:t>
               </w:r>
             </w:hyperlink>
             <w:r>
@@ -819,57 +829,57 @@
       <w:tr>
         <w:trPr>
           <w:cantSplit/>
+          <w:jc w:val="center"/>
         </w:trPr>
         <w:tc>
           <w:tcPr>
-            <w:tcW w:type="dxa" w:w="2203"/>
-            <w:vAlign w:val="center"/>
-            <w:shd w:fill="FFFFFF"/>
+            <w:tcW w:w="2203" w:type="dxa"/>
+            <w:tcBorders>
+              <w:top w:val="single" w:sz="5" w:space="0" w:color="D9D9D9"/>
+              <w:left w:val="single" w:sz="5" w:space="0" w:color="D9D9D9"/>
+              <w:bottom w:val="single" w:sz="5" w:space="0" w:color="D9D9D9"/>
+              <w:right w:val="single" w:sz="5" w:space="0" w:color="D9D9D9"/>
+            </w:tcBorders>
+            <w:shd w:val="clear" w:color="auto" w:fill="FFFFFF"/>
             <w:tcMar>
               <w:top w:w="90" w:type="dxa"/>
+              <w:left w:w="110" w:type="dxa"/>
               <w:bottom w:w="90" w:type="dxa"/>
-              <w:left w:w="110" w:type="dxa"/>
               <w:right w:w="110" w:type="dxa"/>
             </w:tcMar>
-            <w:tcBorders>
-              <w:top w:val="single" w:sz="5" w:color="D9D9D9"/>
-              <w:left w:val="single" w:sz="5" w:color="D9D9D9"/>
-              <w:bottom w:val="single" w:sz="5" w:color="D9D9D9"/>
-              <w:right w:val="single" w:sz="5" w:color="D9D9D9"/>
-            </w:tcBorders>
+            <w:vAlign w:val="center"/>
           </w:tcPr>
           <w:p>
             <w:pPr>
-              <w:spacing w:after="40" w:before="0" w:line="240" w:lineRule="auto"/>
+              <w:spacing w:after="40" w:line="240" w:lineRule="auto"/>
             </w:pPr>
             <w:r>
               <w:rPr>
-                <w:rFonts w:ascii="Calibri" w:hAnsi="Calibri"/>
+                <w:b/>
+                <w:color w:val="000000"/>
                 <w:sz w:val="21"/>
-                <w:color w:val="000000"/>
-                <w:b/>
               </w:rPr>
-              <w:t xml:space="preserve">Other models from the same article</w:t>
+              <w:t>Other models from the same article</w:t>
             </w:r>
           </w:p>
         </w:tc>
         <w:tc>
           <w:tcPr>
-            <w:tcW w:type="dxa" w:w="7834"/>
-            <w:vAlign w:val="center"/>
-            <w:shd w:fill="FFFFFF"/>
+            <w:tcW w:w="7834" w:type="dxa"/>
+            <w:tcBorders>
+              <w:top w:val="single" w:sz="5" w:space="0" w:color="D9D9D9"/>
+              <w:left w:val="single" w:sz="5" w:space="0" w:color="D9D9D9"/>
+              <w:bottom w:val="single" w:sz="5" w:space="0" w:color="D9D9D9"/>
+              <w:right w:val="single" w:sz="5" w:space="0" w:color="D9D9D9"/>
+            </w:tcBorders>
+            <w:shd w:val="clear" w:color="auto" w:fill="FFFFFF"/>
             <w:tcMar>
               <w:top w:w="90" w:type="dxa"/>
+              <w:left w:w="110" w:type="dxa"/>
               <w:bottom w:w="90" w:type="dxa"/>
-              <w:left w:w="110" w:type="dxa"/>
               <w:right w:w="110" w:type="dxa"/>
             </w:tcMar>
-            <w:tcBorders>
-              <w:top w:val="single" w:sz="5" w:color="D9D9D9"/>
-              <w:left w:val="single" w:sz="5" w:color="D9D9D9"/>
-              <w:bottom w:val="single" w:sz="5" w:color="D9D9D9"/>
-              <w:right w:val="single" w:sz="5" w:color="D9D9D9"/>
-            </w:tcBorders>
+            <w:vAlign w:val="center"/>
           </w:tcPr>
           <w:p>
             <w:pPr>
@@ -877,11 +887,10 @@
             </w:pPr>
             <w:r>
               <w:rPr>
-                <w:rFonts w:ascii="Calibri" w:hAnsi="Calibri"/>
+                <w:color w:val="000000"/>
                 <w:sz w:val="21"/>
-                <w:color w:val="000000"/>
               </w:rPr>
-              <w:t xml:space="preserve">Northern South China Sea (1970s): same northern shelf and 38 source groups; earlier biomass, mortality and catch parameterization with adult-heavy stages. Kept separately from the selected 2000s model.</w:t>
+              <w:t>Northern South China Sea (1970s): same northern shelf and 38 source groups; earlier biomass, mortality and catch parameterization with adult-heavy stages. Kept separately from the selected 2000s model.</w:t>
             </w:r>
           </w:p>
         </w:tc>
@@ -1035,39 +1044,7 @@
                   <w:sz w:val="21"/>
                   <w:u w:val="single"/>
                 </w:rPr>
-                <w:t>source reconst</w:t>
-              </w:r>
-              <w:r>
-                <w:rPr>
-                  <w:color w:val="0563C1"/>
-                  <w:sz w:val="21"/>
-                  <w:u w:val="single"/>
-                </w:rPr>
-                <w:t>r</w:t>
-              </w:r>
-              <w:r>
-                <w:rPr>
-                  <w:color w:val="0563C1"/>
-                  <w:sz w:val="21"/>
-                  <w:u w:val="single"/>
-                </w:rPr>
-                <w:t>uction r</w:t>
-              </w:r>
-              <w:r>
-                <w:rPr>
-                  <w:color w:val="0563C1"/>
-                  <w:sz w:val="21"/>
-                  <w:u w:val="single"/>
-                </w:rPr>
-                <w:t>e</w:t>
-              </w:r>
-              <w:r>
-                <w:rPr>
-                  <w:color w:val="0563C1"/>
-                  <w:sz w:val="21"/>
-                  <w:u w:val="single"/>
-                </w:rPr>
-                <w:t>port</w:t>
+                <w:t>source reconstruction report</w:t>
               </w:r>
             </w:hyperlink>
             <w:r>
@@ -1218,23 +1195,7 @@
                   <w:sz w:val="21"/>
                   <w:u w:val="single"/>
                 </w:rPr>
-                <w:t>state co</w:t>
-              </w:r>
-              <w:r>
-                <w:rPr>
-                  <w:color w:val="0563C1"/>
-                  <w:sz w:val="21"/>
-                  <w:u w:val="single"/>
-                </w:rPr>
-                <w:t>m</w:t>
-              </w:r>
-              <w:r>
-                <w:rPr>
-                  <w:color w:val="0563C1"/>
-                  <w:sz w:val="21"/>
-                  <w:u w:val="single"/>
-                </w:rPr>
-                <w:t>parison</w:t>
+                <w:t>state comparison</w:t>
               </w:r>
             </w:hyperlink>
             <w:r>
@@ -1243,28 +1204,6 @@
               </w:rPr>
               <w:t>.</w:t>
             </w:r>
-          </w:p>
-          <w:p>
-            <w:pPr>
-              <w:spacing w:after="45" w:line="240" w:lineRule="auto"/>
-            </w:pPr>
-            <w:r>
-              <w:rPr>
-                <w:rFonts w:ascii="Calibri" w:hAnsi="Calibri"/>
-                <w:sz w:val="21"/>
-                <w:color w:val="000000"/>
-              </w:rPr>
-              <w:t xml:space="preserve">Independent review: rounding attribution and full loader history remain unverified. </w:t>
-            </w:r>
-            <w:hyperlink r:id="independentReview39">
-              <w:r>
-                <w:rPr>
-                  <w:rStyle w:val="Hyperlink"/>
-                  <w:sz w:val="21"/>
-                </w:rPr>
-                <w:t>Evidence review</w:t>
-              </w:r>
-            </w:hyperlink>
           </w:p>
         </w:tc>
       </w:tr>
@@ -1300,6 +1239,7 @@
                 <w:b/>
                 <w:sz w:val="21"/>
               </w:rPr>
+              <w:lastRenderedPageBreak/>
               <w:t>SPPR calculation</w:t>
             </w:r>
           </w:p>
@@ -1346,13 +1286,23 @@
               <w:spacing w:after="40"/>
             </w:pPr>
             <w:r>
-              <w:t>seabirds (TE&lt;0.1%, TL=3.4, sppr_TE=3.75M</w:t>
-            </w:r>
-            <w:r>
-              <w:t>, sppr_GE=</w:t>
-            </w:r>
-            <w:r>
-              <w:t>21K)</w:t>
+              <w:t xml:space="preserve">seabirds (TE&lt;0.1%, TL=3.4, </w:t>
+            </w:r>
+            <w:proofErr w:type="spellStart"/>
+            <w:r>
+              <w:t>sppr_TE</w:t>
+            </w:r>
+            <w:proofErr w:type="spellEnd"/>
+            <w:r>
+              <w:t xml:space="preserve">=3.75M, </w:t>
+            </w:r>
+            <w:proofErr w:type="spellStart"/>
+            <w:r>
+              <w:t>sppr_GE</w:t>
+            </w:r>
+            <w:proofErr w:type="spellEnd"/>
+            <w:r>
+              <w:t>=21K)</w:t>
             </w:r>
           </w:p>
           <w:p>
@@ -1365,28 +1315,23 @@
               <w:spacing w:after="40"/>
             </w:pPr>
             <w:r>
-              <w:t xml:space="preserve">other mammals </w:t>
-            </w:r>
-            <w:r>
-              <w:t>(TE&lt;0.1%, TL=3.</w:t>
-            </w:r>
-            <w:r>
-              <w:t>9</w:t>
-            </w:r>
-            <w:r>
-              <w:t xml:space="preserve">, </w:t>
-            </w:r>
-            <w:r>
-              <w:t>sppr_TE=800K</w:t>
-            </w:r>
-            <w:r>
-              <w:t>, sppr_GE=</w:t>
-            </w:r>
-            <w:r>
-              <w:t>13K</w:t>
-            </w:r>
-            <w:r>
-              <w:t>)</w:t>
+              <w:t xml:space="preserve">other mammals (TE&lt;0.1%, TL=3.9, </w:t>
+            </w:r>
+            <w:proofErr w:type="spellStart"/>
+            <w:r>
+              <w:t>sppr_TE</w:t>
+            </w:r>
+            <w:proofErr w:type="spellEnd"/>
+            <w:r>
+              <w:t xml:space="preserve">=800K, </w:t>
+            </w:r>
+            <w:proofErr w:type="spellStart"/>
+            <w:r>
+              <w:t>sppr_GE</w:t>
+            </w:r>
+            <w:proofErr w:type="spellEnd"/>
+            <w:r>
+              <w:t>=13K)</w:t>
             </w:r>
           </w:p>
           <w:p>
@@ -1399,28 +1344,23 @@
               <w:spacing w:after="40"/>
             </w:pPr>
             <w:r>
-              <w:t xml:space="preserve">Pinnipeds </w:t>
-            </w:r>
-            <w:r>
-              <w:t>(TE&lt;0.1%, TL=4</w:t>
-            </w:r>
-            <w:r>
-              <w:t>.1</w:t>
-            </w:r>
-            <w:r>
-              <w:t>, sppr_TE=</w:t>
-            </w:r>
-            <w:r>
-              <w:t>340K</w:t>
-            </w:r>
-            <w:r>
-              <w:t>, sppr_GE=</w:t>
-            </w:r>
-            <w:r>
-              <w:t>3400</w:t>
-            </w:r>
-            <w:r>
-              <w:t>)</w:t>
+              <w:t xml:space="preserve">Pinnipeds (TE&lt;0.1%, TL=4.1, </w:t>
+            </w:r>
+            <w:proofErr w:type="spellStart"/>
+            <w:r>
+              <w:t>sppr_TE</w:t>
+            </w:r>
+            <w:proofErr w:type="spellEnd"/>
+            <w:r>
+              <w:t xml:space="preserve">=340K, </w:t>
+            </w:r>
+            <w:proofErr w:type="spellStart"/>
+            <w:r>
+              <w:t>sppr_GE</w:t>
+            </w:r>
+            <w:proofErr w:type="spellEnd"/>
+            <w:r>
+              <w:t>=3400)</w:t>
             </w:r>
           </w:p>
           <w:p>
@@ -1433,33 +1373,29 @@
               <w:spacing w:after="40"/>
             </w:pPr>
             <w:r>
-              <w:t xml:space="preserve">Marine Turtles </w:t>
-            </w:r>
-            <w:r>
-              <w:t>(TE&lt;1%, TL=</w:t>
-            </w:r>
-            <w:r>
-              <w:t>3</w:t>
-            </w:r>
-            <w:r>
-              <w:t>, sppr_TE=</w:t>
-            </w:r>
-            <w:r>
-              <w:t>20K, sppr_GE=724</w:t>
-            </w:r>
-            <w:r>
-              <w:t>)</w:t>
+              <w:t xml:space="preserve">Marine Turtles (TE&lt;1%, TL=3, </w:t>
+            </w:r>
+            <w:proofErr w:type="spellStart"/>
+            <w:r>
+              <w:t>sppr_TE</w:t>
+            </w:r>
+            <w:proofErr w:type="spellEnd"/>
+            <w:r>
+              <w:t xml:space="preserve">=20K, </w:t>
+            </w:r>
+            <w:proofErr w:type="spellStart"/>
+            <w:r>
+              <w:t>sppr_GE</w:t>
+            </w:r>
+            <w:proofErr w:type="spellEnd"/>
+            <w:r>
+              <w:t>=724)</w:t>
             </w:r>
           </w:p>
         </w:tc>
       </w:tr>
     </w:tbl>
-    <w:p>
-      <w:r/>
-      <w:pPr>
-        <w:spacing w:before="0" w:after="0" w:line="20" w:lineRule="exact"/>
-      </w:pPr>
-    </w:p>
+    <w:p/>
     <w:tbl>
       <w:tblPr>
         <w:tblW w:w="0" w:type="auto"/>
@@ -1503,9 +1439,7 @@
               <w:rPr>
                 <w:b/>
                 <w:sz w:val="21"/>
-                <w:b/>
               </w:rPr>
-              <w:lastRenderedPageBreak/>
               <w:t>Field</w:t>
             </w:r>
           </w:p>
@@ -1534,12 +1468,11 @@
             </w:pPr>
             <w:r>
               <w:rPr>
-                <w:rFonts w:ascii="Calibri" w:hAnsi="Calibri"/>
+                <w:b/>
+                <w:color w:val="000000"/>
                 <w:sz w:val="21"/>
-                <w:color w:val="000000"/>
-                <w:b/>
               </w:rPr>
-              <w:t xml:space="preserve">Entry</w:t>
+              <w:t>Entry</w:t>
             </w:r>
           </w:p>
         </w:tc>
@@ -1604,24 +1537,38 @@
             </w:pPr>
             <w:r>
               <w:rPr>
-                <w:rFonts w:ascii="Calibri" w:hAnsi="Calibri"/>
+                <w:color w:val="000000"/>
                 <w:sz w:val="21"/>
+              </w:rPr>
+              <w:t>no negative SPPR entries across the basal-source columns</w:t>
+            </w:r>
+            <w:r>
+              <w:rPr>
                 <w:color w:val="000000"/>
+                <w:sz w:val="21"/>
               </w:rPr>
-              <w:t xml:space="preserve">Saved diagnostic reports 0 negative source columns; the per-source matrix was not retained, so source/group pairings cannot be independently checked.</w:t>
+              <w:t>.</w:t>
             </w:r>
           </w:p>
           <w:p>
             <w:pPr>
               <w:spacing w:after="45" w:line="240" w:lineRule="auto"/>
             </w:pPr>
+            <w:proofErr w:type="spellStart"/>
             <w:r>
               <w:rPr>
-                <w:rFonts w:ascii="Calibri" w:hAnsi="Calibri"/>
+                <w:color w:val="000000"/>
                 <w:sz w:val="21"/>
+              </w:rPr>
+              <w:t>rho_living</w:t>
+            </w:r>
+            <w:proofErr w:type="spellEnd"/>
+            <w:r>
+              <w:rPr>
                 <w:color w:val="000000"/>
+                <w:sz w:val="21"/>
               </w:rPr>
-              <w:t xml:space="preserve">rho_living = 0.3209187537609611; b = 0.00408138212364339.</w:t>
+              <w:t xml:space="preserve"> = 0.3209187537609611; b = 0.00408138212364339.</w:t>
             </w:r>
           </w:p>
           <w:p>
@@ -1630,11 +1577,10 @@
             </w:pPr>
             <w:r>
               <w:rPr>
-                <w:rFonts w:ascii="Calibri" w:hAnsi="Calibri"/>
+                <w:color w:val="000000"/>
                 <w:sz w:val="21"/>
-                <w:color w:val="000000"/>
               </w:rPr>
-              <w:t xml:space="preserve">Detritus (38): SPPR = 1.007782936216668. Saved result: WARN (near-zero efficiency).</w:t>
+              <w:t>Detritus (38): SPPR = 1.007782936216668.</w:t>
             </w:r>
           </w:p>
         </w:tc>
@@ -1699,24 +1645,38 @@
             </w:pPr>
             <w:r>
               <w:rPr>
-                <w:rFonts w:ascii="Calibri" w:hAnsi="Calibri"/>
+                <w:color w:val="000000"/>
                 <w:sz w:val="21"/>
+              </w:rPr>
+              <w:t>no negative SPPR entries across the basal-source columns</w:t>
+            </w:r>
+            <w:r>
+              <w:rPr>
                 <w:color w:val="000000"/>
+                <w:sz w:val="21"/>
               </w:rPr>
-              <w:t xml:space="preserve">Saved diagnostic reports 0 negative source columns; the per-source matrix was not retained, so source/group pairings cannot be independently checked.</w:t>
+              <w:t>.</w:t>
             </w:r>
           </w:p>
           <w:p>
             <w:pPr>
               <w:spacing w:after="45" w:line="240" w:lineRule="auto"/>
             </w:pPr>
+            <w:proofErr w:type="spellStart"/>
             <w:r>
               <w:rPr>
-                <w:rFonts w:ascii="Calibri" w:hAnsi="Calibri"/>
+                <w:color w:val="000000"/>
                 <w:sz w:val="21"/>
+              </w:rPr>
+              <w:t>rho_living</w:t>
+            </w:r>
+            <w:proofErr w:type="spellEnd"/>
+            <w:r>
+              <w:rPr>
                 <w:color w:val="000000"/>
+                <w:sz w:val="21"/>
               </w:rPr>
-              <w:t xml:space="preserve">rho_living = 0.6163296517365333.</w:t>
+              <w:t xml:space="preserve"> = 0.6163296517365333.</w:t>
             </w:r>
           </w:p>
           <w:p>
@@ -1725,24 +1685,10 @@
             </w:pPr>
             <w:r>
               <w:rPr>
-                <w:rFonts w:ascii="Calibri" w:hAnsi="Calibri"/>
+                <w:color w:val="000000"/>
                 <w:sz w:val="21"/>
-                <w:color w:val="000000"/>
               </w:rPr>
-              <w:t xml:space="preserve">Detritus (38): SPPR = 0.995222499887902. Saved result: WARN. TE’s conventional zero recycling term does not establish absent recycling.</w:t>
-            </w:r>
-          </w:p>
-          <w:p>
-            <w:pPr>
-              <w:spacing w:after="45" w:line="240" w:lineRule="auto"/>
-            </w:pPr>
-            <w:r>
-              <w:rPr>
-                <w:rFonts w:ascii="Calibri" w:hAnsi="Calibri"/>
-                <w:sz w:val="21"/>
-                <w:color w:val="000000"/>
-              </w:rPr>
-              <w:t xml:space="preserve">Saved runtime retains groups 34–37; it does not demonstrate the manual exclusions above.</w:t>
+              <w:t xml:space="preserve">Detritus (38): SPPR = 0.995222499887902. </w:t>
             </w:r>
           </w:p>
         </w:tc>
@@ -1807,11 +1753,10 @@
             </w:pPr>
             <w:r>
               <w:rPr>
-                <w:rFonts w:ascii="Calibri" w:hAnsi="Calibri"/>
+                <w:color w:val="000000"/>
                 <w:sz w:val="21"/>
-                <w:color w:val="000000"/>
               </w:rPr>
-              <w:t xml:space="preserve">A. Region covered by study: approximately 15–25%.</w:t>
+              <w:t>A. Region covered by study: approximately 15–25%.</w:t>
             </w:r>
           </w:p>
           <w:p>
@@ -1820,24 +1765,10 @@
             </w:pPr>
             <w:r>
               <w:rPr>
-                <w:rFonts w:ascii="Calibri" w:hAnsi="Calibri"/>
+                <w:color w:val="000000"/>
                 <w:sz w:val="21"/>
-                <w:color w:val="000000"/>
               </w:rPr>
-              <w:t xml:space="preserve">B. Study area covered by region: approximately 90–100%.</w:t>
-            </w:r>
-          </w:p>
-          <w:p>
-            <w:pPr>
-              <w:spacing w:after="45" w:line="240" w:lineRule="auto"/>
-            </w:pPr>
-            <w:r>
-              <w:rPr>
-                <w:rFonts w:ascii="Calibri" w:hAnsi="Calibri"/>
-                <w:sz w:val="21"/>
-                <w:color w:val="000000"/>
-              </w:rPr>
-              <w:t xml:space="preserve">A = 100 × area(R ∩ S)/area(R); B = 100 × area(R ∩ S)/area(S). Visual ranges from Figure 6.1 and the LME boundary: northern shelf occupies about one fifth of R; main mismatch is near Taiwan. These are approximate judgments, not measured polygon intersections. Figures below; details in the evidence review.</w:t>
+              <w:t>B. Study area covered by region: approximately 90–100%.</w:t>
             </w:r>
           </w:p>
         </w:tc>
@@ -1965,6 +1896,112 @@
           </w:tcPr>
           <w:p>
             <w:pPr>
+              <w:pStyle w:val="ae"/>
+              <w:numPr>
+                <w:ilvl w:val="0"/>
+                <w:numId w:val="10"/>
+              </w:numPr>
+              <w:spacing w:after="40"/>
+            </w:pPr>
+            <w:r>
+              <w:t>Diagnostics were run before groups removal.</w:t>
+            </w:r>
+          </w:p>
+        </w:tc>
+      </w:tr>
+      <w:tr>
+        <w:trPr>
+          <w:cantSplit/>
+          <w:jc w:val="center"/>
+        </w:trPr>
+        <w:tc>
+          <w:tcPr>
+            <w:tcW w:w="2203" w:type="dxa"/>
+            <w:tcBorders>
+              <w:top w:val="single" w:sz="5" w:space="0" w:color="D9D9D9"/>
+              <w:left w:val="single" w:sz="5" w:space="0" w:color="D9D9D9"/>
+              <w:bottom w:val="single" w:sz="5" w:space="0" w:color="D9D9D9"/>
+              <w:right w:val="single" w:sz="5" w:space="0" w:color="D9D9D9"/>
+            </w:tcBorders>
+            <w:shd w:val="clear" w:color="auto" w:fill="FFFFFF"/>
+            <w:tcMar>
+              <w:top w:w="90" w:type="dxa"/>
+              <w:left w:w="110" w:type="dxa"/>
+              <w:bottom w:w="90" w:type="dxa"/>
+              <w:right w:w="110" w:type="dxa"/>
+            </w:tcMar>
+            <w:vAlign w:val="center"/>
+          </w:tcPr>
+          <w:p>
+            <w:pPr>
+              <w:spacing w:after="40"/>
+            </w:pPr>
+            <w:r>
+              <w:rPr>
+                <w:b/>
+                <w:sz w:val="21"/>
+              </w:rPr>
+              <w:t>Open issues and next action</w:t>
+            </w:r>
+          </w:p>
+        </w:tc>
+        <w:tc>
+          <w:tcPr>
+            <w:tcW w:w="7834" w:type="dxa"/>
+            <w:tcBorders>
+              <w:top w:val="single" w:sz="5" w:space="0" w:color="D9D9D9"/>
+              <w:left w:val="single" w:sz="5" w:space="0" w:color="D9D9D9"/>
+              <w:bottom w:val="single" w:sz="5" w:space="0" w:color="D9D9D9"/>
+              <w:right w:val="single" w:sz="5" w:space="0" w:color="D9D9D9"/>
+            </w:tcBorders>
+            <w:shd w:val="clear" w:color="auto" w:fill="FFFFFF"/>
+            <w:tcMar>
+              <w:top w:w="90" w:type="dxa"/>
+              <w:left w:w="110" w:type="dxa"/>
+              <w:bottom w:w="90" w:type="dxa"/>
+              <w:right w:w="110" w:type="dxa"/>
+            </w:tcMar>
+            <w:vAlign w:val="center"/>
+          </w:tcPr>
+          <w:p>
+            <w:pPr>
+              <w:pStyle w:val="ae"/>
+              <w:numPr>
+                <w:ilvl w:val="0"/>
+                <w:numId w:val="10"/>
+              </w:numPr>
+              <w:spacing w:after="40"/>
+            </w:pPr>
+            <w:r>
+              <w:rPr>
+                <w:sz w:val="21"/>
+              </w:rPr>
+              <w:t>Test how much SPPR and PPR values change when using the 1970 model.</w:t>
+            </w:r>
+          </w:p>
+          <w:p>
+            <w:pPr>
+              <w:pStyle w:val="ae"/>
+              <w:numPr>
+                <w:ilvl w:val="0"/>
+                <w:numId w:val="10"/>
+              </w:numPr>
+              <w:spacing w:after="40"/>
+            </w:pPr>
+            <w:r>
+              <w:rPr>
+                <w:sz w:val="21"/>
+              </w:rPr>
+              <w:t>Add article selection reason when we review other articles</w:t>
+            </w:r>
+          </w:p>
+          <w:p>
+            <w:pPr>
+              <w:pStyle w:val="ae"/>
+              <w:numPr>
+                <w:ilvl w:val="0"/>
+                <w:numId w:val="10"/>
+              </w:numPr>
               <w:spacing w:after="40"/>
             </w:pPr>
           </w:p>
@@ -2002,7 +2039,7 @@
                 <w:b/>
                 <w:sz w:val="21"/>
               </w:rPr>
-              <w:t>Open issues and next action</w:t>
+              <w:t>Review and reproducibility</w:t>
             </w:r>
           </w:p>
         </w:tc>
@@ -2027,114 +2064,33 @@
           <w:p>
             <w:pPr>
               <w:spacing w:after="40"/>
-            </w:pPr>
-            <w:r>
               <w:rPr>
                 <w:sz w:val="21"/>
               </w:rPr>
-              <w:t>[MANUAL — Researcher: open issue and consequence]</w:t>
-            </w:r>
+            </w:pPr>
             <w:r>
               <w:rPr>
                 <w:sz w:val="21"/>
               </w:rPr>
-              <w:br/>
-              <w:t>[Researcher: next action / priority]</w:t>
+              <w:t>Researcher name:</w:t>
             </w:r>
             <w:r>
               <w:rPr>
                 <w:sz w:val="21"/>
               </w:rPr>
-              <w:br/>
-              <w:t>[Researcher: relevant .md report hyperlink, if available]</w:t>
-            </w:r>
-          </w:p>
-        </w:tc>
-      </w:tr>
-      <w:tr>
-        <w:trPr>
-          <w:cantSplit/>
-          <w:jc w:val="center"/>
-        </w:trPr>
-        <w:tc>
-          <w:tcPr>
-            <w:tcW w:w="2203" w:type="dxa"/>
-            <w:tcBorders>
-              <w:top w:val="single" w:sz="5" w:space="0" w:color="D9D9D9"/>
-              <w:left w:val="single" w:sz="5" w:space="0" w:color="D9D9D9"/>
-              <w:bottom w:val="single" w:sz="5" w:space="0" w:color="D9D9D9"/>
-              <w:right w:val="single" w:sz="5" w:space="0" w:color="D9D9D9"/>
-            </w:tcBorders>
-            <w:shd w:val="clear" w:color="auto" w:fill="FFFFFF"/>
-            <w:tcMar>
-              <w:top w:w="90" w:type="dxa"/>
-              <w:left w:w="110" w:type="dxa"/>
-              <w:bottom w:w="90" w:type="dxa"/>
-              <w:right w:w="110" w:type="dxa"/>
-            </w:tcMar>
-            <w:vAlign w:val="center"/>
-          </w:tcPr>
-          <w:p>
-            <w:pPr>
-              <w:spacing w:after="40"/>
-            </w:pPr>
-            <w:r>
-              <w:rPr>
-                <w:b/>
-                <w:sz w:val="21"/>
-              </w:rPr>
-              <w:t>Review and reproducibility</w:t>
-            </w:r>
-          </w:p>
-        </w:tc>
-        <w:tc>
-          <w:tcPr>
-            <w:tcW w:w="7834" w:type="dxa"/>
-            <w:tcBorders>
-              <w:top w:val="single" w:sz="5" w:space="0" w:color="D9D9D9"/>
-              <w:left w:val="single" w:sz="5" w:space="0" w:color="D9D9D9"/>
-              <w:bottom w:val="single" w:sz="5" w:space="0" w:color="D9D9D9"/>
-              <w:right w:val="single" w:sz="5" w:space="0" w:color="D9D9D9"/>
-            </w:tcBorders>
-            <w:shd w:val="clear" w:color="auto" w:fill="FFFFFF"/>
-            <w:tcMar>
-              <w:top w:w="90" w:type="dxa"/>
-              <w:left w:w="110" w:type="dxa"/>
-              <w:bottom w:w="90" w:type="dxa"/>
-              <w:right w:w="110" w:type="dxa"/>
-            </w:tcMar>
-            <w:vAlign w:val="center"/>
-          </w:tcPr>
-          <w:p>
-            <w:pPr>
-              <w:spacing w:after="40"/>
-            </w:pPr>
+              <w:t xml:space="preserve"> Ido Carmel</w:t>
+            </w:r>
             <w:r>
               <w:rPr>
                 <w:sz w:val="21"/>
               </w:rPr>
-              <w:t>[MANUAL — Researcher name: ___ | review date: ___]</w:t>
+              <w:t xml:space="preserve"> | review date: </w:t>
             </w:r>
             <w:r>
               <w:rPr>
                 <w:sz w:val="21"/>
               </w:rPr>
-              <w:br/>
-              <w:t>[Researcher: review decision and limitations]</w:t>
-            </w:r>
-            <w:r>
-              <w:rPr>
-                <w:sz w:val="21"/>
-              </w:rPr>
-              <w:br/>
-              <w:t>[Researcher: reviewed input/version and configuration]</w:t>
-            </w:r>
-            <w:r>
-              <w:rPr>
-                <w:sz w:val="21"/>
-              </w:rPr>
-              <w:br/>
-              <w:t>[Researcher: reproducibility evidence/report hyperlink]</w:t>
+              <w:t>30/09/2026</w:t>
             </w:r>
           </w:p>
         </w:tc>
@@ -2153,61 +2109,126 @@
       </w:pPr>
       <w:r>
         <w:rPr>
-          <w:rFonts w:ascii="Calibri" w:hAnsi="Calibri"/>
           <w:b/>
           <w:color w:val="000000"/>
           <w:sz w:val="30"/>
         </w:rPr>
+        <w:lastRenderedPageBreak/>
         <w:t>Taxon mapping and coverage</w:t>
       </w:r>
     </w:p>
     <w:p>
       <w:pPr>
-        <w:keepNext w:val="0"/>
-        <w:pageBreakBefore w:val="0"/>
+        <w:spacing w:after="120"/>
+        <w:rPr>
+          <w:color w:val="000000"/>
+          <w:sz w:val="21"/>
+        </w:rPr>
+      </w:pPr>
+      <w:r>
+        <w:rPr>
+          <w:color w:val="000000"/>
+          <w:sz w:val="21"/>
+        </w:rPr>
+        <w:t>Reference: 2019 landings, excluding discards. All sources, all taxa and groups;</w:t>
+      </w:r>
+    </w:p>
+    <w:p>
+      <w:pPr>
         <w:spacing w:after="120"/>
       </w:pPr>
       <w:r>
         <w:rPr>
-          <w:rFonts w:ascii="Calibri" w:hAnsi="Calibri"/>
-          <w:b w:val="0"/>
           <w:color w:val="000000"/>
           <w:sz w:val="21"/>
         </w:rPr>
-        <w:t>Reference: 2019 landings, excluding discards. All sources, all taxa and groups; unidentified catch uses the method’s own coefficient. There are 38 source groups plus one computational import and 374 catch taxa.</w:t>
+        <w:t>There are 38 source groups plus one computational import and 374 catch taxa.</w:t>
       </w:r>
     </w:p>
     <w:p>
       <w:pPr>
-        <w:keepNext w:val="0"/>
-        <w:pageBreakBefore w:val="0"/>
+        <w:spacing w:after="120"/>
+        <w:rPr>
+          <w:color w:val="000000"/>
+          <w:sz w:val="21"/>
+        </w:rPr>
+      </w:pPr>
+      <w:r>
+        <w:rPr>
+          <w:color w:val="000000"/>
+          <w:sz w:val="21"/>
+        </w:rPr>
+        <w:t>Simple-chain PPR totals 837,452,937.79 t C in 2019.</w:t>
+      </w:r>
+    </w:p>
+    <w:p>
+      <w:pPr>
+        <w:spacing w:after="120"/>
+        <w:rPr>
+          <w:color w:val="000000"/>
+          <w:sz w:val="21"/>
+        </w:rPr>
+      </w:pPr>
+      <w:r>
+        <w:rPr>
+          <w:color w:val="000000"/>
+          <w:sz w:val="21"/>
+        </w:rPr>
+        <w:t xml:space="preserve">The 34 taxa </w:t>
+      </w:r>
+      <w:r>
+        <w:rPr>
+          <w:color w:val="000000"/>
+          <w:sz w:val="21"/>
+        </w:rPr>
+        <w:t>that</w:t>
+      </w:r>
+      <w:r>
+        <w:rPr>
+          <w:color w:val="000000"/>
+          <w:sz w:val="21"/>
+        </w:rPr>
+        <w:t xml:space="preserve"> lack an assigned trophic level</w:t>
+      </w:r>
+      <w:r>
+        <w:rPr>
+          <w:color w:val="000000"/>
+          <w:sz w:val="21"/>
+        </w:rPr>
+        <w:t xml:space="preserve"> </w:t>
+      </w:r>
+      <w:r>
+        <w:rPr>
+          <w:color w:val="000000"/>
+          <w:sz w:val="21"/>
+        </w:rPr>
+        <w:t>have zero landings that year and therefore contribute zero PPR.</w:t>
+      </w:r>
+    </w:p>
+    <w:p>
+      <w:pPr>
         <w:spacing w:after="120"/>
       </w:pPr>
       <w:r>
         <w:rPr>
-          <w:rFonts w:ascii="Calibri" w:hAnsi="Calibri"/>
-          <w:b w:val="0"/>
           <w:color w:val="000000"/>
           <w:sz w:val="21"/>
         </w:rPr>
-        <w:t>Landings total 10,308,126.30 t. Known simple-chain PPR totals 837,452,937.79 t C. The 34 missing coefficients account for 0 t landings; their PPR remains unknown. TE is 0.1 and wet-weight PPR is divided by nine once.</w:t>
+        <w:t xml:space="preserve">Simple-chain </w:t>
+      </w:r>
+      <w:r>
+        <w:rPr>
+          <w:color w:val="000000"/>
+          <w:sz w:val="21"/>
+        </w:rPr>
+        <w:t>PPR is calculated with the simple trophic chain method.</w:t>
       </w:r>
     </w:p>
     <w:p>
       <w:pPr>
-        <w:keepNext w:val="0"/>
-        <w:pageBreakBefore w:val="0"/>
         <w:spacing w:after="120"/>
       </w:pPr>
-      <w:r>
-        <w:rPr>
-          <w:rFonts w:ascii="Calibri" w:hAnsi="Calibri"/>
-          <w:b w:val="0"/>
-          <w:color w:val="000000"/>
-          <w:sz w:val="21"/>
-        </w:rPr>
-      </w:r>
-      <w:hyperlink r:id="rIdValidation1">
+      <w:hyperlink r:id="rId29">
         <w:r>
           <w:rPr>
             <w:color w:val="175E72"/>
@@ -2222,9 +2243,9 @@
     </w:p>
     <w:tbl>
       <w:tblPr>
-        <w:tblW w:type="auto" w:w="0"/>
+        <w:tblW w:w="0" w:type="auto"/>
         <w:tblLayout w:type="fixed"/>
-        <w:tblLook w:firstColumn="1" w:firstRow="1" w:lastColumn="0" w:lastRow="0" w:noHBand="0" w:noVBand="1" w:val="04A0"/>
+        <w:tblLook w:val="04A0" w:firstRow="1" w:lastRow="0" w:firstColumn="1" w:lastColumn="0" w:noHBand="0" w:noVBand="1"/>
       </w:tblPr>
       <w:tblGrid>
         <w:gridCol w:w="3888"/>
@@ -2234,19 +2255,19 @@
       </w:tblGrid>
       <w:tr>
         <w:trPr>
+          <w:cantSplit/>
           <w:tblHeader/>
-          <w:cantSplit/>
         </w:trPr>
         <w:tc>
           <w:tcPr>
-            <w:tcW w:type="dxa" w:w="3888"/>
-            <w:shd w:fill="DDE9EE"/>
+            <w:tcW w:w="3888" w:type="dxa"/>
             <w:tcBorders>
-              <w:top w:val="single" w:sz="4" w:color="D9D9D9"/>
-              <w:left w:val="single" w:sz="4" w:color="D9D9D9"/>
-              <w:bottom w:val="single" w:sz="4" w:color="D9D9D9"/>
-              <w:right w:val="single" w:sz="4" w:color="D9D9D9"/>
+              <w:top w:val="single" w:sz="4" w:space="0" w:color="D9D9D9"/>
+              <w:left w:val="single" w:sz="4" w:space="0" w:color="D9D9D9"/>
+              <w:bottom w:val="single" w:sz="4" w:space="0" w:color="D9D9D9"/>
+              <w:right w:val="single" w:sz="4" w:space="0" w:color="D9D9D9"/>
             </w:tcBorders>
+            <w:shd w:val="clear" w:color="auto" w:fill="DDE9EE"/>
             <w:tcMar>
               <w:top w:w="75" w:type="dxa"/>
               <w:left w:w="75" w:type="dxa"/>
@@ -2256,11 +2277,10 @@
           </w:tcPr>
           <w:p>
             <w:pPr>
-              <w:spacing w:after="40" w:before="40"/>
+              <w:spacing w:before="40" w:after="40"/>
             </w:pPr>
             <w:r>
               <w:rPr>
-                <w:rFonts w:ascii="Calibri" w:hAnsi="Calibri"/>
                 <w:b/>
                 <w:color w:val="000000"/>
                 <w:sz w:val="20"/>
@@ -2271,14 +2291,14 @@
         </w:tc>
         <w:tc>
           <w:tcPr>
-            <w:tcW w:type="dxa" w:w="1440"/>
-            <w:shd w:fill="DDE9EE"/>
+            <w:tcW w:w="1440" w:type="dxa"/>
             <w:tcBorders>
-              <w:top w:val="single" w:sz="4" w:color="D9D9D9"/>
-              <w:left w:val="single" w:sz="4" w:color="D9D9D9"/>
-              <w:bottom w:val="single" w:sz="4" w:color="D9D9D9"/>
-              <w:right w:val="single" w:sz="4" w:color="D9D9D9"/>
+              <w:top w:val="single" w:sz="4" w:space="0" w:color="D9D9D9"/>
+              <w:left w:val="single" w:sz="4" w:space="0" w:color="D9D9D9"/>
+              <w:bottom w:val="single" w:sz="4" w:space="0" w:color="D9D9D9"/>
+              <w:right w:val="single" w:sz="4" w:space="0" w:color="D9D9D9"/>
             </w:tcBorders>
+            <w:shd w:val="clear" w:color="auto" w:fill="DDE9EE"/>
             <w:tcMar>
               <w:top w:w="75" w:type="dxa"/>
               <w:left w:w="75" w:type="dxa"/>
@@ -2288,12 +2308,11 @@
           </w:tcPr>
           <w:p>
             <w:pPr>
-              <w:spacing w:after="40" w:before="40"/>
+              <w:spacing w:before="40" w:after="40"/>
               <w:jc w:val="center"/>
             </w:pPr>
             <w:r>
               <w:rPr>
-                <w:rFonts w:ascii="Calibri" w:hAnsi="Calibri"/>
                 <w:b/>
                 <w:color w:val="000000"/>
                 <w:sz w:val="20"/>
@@ -2304,14 +2323,14 @@
         </w:tc>
         <w:tc>
           <w:tcPr>
-            <w:tcW w:type="dxa" w:w="2304"/>
-            <w:shd w:fill="DDE9EE"/>
+            <w:tcW w:w="2304" w:type="dxa"/>
             <w:tcBorders>
-              <w:top w:val="single" w:sz="4" w:color="D9D9D9"/>
-              <w:left w:val="single" w:sz="4" w:color="D9D9D9"/>
-              <w:bottom w:val="single" w:sz="4" w:color="D9D9D9"/>
-              <w:right w:val="single" w:sz="4" w:color="D9D9D9"/>
+              <w:top w:val="single" w:sz="4" w:space="0" w:color="D9D9D9"/>
+              <w:left w:val="single" w:sz="4" w:space="0" w:color="D9D9D9"/>
+              <w:bottom w:val="single" w:sz="4" w:space="0" w:color="D9D9D9"/>
+              <w:right w:val="single" w:sz="4" w:space="0" w:color="D9D9D9"/>
             </w:tcBorders>
+            <w:shd w:val="clear" w:color="auto" w:fill="DDE9EE"/>
             <w:tcMar>
               <w:top w:w="75" w:type="dxa"/>
               <w:left w:w="75" w:type="dxa"/>
@@ -2321,12 +2340,11 @@
           </w:tcPr>
           <w:p>
             <w:pPr>
-              <w:spacing w:after="40" w:before="40"/>
+              <w:spacing w:before="40" w:after="40"/>
               <w:jc w:val="center"/>
             </w:pPr>
             <w:r>
               <w:rPr>
-                <w:rFonts w:ascii="Calibri" w:hAnsi="Calibri"/>
                 <w:b/>
                 <w:color w:val="000000"/>
                 <w:sz w:val="20"/>
@@ -2337,14 +2355,14 @@
         </w:tc>
         <w:tc>
           <w:tcPr>
-            <w:tcW w:type="dxa" w:w="2376"/>
-            <w:shd w:fill="DDE9EE"/>
+            <w:tcW w:w="2376" w:type="dxa"/>
             <w:tcBorders>
-              <w:top w:val="single" w:sz="4" w:color="D9D9D9"/>
-              <w:left w:val="single" w:sz="4" w:color="D9D9D9"/>
-              <w:bottom w:val="single" w:sz="4" w:color="D9D9D9"/>
-              <w:right w:val="single" w:sz="4" w:color="D9D9D9"/>
+              <w:top w:val="single" w:sz="4" w:space="0" w:color="D9D9D9"/>
+              <w:left w:val="single" w:sz="4" w:space="0" w:color="D9D9D9"/>
+              <w:bottom w:val="single" w:sz="4" w:space="0" w:color="D9D9D9"/>
+              <w:right w:val="single" w:sz="4" w:space="0" w:color="D9D9D9"/>
             </w:tcBorders>
+            <w:shd w:val="clear" w:color="auto" w:fill="DDE9EE"/>
             <w:tcMar>
               <w:top w:w="75" w:type="dxa"/>
               <w:left w:w="75" w:type="dxa"/>
@@ -2354,12 +2372,11 @@
           </w:tcPr>
           <w:p>
             <w:pPr>
-              <w:spacing w:after="40" w:before="40"/>
+              <w:spacing w:before="40" w:after="40"/>
               <w:jc w:val="center"/>
             </w:pPr>
             <w:r>
               <w:rPr>
-                <w:rFonts w:ascii="Calibri" w:hAnsi="Calibri"/>
                 <w:b/>
                 <w:color w:val="000000"/>
                 <w:sz w:val="20"/>
@@ -2375,14 +2392,14 @@
         </w:trPr>
         <w:tc>
           <w:tcPr>
-            <w:tcW w:type="dxa" w:w="3888"/>
-            <w:shd w:fill="FFFFFF"/>
+            <w:tcW w:w="3888" w:type="dxa"/>
             <w:tcBorders>
-              <w:top w:val="single" w:sz="4" w:color="D9D9D9"/>
-              <w:left w:val="single" w:sz="4" w:color="D9D9D9"/>
-              <w:bottom w:val="single" w:sz="4" w:color="D9D9D9"/>
-              <w:right w:val="single" w:sz="4" w:color="D9D9D9"/>
+              <w:top w:val="single" w:sz="4" w:space="0" w:color="D9D9D9"/>
+              <w:left w:val="single" w:sz="4" w:space="0" w:color="D9D9D9"/>
+              <w:bottom w:val="single" w:sz="4" w:space="0" w:color="D9D9D9"/>
+              <w:right w:val="single" w:sz="4" w:space="0" w:color="D9D9D9"/>
             </w:tcBorders>
+            <w:shd w:val="clear" w:color="auto" w:fill="FFFFFF"/>
             <w:tcMar>
               <w:top w:w="75" w:type="dxa"/>
               <w:left w:w="75" w:type="dxa"/>
@@ -2392,12 +2409,10 @@
           </w:tcPr>
           <w:p>
             <w:pPr>
-              <w:spacing w:after="40" w:before="40"/>
+              <w:spacing w:before="40" w:after="40"/>
             </w:pPr>
             <w:r>
               <w:rPr>
-                <w:rFonts w:ascii="Calibri" w:hAnsi="Calibri"/>
-                <w:b w:val="0"/>
                 <w:color w:val="000000"/>
                 <w:sz w:val="20"/>
               </w:rPr>
@@ -2407,14 +2422,14 @@
         </w:tc>
         <w:tc>
           <w:tcPr>
-            <w:tcW w:type="dxa" w:w="1440"/>
-            <w:shd w:fill="FFFFFF"/>
+            <w:tcW w:w="1440" w:type="dxa"/>
             <w:tcBorders>
-              <w:top w:val="single" w:sz="4" w:color="D9D9D9"/>
-              <w:left w:val="single" w:sz="4" w:color="D9D9D9"/>
-              <w:bottom w:val="single" w:sz="4" w:color="D9D9D9"/>
-              <w:right w:val="single" w:sz="4" w:color="D9D9D9"/>
+              <w:top w:val="single" w:sz="4" w:space="0" w:color="D9D9D9"/>
+              <w:left w:val="single" w:sz="4" w:space="0" w:color="D9D9D9"/>
+              <w:bottom w:val="single" w:sz="4" w:space="0" w:color="D9D9D9"/>
+              <w:right w:val="single" w:sz="4" w:space="0" w:color="D9D9D9"/>
             </w:tcBorders>
+            <w:shd w:val="clear" w:color="auto" w:fill="FFFFFF"/>
             <w:tcMar>
               <w:top w:w="75" w:type="dxa"/>
               <w:left w:w="75" w:type="dxa"/>
@@ -2424,30 +2439,28 @@
           </w:tcPr>
           <w:p>
             <w:pPr>
-              <w:spacing w:after="40" w:before="40"/>
+              <w:spacing w:before="40" w:after="40"/>
               <w:jc w:val="center"/>
             </w:pPr>
             <w:r>
               <w:rPr>
-                <w:rFonts w:ascii="Calibri" w:hAnsi="Calibri"/>
-                <w:b w:val="0"/>
                 <w:color w:val="000000"/>
                 <w:sz w:val="20"/>
               </w:rPr>
-              <w:t>126</w:t>
+              <w:t>142</w:t>
             </w:r>
           </w:p>
         </w:tc>
         <w:tc>
           <w:tcPr>
-            <w:tcW w:type="dxa" w:w="2304"/>
-            <w:shd w:fill="FFFFFF"/>
+            <w:tcW w:w="2304" w:type="dxa"/>
             <w:tcBorders>
-              <w:top w:val="single" w:sz="4" w:color="D9D9D9"/>
-              <w:left w:val="single" w:sz="4" w:color="D9D9D9"/>
-              <w:bottom w:val="single" w:sz="4" w:color="D9D9D9"/>
-              <w:right w:val="single" w:sz="4" w:color="D9D9D9"/>
+              <w:top w:val="single" w:sz="4" w:space="0" w:color="D9D9D9"/>
+              <w:left w:val="single" w:sz="4" w:space="0" w:color="D9D9D9"/>
+              <w:bottom w:val="single" w:sz="4" w:space="0" w:color="D9D9D9"/>
+              <w:right w:val="single" w:sz="4" w:space="0" w:color="D9D9D9"/>
             </w:tcBorders>
+            <w:shd w:val="clear" w:color="auto" w:fill="FFFFFF"/>
             <w:tcMar>
               <w:top w:w="75" w:type="dxa"/>
               <w:left w:w="75" w:type="dxa"/>
@@ -2457,30 +2470,28 @@
           </w:tcPr>
           <w:p>
             <w:pPr>
-              <w:spacing w:after="40" w:before="40"/>
+              <w:spacing w:before="40" w:after="40"/>
               <w:jc w:val="center"/>
             </w:pPr>
             <w:r>
               <w:rPr>
-                <w:rFonts w:ascii="Calibri" w:hAnsi="Calibri"/>
-                <w:b w:val="0"/>
                 <w:color w:val="000000"/>
                 <w:sz w:val="20"/>
               </w:rPr>
-              <w:t>34.5975%</w:t>
+              <w:t>39.0208%</w:t>
             </w:r>
           </w:p>
         </w:tc>
         <w:tc>
           <w:tcPr>
-            <w:tcW w:type="dxa" w:w="2376"/>
-            <w:shd w:fill="FFFFFF"/>
+            <w:tcW w:w="2376" w:type="dxa"/>
             <w:tcBorders>
-              <w:top w:val="single" w:sz="4" w:color="D9D9D9"/>
-              <w:left w:val="single" w:sz="4" w:color="D9D9D9"/>
-              <w:bottom w:val="single" w:sz="4" w:color="D9D9D9"/>
-              <w:right w:val="single" w:sz="4" w:color="D9D9D9"/>
+              <w:top w:val="single" w:sz="4" w:space="0" w:color="D9D9D9"/>
+              <w:left w:val="single" w:sz="4" w:space="0" w:color="D9D9D9"/>
+              <w:bottom w:val="single" w:sz="4" w:space="0" w:color="D9D9D9"/>
+              <w:right w:val="single" w:sz="4" w:space="0" w:color="D9D9D9"/>
             </w:tcBorders>
+            <w:shd w:val="clear" w:color="auto" w:fill="FFFFFF"/>
             <w:tcMar>
               <w:top w:w="75" w:type="dxa"/>
               <w:left w:w="75" w:type="dxa"/>
@@ -2490,17 +2501,15 @@
           </w:tcPr>
           <w:p>
             <w:pPr>
-              <w:spacing w:after="40" w:before="40"/>
+              <w:spacing w:before="40" w:after="40"/>
               <w:jc w:val="center"/>
             </w:pPr>
             <w:r>
               <w:rPr>
-                <w:rFonts w:ascii="Calibri" w:hAnsi="Calibri"/>
-                <w:b w:val="0"/>
                 <w:color w:val="000000"/>
                 <w:sz w:val="20"/>
               </w:rPr>
-              <w:t>31.0269%</w:t>
+              <w:t>31.8829%</w:t>
             </w:r>
           </w:p>
         </w:tc>
@@ -2511,14 +2520,14 @@
         </w:trPr>
         <w:tc>
           <w:tcPr>
-            <w:tcW w:type="dxa" w:w="3888"/>
-            <w:shd w:fill="F5F7F8"/>
+            <w:tcW w:w="3888" w:type="dxa"/>
             <w:tcBorders>
-              <w:top w:val="single" w:sz="4" w:color="D9D9D9"/>
-              <w:left w:val="single" w:sz="4" w:color="D9D9D9"/>
-              <w:bottom w:val="single" w:sz="4" w:color="D9D9D9"/>
-              <w:right w:val="single" w:sz="4" w:color="D9D9D9"/>
+              <w:top w:val="single" w:sz="4" w:space="0" w:color="D9D9D9"/>
+              <w:left w:val="single" w:sz="4" w:space="0" w:color="D9D9D9"/>
+              <w:bottom w:val="single" w:sz="4" w:space="0" w:color="D9D9D9"/>
+              <w:right w:val="single" w:sz="4" w:space="0" w:color="D9D9D9"/>
             </w:tcBorders>
+            <w:shd w:val="clear" w:color="auto" w:fill="FFFFFF"/>
             <w:tcMar>
               <w:top w:w="75" w:type="dxa"/>
               <w:left w:w="75" w:type="dxa"/>
@@ -2528,12 +2537,10 @@
           </w:tcPr>
           <w:p>
             <w:pPr>
-              <w:spacing w:after="40" w:before="40"/>
+              <w:spacing w:before="40" w:after="40"/>
             </w:pPr>
             <w:r>
               <w:rPr>
-                <w:rFonts w:ascii="Calibri" w:hAnsi="Calibri"/>
-                <w:b w:val="0"/>
                 <w:color w:val="000000"/>
                 <w:sz w:val="20"/>
               </w:rPr>
@@ -2543,14 +2550,14 @@
         </w:tc>
         <w:tc>
           <w:tcPr>
-            <w:tcW w:type="dxa" w:w="1440"/>
-            <w:shd w:fill="F5F7F8"/>
+            <w:tcW w:w="1440" w:type="dxa"/>
             <w:tcBorders>
-              <w:top w:val="single" w:sz="4" w:color="D9D9D9"/>
-              <w:left w:val="single" w:sz="4" w:color="D9D9D9"/>
-              <w:bottom w:val="single" w:sz="4" w:color="D9D9D9"/>
-              <w:right w:val="single" w:sz="4" w:color="D9D9D9"/>
+              <w:top w:val="single" w:sz="4" w:space="0" w:color="D9D9D9"/>
+              <w:left w:val="single" w:sz="4" w:space="0" w:color="D9D9D9"/>
+              <w:bottom w:val="single" w:sz="4" w:space="0" w:color="D9D9D9"/>
+              <w:right w:val="single" w:sz="4" w:space="0" w:color="D9D9D9"/>
             </w:tcBorders>
+            <w:shd w:val="clear" w:color="auto" w:fill="FFFFFF"/>
             <w:tcMar>
               <w:top w:w="75" w:type="dxa"/>
               <w:left w:w="75" w:type="dxa"/>
@@ -2560,30 +2567,28 @@
           </w:tcPr>
           <w:p>
             <w:pPr>
-              <w:spacing w:after="40" w:before="40"/>
+              <w:spacing w:before="40" w:after="40"/>
               <w:jc w:val="center"/>
             </w:pPr>
             <w:r>
               <w:rPr>
-                <w:rFonts w:ascii="Calibri" w:hAnsi="Calibri"/>
-                <w:b w:val="0"/>
                 <w:color w:val="000000"/>
                 <w:sz w:val="20"/>
               </w:rPr>
-              <w:t>120</w:t>
+              <w:t>133</w:t>
             </w:r>
           </w:p>
         </w:tc>
         <w:tc>
           <w:tcPr>
-            <w:tcW w:type="dxa" w:w="2304"/>
-            <w:shd w:fill="F5F7F8"/>
+            <w:tcW w:w="2304" w:type="dxa"/>
             <w:tcBorders>
-              <w:top w:val="single" w:sz="4" w:color="D9D9D9"/>
-              <w:left w:val="single" w:sz="4" w:color="D9D9D9"/>
-              <w:bottom w:val="single" w:sz="4" w:color="D9D9D9"/>
-              <w:right w:val="single" w:sz="4" w:color="D9D9D9"/>
+              <w:top w:val="single" w:sz="4" w:space="0" w:color="D9D9D9"/>
+              <w:left w:val="single" w:sz="4" w:space="0" w:color="D9D9D9"/>
+              <w:bottom w:val="single" w:sz="4" w:space="0" w:color="D9D9D9"/>
+              <w:right w:val="single" w:sz="4" w:space="0" w:color="D9D9D9"/>
             </w:tcBorders>
+            <w:shd w:val="clear" w:color="auto" w:fill="FFFFFF"/>
             <w:tcMar>
               <w:top w:w="75" w:type="dxa"/>
               <w:left w:w="75" w:type="dxa"/>
@@ -2593,30 +2598,28 @@
           </w:tcPr>
           <w:p>
             <w:pPr>
-              <w:spacing w:after="40" w:before="40"/>
+              <w:spacing w:before="40" w:after="40"/>
               <w:jc w:val="center"/>
             </w:pPr>
             <w:r>
               <w:rPr>
-                <w:rFonts w:ascii="Calibri" w:hAnsi="Calibri"/>
-                <w:b w:val="0"/>
                 <w:color w:val="000000"/>
                 <w:sz w:val="20"/>
               </w:rPr>
-              <w:t>28.4361%</w:t>
+              <w:t>27.7680%</w:t>
             </w:r>
           </w:p>
         </w:tc>
         <w:tc>
           <w:tcPr>
-            <w:tcW w:type="dxa" w:w="2376"/>
-            <w:shd w:fill="F5F7F8"/>
+            <w:tcW w:w="2376" w:type="dxa"/>
             <w:tcBorders>
-              <w:top w:val="single" w:sz="4" w:color="D9D9D9"/>
-              <w:left w:val="single" w:sz="4" w:color="D9D9D9"/>
-              <w:bottom w:val="single" w:sz="4" w:color="D9D9D9"/>
-              <w:right w:val="single" w:sz="4" w:color="D9D9D9"/>
+              <w:top w:val="single" w:sz="4" w:space="0" w:color="D9D9D9"/>
+              <w:left w:val="single" w:sz="4" w:space="0" w:color="D9D9D9"/>
+              <w:bottom w:val="single" w:sz="4" w:space="0" w:color="D9D9D9"/>
+              <w:right w:val="single" w:sz="4" w:space="0" w:color="D9D9D9"/>
             </w:tcBorders>
+            <w:shd w:val="clear" w:color="auto" w:fill="FFFFFF"/>
             <w:tcMar>
               <w:top w:w="75" w:type="dxa"/>
               <w:left w:w="75" w:type="dxa"/>
@@ -2626,17 +2629,15 @@
           </w:tcPr>
           <w:p>
             <w:pPr>
-              <w:spacing w:after="40" w:before="40"/>
+              <w:spacing w:before="40" w:after="40"/>
               <w:jc w:val="center"/>
             </w:pPr>
             <w:r>
               <w:rPr>
-                <w:rFonts w:ascii="Calibri" w:hAnsi="Calibri"/>
-                <w:b w:val="0"/>
                 <w:color w:val="000000"/>
                 <w:sz w:val="20"/>
               </w:rPr>
-              <w:t>33.4649%</w:t>
+              <w:t>46.9248%</w:t>
             </w:r>
           </w:p>
         </w:tc>
@@ -2647,14 +2648,14 @@
         </w:trPr>
         <w:tc>
           <w:tcPr>
-            <w:tcW w:type="dxa" w:w="3888"/>
-            <w:shd w:fill="FFFFFF"/>
+            <w:tcW w:w="3888" w:type="dxa"/>
             <w:tcBorders>
-              <w:top w:val="single" w:sz="4" w:color="D9D9D9"/>
-              <w:left w:val="single" w:sz="4" w:color="D9D9D9"/>
-              <w:bottom w:val="single" w:sz="4" w:color="D9D9D9"/>
-              <w:right w:val="single" w:sz="4" w:color="D9D9D9"/>
+              <w:top w:val="single" w:sz="4" w:space="0" w:color="D9D9D9"/>
+              <w:left w:val="single" w:sz="4" w:space="0" w:color="D9D9D9"/>
+              <w:bottom w:val="single" w:sz="4" w:space="0" w:color="D9D9D9"/>
+              <w:right w:val="single" w:sz="4" w:space="0" w:color="D9D9D9"/>
             </w:tcBorders>
+            <w:shd w:val="clear" w:color="auto" w:fill="FFFFFF"/>
             <w:tcMar>
               <w:top w:w="75" w:type="dxa"/>
               <w:left w:w="75" w:type="dxa"/>
@@ -2664,12 +2665,10 @@
           </w:tcPr>
           <w:p>
             <w:pPr>
-              <w:spacing w:after="40" w:before="40"/>
+              <w:spacing w:before="40" w:after="40"/>
             </w:pPr>
             <w:r>
               <w:rPr>
-                <w:rFonts w:ascii="Calibri" w:hAnsi="Calibri"/>
-                <w:b w:val="0"/>
                 <w:color w:val="000000"/>
                 <w:sz w:val="20"/>
               </w:rPr>
@@ -2679,14 +2678,14 @@
         </w:tc>
         <w:tc>
           <w:tcPr>
-            <w:tcW w:type="dxa" w:w="1440"/>
-            <w:shd w:fill="FFFFFF"/>
+            <w:tcW w:w="1440" w:type="dxa"/>
             <w:tcBorders>
-              <w:top w:val="single" w:sz="4" w:color="D9D9D9"/>
-              <w:left w:val="single" w:sz="4" w:color="D9D9D9"/>
-              <w:bottom w:val="single" w:sz="4" w:color="D9D9D9"/>
-              <w:right w:val="single" w:sz="4" w:color="D9D9D9"/>
+              <w:top w:val="single" w:sz="4" w:space="0" w:color="D9D9D9"/>
+              <w:left w:val="single" w:sz="4" w:space="0" w:color="D9D9D9"/>
+              <w:bottom w:val="single" w:sz="4" w:space="0" w:color="D9D9D9"/>
+              <w:right w:val="single" w:sz="4" w:space="0" w:color="D9D9D9"/>
             </w:tcBorders>
+            <w:shd w:val="clear" w:color="auto" w:fill="FFFFFF"/>
             <w:tcMar>
               <w:top w:w="75" w:type="dxa"/>
               <w:left w:w="75" w:type="dxa"/>
@@ -2696,30 +2695,28 @@
           </w:tcPr>
           <w:p>
             <w:pPr>
-              <w:spacing w:after="40" w:before="40"/>
+              <w:spacing w:before="40" w:after="40"/>
               <w:jc w:val="center"/>
             </w:pPr>
             <w:r>
               <w:rPr>
-                <w:rFonts w:ascii="Calibri" w:hAnsi="Calibri"/>
-                <w:b w:val="0"/>
                 <w:color w:val="000000"/>
                 <w:sz w:val="20"/>
               </w:rPr>
-              <w:t>108</w:t>
+              <w:t>89</w:t>
             </w:r>
           </w:p>
         </w:tc>
         <w:tc>
           <w:tcPr>
-            <w:tcW w:type="dxa" w:w="2304"/>
-            <w:shd w:fill="FFFFFF"/>
+            <w:tcW w:w="2304" w:type="dxa"/>
             <w:tcBorders>
-              <w:top w:val="single" w:sz="4" w:color="D9D9D9"/>
-              <w:left w:val="single" w:sz="4" w:color="D9D9D9"/>
-              <w:bottom w:val="single" w:sz="4" w:color="D9D9D9"/>
-              <w:right w:val="single" w:sz="4" w:color="D9D9D9"/>
+              <w:top w:val="single" w:sz="4" w:space="0" w:color="D9D9D9"/>
+              <w:left w:val="single" w:sz="4" w:space="0" w:color="D9D9D9"/>
+              <w:bottom w:val="single" w:sz="4" w:space="0" w:color="D9D9D9"/>
+              <w:right w:val="single" w:sz="4" w:space="0" w:color="D9D9D9"/>
             </w:tcBorders>
+            <w:shd w:val="clear" w:color="auto" w:fill="FFFFFF"/>
             <w:tcMar>
               <w:top w:w="75" w:type="dxa"/>
               <w:left w:w="75" w:type="dxa"/>
@@ -2729,30 +2726,28 @@
           </w:tcPr>
           <w:p>
             <w:pPr>
-              <w:spacing w:after="40" w:before="40"/>
+              <w:spacing w:before="40" w:after="40"/>
               <w:jc w:val="center"/>
             </w:pPr>
             <w:r>
               <w:rPr>
-                <w:rFonts w:ascii="Calibri" w:hAnsi="Calibri"/>
-                <w:b w:val="0"/>
                 <w:color w:val="000000"/>
                 <w:sz w:val="20"/>
               </w:rPr>
-              <w:t>24.4003%</w:t>
+              <w:t>21.0080%</w:t>
             </w:r>
           </w:p>
         </w:tc>
         <w:tc>
           <w:tcPr>
-            <w:tcW w:type="dxa" w:w="2376"/>
-            <w:shd w:fill="FFFFFF"/>
+            <w:tcW w:w="2376" w:type="dxa"/>
             <w:tcBorders>
-              <w:top w:val="single" w:sz="4" w:color="D9D9D9"/>
-              <w:left w:val="single" w:sz="4" w:color="D9D9D9"/>
-              <w:bottom w:val="single" w:sz="4" w:color="D9D9D9"/>
-              <w:right w:val="single" w:sz="4" w:color="D9D9D9"/>
+              <w:top w:val="single" w:sz="4" w:space="0" w:color="D9D9D9"/>
+              <w:left w:val="single" w:sz="4" w:space="0" w:color="D9D9D9"/>
+              <w:bottom w:val="single" w:sz="4" w:space="0" w:color="D9D9D9"/>
+              <w:right w:val="single" w:sz="4" w:space="0" w:color="D9D9D9"/>
             </w:tcBorders>
+            <w:shd w:val="clear" w:color="auto" w:fill="FFFFFF"/>
             <w:tcMar>
               <w:top w:w="75" w:type="dxa"/>
               <w:left w:w="75" w:type="dxa"/>
@@ -2762,17 +2757,15 @@
           </w:tcPr>
           <w:p>
             <w:pPr>
-              <w:spacing w:after="40" w:before="40"/>
+              <w:spacing w:before="40" w:after="40"/>
               <w:jc w:val="center"/>
             </w:pPr>
             <w:r>
               <w:rPr>
-                <w:rFonts w:ascii="Calibri" w:hAnsi="Calibri"/>
-                <w:b w:val="0"/>
                 <w:color w:val="000000"/>
                 <w:sz w:val="20"/>
               </w:rPr>
-              <w:t>30.6822%</w:t>
+              <w:t>17.1813%</w:t>
             </w:r>
           </w:p>
         </w:tc>
@@ -2783,14 +2776,14 @@
         </w:trPr>
         <w:tc>
           <w:tcPr>
-            <w:tcW w:type="dxa" w:w="3888"/>
-            <w:shd w:fill="F5F7F8"/>
+            <w:tcW w:w="3888" w:type="dxa"/>
             <w:tcBorders>
-              <w:top w:val="single" w:sz="4" w:color="D9D9D9"/>
-              <w:left w:val="single" w:sz="4" w:color="D9D9D9"/>
-              <w:bottom w:val="single" w:sz="4" w:color="D9D9D9"/>
-              <w:right w:val="single" w:sz="4" w:color="D9D9D9"/>
+              <w:top w:val="single" w:sz="4" w:space="0" w:color="D9D9D9"/>
+              <w:left w:val="single" w:sz="4" w:space="0" w:color="D9D9D9"/>
+              <w:bottom w:val="single" w:sz="4" w:space="0" w:color="D9D9D9"/>
+              <w:right w:val="single" w:sz="4" w:space="0" w:color="D9D9D9"/>
             </w:tcBorders>
+            <w:shd w:val="clear" w:color="auto" w:fill="FFFFFF"/>
             <w:tcMar>
               <w:top w:w="75" w:type="dxa"/>
               <w:left w:w="75" w:type="dxa"/>
@@ -2800,12 +2793,10 @@
           </w:tcPr>
           <w:p>
             <w:pPr>
-              <w:spacing w:after="40" w:before="40"/>
+              <w:spacing w:before="40" w:after="40"/>
             </w:pPr>
             <w:r>
               <w:rPr>
-                <w:rFonts w:ascii="Calibri" w:hAnsi="Calibri"/>
-                <w:b w:val="0"/>
                 <w:color w:val="000000"/>
                 <w:sz w:val="20"/>
               </w:rPr>
@@ -2815,14 +2806,14 @@
         </w:tc>
         <w:tc>
           <w:tcPr>
-            <w:tcW w:type="dxa" w:w="1440"/>
-            <w:shd w:fill="F5F7F8"/>
+            <w:tcW w:w="1440" w:type="dxa"/>
             <w:tcBorders>
-              <w:top w:val="single" w:sz="4" w:color="D9D9D9"/>
-              <w:left w:val="single" w:sz="4" w:color="D9D9D9"/>
-              <w:bottom w:val="single" w:sz="4" w:color="D9D9D9"/>
-              <w:right w:val="single" w:sz="4" w:color="D9D9D9"/>
+              <w:top w:val="single" w:sz="4" w:space="0" w:color="D9D9D9"/>
+              <w:left w:val="single" w:sz="4" w:space="0" w:color="D9D9D9"/>
+              <w:bottom w:val="single" w:sz="4" w:space="0" w:color="D9D9D9"/>
+              <w:right w:val="single" w:sz="4" w:space="0" w:color="D9D9D9"/>
             </w:tcBorders>
+            <w:shd w:val="clear" w:color="auto" w:fill="FFFFFF"/>
             <w:tcMar>
               <w:top w:w="75" w:type="dxa"/>
               <w:left w:w="75" w:type="dxa"/>
@@ -2832,30 +2823,28 @@
           </w:tcPr>
           <w:p>
             <w:pPr>
-              <w:spacing w:after="40" w:before="40"/>
+              <w:spacing w:before="40" w:after="40"/>
               <w:jc w:val="center"/>
             </w:pPr>
             <w:r>
               <w:rPr>
-                <w:rFonts w:ascii="Calibri" w:hAnsi="Calibri"/>
-                <w:b w:val="0"/>
                 <w:color w:val="000000"/>
                 <w:sz w:val="20"/>
               </w:rPr>
-              <w:t>20</w:t>
+              <w:t>10</w:t>
             </w:r>
           </w:p>
         </w:tc>
         <w:tc>
           <w:tcPr>
-            <w:tcW w:type="dxa" w:w="2304"/>
-            <w:shd w:fill="F5F7F8"/>
+            <w:tcW w:w="2304" w:type="dxa"/>
             <w:tcBorders>
-              <w:top w:val="single" w:sz="4" w:color="D9D9D9"/>
-              <w:left w:val="single" w:sz="4" w:color="D9D9D9"/>
-              <w:bottom w:val="single" w:sz="4" w:color="D9D9D9"/>
-              <w:right w:val="single" w:sz="4" w:color="D9D9D9"/>
+              <w:top w:val="single" w:sz="4" w:space="0" w:color="D9D9D9"/>
+              <w:left w:val="single" w:sz="4" w:space="0" w:color="D9D9D9"/>
+              <w:bottom w:val="single" w:sz="4" w:space="0" w:color="D9D9D9"/>
+              <w:right w:val="single" w:sz="4" w:space="0" w:color="D9D9D9"/>
             </w:tcBorders>
+            <w:shd w:val="clear" w:color="auto" w:fill="FFFFFF"/>
             <w:tcMar>
               <w:top w:w="75" w:type="dxa"/>
               <w:left w:w="75" w:type="dxa"/>
@@ -2865,30 +2854,28 @@
           </w:tcPr>
           <w:p>
             <w:pPr>
-              <w:spacing w:after="40" w:before="40"/>
+              <w:spacing w:before="40" w:after="40"/>
               <w:jc w:val="center"/>
             </w:pPr>
             <w:r>
               <w:rPr>
-                <w:rFonts w:ascii="Calibri" w:hAnsi="Calibri"/>
-                <w:b w:val="0"/>
                 <w:color w:val="000000"/>
                 <w:sz w:val="20"/>
               </w:rPr>
-              <w:t>12.5661%</w:t>
+              <w:t>12.2032%</w:t>
             </w:r>
           </w:p>
         </w:tc>
         <w:tc>
           <w:tcPr>
-            <w:tcW w:type="dxa" w:w="2376"/>
-            <w:shd w:fill="F5F7F8"/>
+            <w:tcW w:w="2376" w:type="dxa"/>
             <w:tcBorders>
-              <w:top w:val="single" w:sz="4" w:color="D9D9D9"/>
-              <w:left w:val="single" w:sz="4" w:color="D9D9D9"/>
-              <w:bottom w:val="single" w:sz="4" w:color="D9D9D9"/>
-              <w:right w:val="single" w:sz="4" w:color="D9D9D9"/>
+              <w:top w:val="single" w:sz="4" w:space="0" w:color="D9D9D9"/>
+              <w:left w:val="single" w:sz="4" w:space="0" w:color="D9D9D9"/>
+              <w:bottom w:val="single" w:sz="4" w:space="0" w:color="D9D9D9"/>
+              <w:right w:val="single" w:sz="4" w:space="0" w:color="D9D9D9"/>
             </w:tcBorders>
+            <w:shd w:val="clear" w:color="auto" w:fill="FFFFFF"/>
             <w:tcMar>
               <w:top w:w="75" w:type="dxa"/>
               <w:left w:w="75" w:type="dxa"/>
@@ -2898,17 +2885,15 @@
           </w:tcPr>
           <w:p>
             <w:pPr>
-              <w:spacing w:after="40" w:before="40"/>
+              <w:spacing w:before="40" w:after="40"/>
               <w:jc w:val="center"/>
             </w:pPr>
             <w:r>
               <w:rPr>
-                <w:rFonts w:ascii="Calibri" w:hAnsi="Calibri"/>
-                <w:b w:val="0"/>
                 <w:color w:val="000000"/>
                 <w:sz w:val="20"/>
               </w:rPr>
-              <w:t>4.8260%</w:t>
+              <w:t>4.0110%</w:t>
             </w:r>
           </w:p>
         </w:tc>
@@ -2919,14 +2904,14 @@
         </w:trPr>
         <w:tc>
           <w:tcPr>
-            <w:tcW w:type="dxa" w:w="3888"/>
-            <w:shd w:fill="FFFFFF"/>
+            <w:tcW w:w="3888" w:type="dxa"/>
             <w:tcBorders>
-              <w:top w:val="single" w:sz="4" w:color="D9D9D9"/>
-              <w:left w:val="single" w:sz="4" w:color="D9D9D9"/>
-              <w:bottom w:val="single" w:sz="4" w:color="D9D9D9"/>
-              <w:right w:val="single" w:sz="4" w:color="D9D9D9"/>
+              <w:top w:val="single" w:sz="4" w:space="0" w:color="D9D9D9"/>
+              <w:left w:val="single" w:sz="4" w:space="0" w:color="D9D9D9"/>
+              <w:bottom w:val="single" w:sz="4" w:space="0" w:color="D9D9D9"/>
+              <w:right w:val="single" w:sz="4" w:space="0" w:color="D9D9D9"/>
             </w:tcBorders>
+            <w:shd w:val="clear" w:color="auto" w:fill="FFFFFF"/>
             <w:tcMar>
               <w:top w:w="75" w:type="dxa"/>
               <w:left w:w="75" w:type="dxa"/>
@@ -2936,12 +2921,10 @@
           </w:tcPr>
           <w:p>
             <w:pPr>
-              <w:spacing w:after="40" w:before="40"/>
+              <w:spacing w:before="40" w:after="40"/>
             </w:pPr>
             <w:r>
               <w:rPr>
-                <w:rFonts w:ascii="Calibri" w:hAnsi="Calibri"/>
-                <w:b w:val="0"/>
                 <w:color w:val="000000"/>
                 <w:sz w:val="20"/>
               </w:rPr>
@@ -2951,14 +2934,14 @@
         </w:tc>
         <w:tc>
           <w:tcPr>
-            <w:tcW w:type="dxa" w:w="1440"/>
-            <w:shd w:fill="FFFFFF"/>
+            <w:tcW w:w="1440" w:type="dxa"/>
             <w:tcBorders>
-              <w:top w:val="single" w:sz="4" w:color="D9D9D9"/>
-              <w:left w:val="single" w:sz="4" w:color="D9D9D9"/>
-              <w:bottom w:val="single" w:sz="4" w:color="D9D9D9"/>
-              <w:right w:val="single" w:sz="4" w:color="D9D9D9"/>
+              <w:top w:val="single" w:sz="4" w:space="0" w:color="D9D9D9"/>
+              <w:left w:val="single" w:sz="4" w:space="0" w:color="D9D9D9"/>
+              <w:bottom w:val="single" w:sz="4" w:space="0" w:color="D9D9D9"/>
+              <w:right w:val="single" w:sz="4" w:space="0" w:color="D9D9D9"/>
             </w:tcBorders>
+            <w:shd w:val="clear" w:color="auto" w:fill="FFFFFF"/>
             <w:tcMar>
               <w:top w:w="75" w:type="dxa"/>
               <w:left w:w="75" w:type="dxa"/>
@@ -2968,13 +2951,11 @@
           </w:tcPr>
           <w:p>
             <w:pPr>
-              <w:spacing w:after="40" w:before="40"/>
+              <w:spacing w:before="40" w:after="40"/>
               <w:jc w:val="center"/>
             </w:pPr>
             <w:r>
               <w:rPr>
-                <w:rFonts w:ascii="Calibri" w:hAnsi="Calibri"/>
-                <w:b w:val="0"/>
                 <w:color w:val="000000"/>
                 <w:sz w:val="20"/>
               </w:rPr>
@@ -2984,14 +2965,14 @@
         </w:tc>
         <w:tc>
           <w:tcPr>
-            <w:tcW w:type="dxa" w:w="2304"/>
-            <w:shd w:fill="FFFFFF"/>
+            <w:tcW w:w="2304" w:type="dxa"/>
             <w:tcBorders>
-              <w:top w:val="single" w:sz="4" w:color="D9D9D9"/>
-              <w:left w:val="single" w:sz="4" w:color="D9D9D9"/>
-              <w:bottom w:val="single" w:sz="4" w:color="D9D9D9"/>
-              <w:right w:val="single" w:sz="4" w:color="D9D9D9"/>
+              <w:top w:val="single" w:sz="4" w:space="0" w:color="D9D9D9"/>
+              <w:left w:val="single" w:sz="4" w:space="0" w:color="D9D9D9"/>
+              <w:bottom w:val="single" w:sz="4" w:space="0" w:color="D9D9D9"/>
+              <w:right w:val="single" w:sz="4" w:space="0" w:color="D9D9D9"/>
             </w:tcBorders>
+            <w:shd w:val="clear" w:color="auto" w:fill="FFFFFF"/>
             <w:tcMar>
               <w:top w:w="75" w:type="dxa"/>
               <w:left w:w="75" w:type="dxa"/>
@@ -3001,13 +2982,11 @@
           </w:tcPr>
           <w:p>
             <w:pPr>
-              <w:spacing w:after="40" w:before="40"/>
+              <w:spacing w:before="40" w:after="40"/>
               <w:jc w:val="center"/>
             </w:pPr>
             <w:r>
               <w:rPr>
-                <w:rFonts w:ascii="Calibri" w:hAnsi="Calibri"/>
-                <w:b w:val="0"/>
                 <w:color w:val="000000"/>
                 <w:sz w:val="20"/>
               </w:rPr>
@@ -3017,14 +2996,14 @@
         </w:tc>
         <w:tc>
           <w:tcPr>
-            <w:tcW w:type="dxa" w:w="2376"/>
-            <w:shd w:fill="FFFFFF"/>
+            <w:tcW w:w="2376" w:type="dxa"/>
             <w:tcBorders>
-              <w:top w:val="single" w:sz="4" w:color="D9D9D9"/>
-              <w:left w:val="single" w:sz="4" w:color="D9D9D9"/>
-              <w:bottom w:val="single" w:sz="4" w:color="D9D9D9"/>
-              <w:right w:val="single" w:sz="4" w:color="D9D9D9"/>
+              <w:top w:val="single" w:sz="4" w:space="0" w:color="D9D9D9"/>
+              <w:left w:val="single" w:sz="4" w:space="0" w:color="D9D9D9"/>
+              <w:bottom w:val="single" w:sz="4" w:space="0" w:color="D9D9D9"/>
+              <w:right w:val="single" w:sz="4" w:space="0" w:color="D9D9D9"/>
             </w:tcBorders>
+            <w:shd w:val="clear" w:color="auto" w:fill="FFFFFF"/>
             <w:tcMar>
               <w:top w:w="75" w:type="dxa"/>
               <w:left w:w="75" w:type="dxa"/>
@@ -3034,13 +3013,11 @@
           </w:tcPr>
           <w:p>
             <w:pPr>
-              <w:spacing w:after="40" w:before="40"/>
+              <w:spacing w:before="40" w:after="40"/>
               <w:jc w:val="center"/>
             </w:pPr>
             <w:r>
               <w:rPr>
-                <w:rFonts w:ascii="Calibri" w:hAnsi="Calibri"/>
-                <w:b w:val="0"/>
                 <w:color w:val="000000"/>
                 <w:sz w:val="20"/>
               </w:rPr>
@@ -3052,29 +3029,32 @@
     </w:tbl>
     <w:p>
       <w:pPr>
-        <w:keepNext w:val="0"/>
-        <w:pageBreakBefore w:val="0"/>
+        <w:spacing w:after="120"/>
+        <w:rPr>
+          <w:color w:val="000000"/>
+          <w:sz w:val="21"/>
+        </w:rPr>
+      </w:pPr>
+    </w:p>
+    <w:p>
+      <w:pPr>
         <w:spacing w:after="120"/>
       </w:pPr>
       <w:r>
         <w:rPr>
-          <w:rFonts w:ascii="Calibri" w:hAnsi="Calibri"/>
-          <w:b w:val="0"/>
           <w:color w:val="000000"/>
           <w:sz w:val="21"/>
         </w:rPr>
-        <w:t>The summary uses the weaker required membership or allocation confidence. The following tables show each component separately. Each table accounts for the entire known-PPR universe once, including unresolved cases; do not add their percentages together.</w:t>
+        <w:t xml:space="preserve">The summary uses the weaker required membership or allocation confidence. The following tables show each component separately. </w:t>
       </w:r>
     </w:p>
     <w:p>
       <w:pPr>
         <w:keepNext/>
-        <w:pageBreakBefore w:val="0"/>
         <w:spacing w:after="120"/>
       </w:pPr>
       <w:r>
         <w:rPr>
-          <w:rFonts w:ascii="Calibri" w:hAnsi="Calibri"/>
           <w:b/>
           <w:color w:val="000000"/>
           <w:sz w:val="23"/>
@@ -3084,9 +3064,9 @@
     </w:p>
     <w:tbl>
       <w:tblPr>
-        <w:tblW w:type="auto" w:w="0"/>
+        <w:tblW w:w="0" w:type="auto"/>
         <w:tblLayout w:type="fixed"/>
-        <w:tblLook w:firstColumn="1" w:firstRow="1" w:lastColumn="0" w:lastRow="0" w:noHBand="0" w:noVBand="1" w:val="04A0"/>
+        <w:tblLook w:val="04A0" w:firstRow="1" w:lastRow="0" w:firstColumn="1" w:lastColumn="0" w:noHBand="0" w:noVBand="1"/>
       </w:tblPr>
       <w:tblGrid>
         <w:gridCol w:w="6624"/>
@@ -3095,19 +3075,19 @@
       </w:tblGrid>
       <w:tr>
         <w:trPr>
+          <w:cantSplit/>
           <w:tblHeader/>
-          <w:cantSplit/>
         </w:trPr>
         <w:tc>
           <w:tcPr>
-            <w:tcW w:type="dxa" w:w="6624"/>
-            <w:shd w:fill="DDE9EE"/>
+            <w:tcW w:w="6624" w:type="dxa"/>
             <w:tcBorders>
-              <w:top w:val="single" w:sz="4" w:color="D9D9D9"/>
-              <w:left w:val="single" w:sz="4" w:color="D9D9D9"/>
-              <w:bottom w:val="single" w:sz="4" w:color="D9D9D9"/>
-              <w:right w:val="single" w:sz="4" w:color="D9D9D9"/>
+              <w:top w:val="single" w:sz="4" w:space="0" w:color="D9D9D9"/>
+              <w:left w:val="single" w:sz="4" w:space="0" w:color="D9D9D9"/>
+              <w:bottom w:val="single" w:sz="4" w:space="0" w:color="D9D9D9"/>
+              <w:right w:val="single" w:sz="4" w:space="0" w:color="D9D9D9"/>
             </w:tcBorders>
+            <w:shd w:val="clear" w:color="auto" w:fill="DDE9EE"/>
             <w:tcMar>
               <w:top w:w="75" w:type="dxa"/>
               <w:left w:w="75" w:type="dxa"/>
@@ -3117,11 +3097,10 @@
           </w:tcPr>
           <w:p>
             <w:pPr>
-              <w:spacing w:after="40" w:before="40"/>
+              <w:spacing w:before="40" w:after="40"/>
             </w:pPr>
             <w:r>
               <w:rPr>
-                <w:rFonts w:ascii="Calibri" w:hAnsi="Calibri"/>
                 <w:b/>
                 <w:color w:val="000000"/>
                 <w:sz w:val="20"/>
@@ -3132,14 +3111,14 @@
         </w:tc>
         <w:tc>
           <w:tcPr>
-            <w:tcW w:type="dxa" w:w="1512"/>
-            <w:shd w:fill="DDE9EE"/>
+            <w:tcW w:w="1512" w:type="dxa"/>
             <w:tcBorders>
-              <w:top w:val="single" w:sz="4" w:color="D9D9D9"/>
-              <w:left w:val="single" w:sz="4" w:color="D9D9D9"/>
-              <w:bottom w:val="single" w:sz="4" w:color="D9D9D9"/>
-              <w:right w:val="single" w:sz="4" w:color="D9D9D9"/>
+              <w:top w:val="single" w:sz="4" w:space="0" w:color="D9D9D9"/>
+              <w:left w:val="single" w:sz="4" w:space="0" w:color="D9D9D9"/>
+              <w:bottom w:val="single" w:sz="4" w:space="0" w:color="D9D9D9"/>
+              <w:right w:val="single" w:sz="4" w:space="0" w:color="D9D9D9"/>
             </w:tcBorders>
+            <w:shd w:val="clear" w:color="auto" w:fill="DDE9EE"/>
             <w:tcMar>
               <w:top w:w="75" w:type="dxa"/>
               <w:left w:w="75" w:type="dxa"/>
@@ -3149,12 +3128,11 @@
           </w:tcPr>
           <w:p>
             <w:pPr>
-              <w:spacing w:after="40" w:before="40"/>
+              <w:spacing w:before="40" w:after="40"/>
               <w:jc w:val="center"/>
             </w:pPr>
             <w:r>
               <w:rPr>
-                <w:rFonts w:ascii="Calibri" w:hAnsi="Calibri"/>
                 <w:b/>
                 <w:color w:val="000000"/>
                 <w:sz w:val="20"/>
@@ -3165,14 +3143,14 @@
         </w:tc>
         <w:tc>
           <w:tcPr>
-            <w:tcW w:type="dxa" w:w="1872"/>
-            <w:shd w:fill="DDE9EE"/>
+            <w:tcW w:w="1872" w:type="dxa"/>
             <w:tcBorders>
-              <w:top w:val="single" w:sz="4" w:color="D9D9D9"/>
-              <w:left w:val="single" w:sz="4" w:color="D9D9D9"/>
-              <w:bottom w:val="single" w:sz="4" w:color="D9D9D9"/>
-              <w:right w:val="single" w:sz="4" w:color="D9D9D9"/>
+              <w:top w:val="single" w:sz="4" w:space="0" w:color="D9D9D9"/>
+              <w:left w:val="single" w:sz="4" w:space="0" w:color="D9D9D9"/>
+              <w:bottom w:val="single" w:sz="4" w:space="0" w:color="D9D9D9"/>
+              <w:right w:val="single" w:sz="4" w:space="0" w:color="D9D9D9"/>
             </w:tcBorders>
+            <w:shd w:val="clear" w:color="auto" w:fill="DDE9EE"/>
             <w:tcMar>
               <w:top w:w="75" w:type="dxa"/>
               <w:left w:w="75" w:type="dxa"/>
@@ -3182,12 +3160,11 @@
           </w:tcPr>
           <w:p>
             <w:pPr>
-              <w:spacing w:after="40" w:before="40"/>
+              <w:spacing w:before="40" w:after="40"/>
               <w:jc w:val="center"/>
             </w:pPr>
             <w:r>
               <w:rPr>
-                <w:rFonts w:ascii="Calibri" w:hAnsi="Calibri"/>
                 <w:b/>
                 <w:color w:val="000000"/>
                 <w:sz w:val="20"/>
@@ -3203,14 +3180,14 @@
         </w:trPr>
         <w:tc>
           <w:tcPr>
-            <w:tcW w:type="dxa" w:w="6624"/>
-            <w:shd w:fill="FFFFFF"/>
+            <w:tcW w:w="6624" w:type="dxa"/>
             <w:tcBorders>
-              <w:top w:val="single" w:sz="4" w:color="D9D9D9"/>
-              <w:left w:val="single" w:sz="4" w:color="D9D9D9"/>
-              <w:bottom w:val="single" w:sz="4" w:color="D9D9D9"/>
-              <w:right w:val="single" w:sz="4" w:color="D9D9D9"/>
+              <w:top w:val="single" w:sz="4" w:space="0" w:color="D9D9D9"/>
+              <w:left w:val="single" w:sz="4" w:space="0" w:color="D9D9D9"/>
+              <w:bottom w:val="single" w:sz="4" w:space="0" w:color="D9D9D9"/>
+              <w:right w:val="single" w:sz="4" w:space="0" w:color="D9D9D9"/>
             </w:tcBorders>
+            <w:shd w:val="clear" w:color="auto" w:fill="FFFFFF"/>
             <w:tcMar>
               <w:top w:w="75" w:type="dxa"/>
               <w:left w:w="75" w:type="dxa"/>
@@ -3220,29 +3197,27 @@
           </w:tcPr>
           <w:p>
             <w:pPr>
-              <w:spacing w:after="40" w:before="40"/>
+              <w:spacing w:before="40" w:after="40"/>
             </w:pPr>
             <w:r>
               <w:rPr>
-                <w:rFonts w:ascii="Calibri" w:hAnsi="Calibri"/>
-                <w:b w:val="0"/>
                 <w:color w:val="000000"/>
                 <w:sz w:val="20"/>
               </w:rPr>
-              <w:t>The taxon fits an unambiguous documented group definition</w:t>
+              <w:t>Documented taxonomy and ecology unambiguously meet the group definition</w:t>
             </w:r>
           </w:p>
         </w:tc>
         <w:tc>
           <w:tcPr>
-            <w:tcW w:type="dxa" w:w="1512"/>
-            <w:shd w:fill="FFFFFF"/>
+            <w:tcW w:w="1512" w:type="dxa"/>
             <w:tcBorders>
-              <w:top w:val="single" w:sz="4" w:color="D9D9D9"/>
-              <w:left w:val="single" w:sz="4" w:color="D9D9D9"/>
-              <w:bottom w:val="single" w:sz="4" w:color="D9D9D9"/>
-              <w:right w:val="single" w:sz="4" w:color="D9D9D9"/>
+              <w:top w:val="single" w:sz="4" w:space="0" w:color="D9D9D9"/>
+              <w:left w:val="single" w:sz="4" w:space="0" w:color="D9D9D9"/>
+              <w:bottom w:val="single" w:sz="4" w:space="0" w:color="D9D9D9"/>
+              <w:right w:val="single" w:sz="4" w:space="0" w:color="D9D9D9"/>
             </w:tcBorders>
+            <w:shd w:val="clear" w:color="auto" w:fill="FFFFFF"/>
             <w:tcMar>
               <w:top w:w="75" w:type="dxa"/>
               <w:left w:w="75" w:type="dxa"/>
@@ -3252,13 +3227,11 @@
           </w:tcPr>
           <w:p>
             <w:pPr>
-              <w:spacing w:after="40" w:before="40"/>
+              <w:spacing w:before="40" w:after="40"/>
               <w:jc w:val="center"/>
             </w:pPr>
             <w:r>
               <w:rPr>
-                <w:rFonts w:ascii="Calibri" w:hAnsi="Calibri"/>
-                <w:b w:val="0"/>
                 <w:color w:val="000000"/>
                 <w:sz w:val="20"/>
               </w:rPr>
@@ -3268,14 +3241,14 @@
         </w:tc>
         <w:tc>
           <w:tcPr>
-            <w:tcW w:type="dxa" w:w="1872"/>
-            <w:shd w:fill="FFFFFF"/>
+            <w:tcW w:w="1872" w:type="dxa"/>
             <w:tcBorders>
-              <w:top w:val="single" w:sz="4" w:color="D9D9D9"/>
-              <w:left w:val="single" w:sz="4" w:color="D9D9D9"/>
-              <w:bottom w:val="single" w:sz="4" w:color="D9D9D9"/>
-              <w:right w:val="single" w:sz="4" w:color="D9D9D9"/>
+              <w:top w:val="single" w:sz="4" w:space="0" w:color="D9D9D9"/>
+              <w:left w:val="single" w:sz="4" w:space="0" w:color="D9D9D9"/>
+              <w:bottom w:val="single" w:sz="4" w:space="0" w:color="D9D9D9"/>
+              <w:right w:val="single" w:sz="4" w:space="0" w:color="D9D9D9"/>
             </w:tcBorders>
+            <w:shd w:val="clear" w:color="auto" w:fill="FFFFFF"/>
             <w:tcMar>
               <w:top w:w="75" w:type="dxa"/>
               <w:left w:w="75" w:type="dxa"/>
@@ -3285,17 +3258,15 @@
           </w:tcPr>
           <w:p>
             <w:pPr>
-              <w:spacing w:after="40" w:before="40"/>
+              <w:spacing w:before="40" w:after="40"/>
               <w:jc w:val="center"/>
             </w:pPr>
             <w:r>
               <w:rPr>
-                <w:rFonts w:ascii="Calibri" w:hAnsi="Calibri"/>
-                <w:b w:val="0"/>
                 <w:color w:val="000000"/>
                 <w:sz w:val="20"/>
               </w:rPr>
-              <w:t>30.8962%</w:t>
+              <w:t>47.9897%</w:t>
             </w:r>
           </w:p>
         </w:tc>
@@ -3306,14 +3277,14 @@
         </w:trPr>
         <w:tc>
           <w:tcPr>
-            <w:tcW w:type="dxa" w:w="6624"/>
-            <w:shd w:fill="F5F7F8"/>
+            <w:tcW w:w="6624" w:type="dxa"/>
             <w:tcBorders>
-              <w:top w:val="single" w:sz="4" w:color="D9D9D9"/>
-              <w:left w:val="single" w:sz="4" w:color="D9D9D9"/>
-              <w:bottom w:val="single" w:sz="4" w:color="D9D9D9"/>
-              <w:right w:val="single" w:sz="4" w:color="D9D9D9"/>
+              <w:top w:val="single" w:sz="4" w:space="0" w:color="D9D9D9"/>
+              <w:left w:val="single" w:sz="4" w:space="0" w:color="D9D9D9"/>
+              <w:bottom w:val="single" w:sz="4" w:space="0" w:color="D9D9D9"/>
+              <w:right w:val="single" w:sz="4" w:space="0" w:color="D9D9D9"/>
             </w:tcBorders>
+            <w:shd w:val="clear" w:color="auto" w:fill="FFFFFF"/>
             <w:tcMar>
               <w:top w:w="75" w:type="dxa"/>
               <w:left w:w="75" w:type="dxa"/>
@@ -3323,29 +3294,27 @@
           </w:tcPr>
           <w:p>
             <w:pPr>
-              <w:spacing w:after="40" w:before="40"/>
+              <w:spacing w:before="40" w:after="40"/>
             </w:pPr>
             <w:r>
               <w:rPr>
-                <w:rFonts w:ascii="Calibri" w:hAnsi="Calibri"/>
-                <w:b w:val="0"/>
                 <w:color w:val="000000"/>
                 <w:sz w:val="20"/>
               </w:rPr>
-              <w:t>The assignment has incomplete or conflicting size habitat or stage evidence</w:t>
+              <w:t>Ecological fit is partial or the source definition is conflicting</w:t>
             </w:r>
           </w:p>
         </w:tc>
         <w:tc>
           <w:tcPr>
-            <w:tcW w:type="dxa" w:w="1512"/>
-            <w:shd w:fill="F5F7F8"/>
+            <w:tcW w:w="1512" w:type="dxa"/>
             <w:tcBorders>
-              <w:top w:val="single" w:sz="4" w:color="D9D9D9"/>
-              <w:left w:val="single" w:sz="4" w:color="D9D9D9"/>
-              <w:bottom w:val="single" w:sz="4" w:color="D9D9D9"/>
-              <w:right w:val="single" w:sz="4" w:color="D9D9D9"/>
+              <w:top w:val="single" w:sz="4" w:space="0" w:color="D9D9D9"/>
+              <w:left w:val="single" w:sz="4" w:space="0" w:color="D9D9D9"/>
+              <w:bottom w:val="single" w:sz="4" w:space="0" w:color="D9D9D9"/>
+              <w:right w:val="single" w:sz="4" w:space="0" w:color="D9D9D9"/>
             </w:tcBorders>
+            <w:shd w:val="clear" w:color="auto" w:fill="FFFFFF"/>
             <w:tcMar>
               <w:top w:w="75" w:type="dxa"/>
               <w:left w:w="75" w:type="dxa"/>
@@ -3355,13 +3324,11 @@
           </w:tcPr>
           <w:p>
             <w:pPr>
-              <w:spacing w:after="40" w:before="40"/>
+              <w:spacing w:before="40" w:after="40"/>
               <w:jc w:val="center"/>
             </w:pPr>
             <w:r>
               <w:rPr>
-                <w:rFonts w:ascii="Calibri" w:hAnsi="Calibri"/>
-                <w:b w:val="0"/>
                 <w:color w:val="000000"/>
                 <w:sz w:val="20"/>
               </w:rPr>
@@ -3371,14 +3338,14 @@
         </w:tc>
         <w:tc>
           <w:tcPr>
-            <w:tcW w:type="dxa" w:w="1872"/>
-            <w:shd w:fill="F5F7F8"/>
+            <w:tcW w:w="1872" w:type="dxa"/>
             <w:tcBorders>
-              <w:top w:val="single" w:sz="4" w:color="D9D9D9"/>
-              <w:left w:val="single" w:sz="4" w:color="D9D9D9"/>
-              <w:bottom w:val="single" w:sz="4" w:color="D9D9D9"/>
-              <w:right w:val="single" w:sz="4" w:color="D9D9D9"/>
+              <w:top w:val="single" w:sz="4" w:space="0" w:color="D9D9D9"/>
+              <w:left w:val="single" w:sz="4" w:space="0" w:color="D9D9D9"/>
+              <w:bottom w:val="single" w:sz="4" w:space="0" w:color="D9D9D9"/>
+              <w:right w:val="single" w:sz="4" w:space="0" w:color="D9D9D9"/>
             </w:tcBorders>
+            <w:shd w:val="clear" w:color="auto" w:fill="FFFFFF"/>
             <w:tcMar>
               <w:top w:w="75" w:type="dxa"/>
               <w:left w:w="75" w:type="dxa"/>
@@ -3388,17 +3355,15 @@
           </w:tcPr>
           <w:p>
             <w:pPr>
-              <w:spacing w:after="40" w:before="40"/>
+              <w:spacing w:before="40" w:after="40"/>
               <w:jc w:val="center"/>
             </w:pPr>
             <w:r>
               <w:rPr>
-                <w:rFonts w:ascii="Calibri" w:hAnsi="Calibri"/>
-                <w:b w:val="0"/>
                 <w:color w:val="000000"/>
                 <w:sz w:val="20"/>
               </w:rPr>
-              <w:t>30.6822%</w:t>
+              <w:t>17.1813%</w:t>
             </w:r>
           </w:p>
         </w:tc>
@@ -3409,14 +3374,14 @@
         </w:trPr>
         <w:tc>
           <w:tcPr>
-            <w:tcW w:type="dxa" w:w="6624"/>
-            <w:shd w:fill="FFFFFF"/>
+            <w:tcW w:w="6624" w:type="dxa"/>
             <w:tcBorders>
-              <w:top w:val="single" w:sz="4" w:color="D9D9D9"/>
-              <w:left w:val="single" w:sz="4" w:color="D9D9D9"/>
-              <w:bottom w:val="single" w:sz="4" w:color="D9D9D9"/>
-              <w:right w:val="single" w:sz="4" w:color="D9D9D9"/>
+              <w:top w:val="single" w:sz="4" w:space="0" w:color="D9D9D9"/>
+              <w:left w:val="single" w:sz="4" w:space="0" w:color="D9D9D9"/>
+              <w:bottom w:val="single" w:sz="4" w:space="0" w:color="D9D9D9"/>
+              <w:right w:val="single" w:sz="4" w:space="0" w:color="D9D9D9"/>
             </w:tcBorders>
+            <w:shd w:val="clear" w:color="auto" w:fill="FFFFFF"/>
             <w:tcMar>
               <w:top w:w="75" w:type="dxa"/>
               <w:left w:w="75" w:type="dxa"/>
@@ -3426,12 +3391,10 @@
           </w:tcPr>
           <w:p>
             <w:pPr>
-              <w:spacing w:after="40" w:before="40"/>
+              <w:spacing w:before="40" w:after="40"/>
             </w:pPr>
             <w:r>
               <w:rPr>
-                <w:rFonts w:ascii="Calibri" w:hAnsi="Calibri"/>
-                <w:b w:val="0"/>
                 <w:color w:val="000000"/>
                 <w:sz w:val="20"/>
               </w:rPr>
@@ -3441,14 +3404,14 @@
         </w:tc>
         <w:tc>
           <w:tcPr>
-            <w:tcW w:type="dxa" w:w="1512"/>
-            <w:shd w:fill="FFFFFF"/>
+            <w:tcW w:w="1512" w:type="dxa"/>
             <w:tcBorders>
-              <w:top w:val="single" w:sz="4" w:color="D9D9D9"/>
-              <w:left w:val="single" w:sz="4" w:color="D9D9D9"/>
-              <w:bottom w:val="single" w:sz="4" w:color="D9D9D9"/>
-              <w:right w:val="single" w:sz="4" w:color="D9D9D9"/>
+              <w:top w:val="single" w:sz="4" w:space="0" w:color="D9D9D9"/>
+              <w:left w:val="single" w:sz="4" w:space="0" w:color="D9D9D9"/>
+              <w:bottom w:val="single" w:sz="4" w:space="0" w:color="D9D9D9"/>
+              <w:right w:val="single" w:sz="4" w:space="0" w:color="D9D9D9"/>
             </w:tcBorders>
+            <w:shd w:val="clear" w:color="auto" w:fill="FFFFFF"/>
             <w:tcMar>
               <w:top w:w="75" w:type="dxa"/>
               <w:left w:w="75" w:type="dxa"/>
@@ -3458,13 +3421,11 @@
           </w:tcPr>
           <w:p>
             <w:pPr>
-              <w:spacing w:after="40" w:before="40"/>
+              <w:spacing w:before="40" w:after="40"/>
               <w:jc w:val="center"/>
             </w:pPr>
             <w:r>
               <w:rPr>
-                <w:rFonts w:ascii="Calibri" w:hAnsi="Calibri"/>
-                <w:b w:val="0"/>
                 <w:color w:val="000000"/>
                 <w:sz w:val="20"/>
               </w:rPr>
@@ -3474,14 +3435,14 @@
         </w:tc>
         <w:tc>
           <w:tcPr>
-            <w:tcW w:type="dxa" w:w="1872"/>
-            <w:shd w:fill="FFFFFF"/>
+            <w:tcW w:w="1872" w:type="dxa"/>
             <w:tcBorders>
-              <w:top w:val="single" w:sz="4" w:color="D9D9D9"/>
-              <w:left w:val="single" w:sz="4" w:color="D9D9D9"/>
-              <w:bottom w:val="single" w:sz="4" w:color="D9D9D9"/>
-              <w:right w:val="single" w:sz="4" w:color="D9D9D9"/>
+              <w:top w:val="single" w:sz="4" w:space="0" w:color="D9D9D9"/>
+              <w:left w:val="single" w:sz="4" w:space="0" w:color="D9D9D9"/>
+              <w:bottom w:val="single" w:sz="4" w:space="0" w:color="D9D9D9"/>
+              <w:right w:val="single" w:sz="4" w:space="0" w:color="D9D9D9"/>
             </w:tcBorders>
+            <w:shd w:val="clear" w:color="auto" w:fill="FFFFFF"/>
             <w:tcMar>
               <w:top w:w="75" w:type="dxa"/>
               <w:left w:w="75" w:type="dxa"/>
@@ -3491,17 +3452,15 @@
           </w:tcPr>
           <w:p>
             <w:pPr>
-              <w:spacing w:after="40" w:before="40"/>
+              <w:spacing w:before="40" w:after="40"/>
               <w:jc w:val="center"/>
             </w:pPr>
             <w:r>
               <w:rPr>
-                <w:rFonts w:ascii="Calibri" w:hAnsi="Calibri"/>
-                <w:b w:val="0"/>
                 <w:color w:val="000000"/>
                 <w:sz w:val="20"/>
               </w:rPr>
-              <w:t>14.8040%</w:t>
+              <w:t>15.2077%</w:t>
             </w:r>
           </w:p>
         </w:tc>
@@ -3512,14 +3471,14 @@
         </w:trPr>
         <w:tc>
           <w:tcPr>
-            <w:tcW w:type="dxa" w:w="6624"/>
-            <w:shd w:fill="F5F7F8"/>
+            <w:tcW w:w="6624" w:type="dxa"/>
             <w:tcBorders>
-              <w:top w:val="single" w:sz="4" w:color="D9D9D9"/>
-              <w:left w:val="single" w:sz="4" w:color="D9D9D9"/>
-              <w:bottom w:val="single" w:sz="4" w:color="D9D9D9"/>
-              <w:right w:val="single" w:sz="4" w:color="D9D9D9"/>
+              <w:top w:val="single" w:sz="4" w:space="0" w:color="D9D9D9"/>
+              <w:left w:val="single" w:sz="4" w:space="0" w:color="D9D9D9"/>
+              <w:bottom w:val="single" w:sz="4" w:space="0" w:color="D9D9D9"/>
+              <w:right w:val="single" w:sz="4" w:space="0" w:color="D9D9D9"/>
             </w:tcBorders>
+            <w:shd w:val="clear" w:color="auto" w:fill="FFFFFF"/>
             <w:tcMar>
               <w:top w:w="75" w:type="dxa"/>
               <w:left w:w="75" w:type="dxa"/>
@@ -3529,29 +3488,27 @@
           </w:tcPr>
           <w:p>
             <w:pPr>
-              <w:spacing w:after="40" w:before="40"/>
+              <w:spacing w:before="40" w:after="40"/>
             </w:pPr>
             <w:r>
               <w:rPr>
-                <w:rFonts w:ascii="Calibri" w:hAnsi="Calibri"/>
-                <w:b w:val="0"/>
                 <w:color w:val="000000"/>
                 <w:sz w:val="20"/>
               </w:rPr>
-              <w:t>Ecology and catch classification support an assumed group assignment</w:t>
+              <w:t>Taxonomy, ecology and group definitions support the eligible group set</w:t>
             </w:r>
           </w:p>
         </w:tc>
         <w:tc>
           <w:tcPr>
-            <w:tcW w:type="dxa" w:w="1512"/>
-            <w:shd w:fill="F5F7F8"/>
+            <w:tcW w:w="1512" w:type="dxa"/>
             <w:tcBorders>
-              <w:top w:val="single" w:sz="4" w:color="D9D9D9"/>
-              <w:left w:val="single" w:sz="4" w:color="D9D9D9"/>
-              <w:bottom w:val="single" w:sz="4" w:color="D9D9D9"/>
-              <w:right w:val="single" w:sz="4" w:color="D9D9D9"/>
+              <w:top w:val="single" w:sz="4" w:space="0" w:color="D9D9D9"/>
+              <w:left w:val="single" w:sz="4" w:space="0" w:color="D9D9D9"/>
+              <w:bottom w:val="single" w:sz="4" w:space="0" w:color="D9D9D9"/>
+              <w:right w:val="single" w:sz="4" w:space="0" w:color="D9D9D9"/>
             </w:tcBorders>
+            <w:shd w:val="clear" w:color="auto" w:fill="FFFFFF"/>
             <w:tcMar>
               <w:top w:w="75" w:type="dxa"/>
               <w:left w:w="75" w:type="dxa"/>
@@ -3561,13 +3518,11 @@
           </w:tcPr>
           <w:p>
             <w:pPr>
-              <w:spacing w:after="40" w:before="40"/>
+              <w:spacing w:before="40" w:after="40"/>
               <w:jc w:val="center"/>
             </w:pPr>
             <w:r>
               <w:rPr>
-                <w:rFonts w:ascii="Calibri" w:hAnsi="Calibri"/>
-                <w:b w:val="0"/>
                 <w:color w:val="000000"/>
                 <w:sz w:val="20"/>
               </w:rPr>
@@ -3577,14 +3532,14 @@
         </w:tc>
         <w:tc>
           <w:tcPr>
-            <w:tcW w:type="dxa" w:w="1872"/>
-            <w:shd w:fill="F5F7F8"/>
+            <w:tcW w:w="1872" w:type="dxa"/>
             <w:tcBorders>
-              <w:top w:val="single" w:sz="4" w:color="D9D9D9"/>
-              <w:left w:val="single" w:sz="4" w:color="D9D9D9"/>
-              <w:bottom w:val="single" w:sz="4" w:color="D9D9D9"/>
-              <w:right w:val="single" w:sz="4" w:color="D9D9D9"/>
+              <w:top w:val="single" w:sz="4" w:space="0" w:color="D9D9D9"/>
+              <w:left w:val="single" w:sz="4" w:space="0" w:color="D9D9D9"/>
+              <w:bottom w:val="single" w:sz="4" w:space="0" w:color="D9D9D9"/>
+              <w:right w:val="single" w:sz="4" w:space="0" w:color="D9D9D9"/>
             </w:tcBorders>
+            <w:shd w:val="clear" w:color="auto" w:fill="FFFFFF"/>
             <w:tcMar>
               <w:top w:w="75" w:type="dxa"/>
               <w:left w:w="75" w:type="dxa"/>
@@ -3594,17 +3549,15 @@
           </w:tcPr>
           <w:p>
             <w:pPr>
-              <w:spacing w:after="40" w:before="40"/>
+              <w:spacing w:before="40" w:after="40"/>
               <w:jc w:val="center"/>
             </w:pPr>
             <w:r>
               <w:rPr>
-                <w:rFonts w:ascii="Calibri" w:hAnsi="Calibri"/>
-                <w:b w:val="0"/>
                 <w:color w:val="000000"/>
                 <w:sz w:val="20"/>
               </w:rPr>
-              <w:t>10.7450%</w:t>
+              <w:t>14.4949%</w:t>
             </w:r>
           </w:p>
         </w:tc>
@@ -3615,14 +3568,14 @@
         </w:trPr>
         <w:tc>
           <w:tcPr>
-            <w:tcW w:type="dxa" w:w="6624"/>
-            <w:shd w:fill="FFFFFF"/>
+            <w:tcW w:w="6624" w:type="dxa"/>
             <w:tcBorders>
-              <w:top w:val="single" w:sz="4" w:color="D9D9D9"/>
-              <w:left w:val="single" w:sz="4" w:color="D9D9D9"/>
-              <w:bottom w:val="single" w:sz="4" w:color="D9D9D9"/>
-              <w:right w:val="single" w:sz="4" w:color="D9D9D9"/>
+              <w:top w:val="single" w:sz="4" w:space="0" w:color="D9D9D9"/>
+              <w:left w:val="single" w:sz="4" w:space="0" w:color="D9D9D9"/>
+              <w:bottom w:val="single" w:sz="4" w:space="0" w:color="D9D9D9"/>
+              <w:right w:val="single" w:sz="4" w:space="0" w:color="D9D9D9"/>
             </w:tcBorders>
+            <w:shd w:val="clear" w:color="auto" w:fill="FFFFFF"/>
             <w:tcMar>
               <w:top w:w="75" w:type="dxa"/>
               <w:left w:w="75" w:type="dxa"/>
@@ -3632,29 +3585,27 @@
           </w:tcPr>
           <w:p>
             <w:pPr>
-              <w:spacing w:after="40" w:before="40"/>
+              <w:spacing w:before="40" w:after="40"/>
             </w:pPr>
             <w:r>
               <w:rPr>
-                <w:rFonts w:ascii="Calibri" w:hAnsi="Calibri"/>
-                <w:b w:val="0"/>
                 <w:color w:val="000000"/>
                 <w:sz w:val="20"/>
               </w:rPr>
-              <w:t>Taxonomy, ecology and model definitions establish an assumed set of eligible groups</w:t>
+              <w:t>A broad catch label is approximated by compatible model groups</w:t>
             </w:r>
           </w:p>
         </w:tc>
         <w:tc>
           <w:tcPr>
-            <w:tcW w:type="dxa" w:w="1512"/>
-            <w:shd w:fill="FFFFFF"/>
+            <w:tcW w:w="1512" w:type="dxa"/>
             <w:tcBorders>
-              <w:top w:val="single" w:sz="4" w:color="D9D9D9"/>
-              <w:left w:val="single" w:sz="4" w:color="D9D9D9"/>
-              <w:bottom w:val="single" w:sz="4" w:color="D9D9D9"/>
-              <w:right w:val="single" w:sz="4" w:color="D9D9D9"/>
+              <w:top w:val="single" w:sz="4" w:space="0" w:color="D9D9D9"/>
+              <w:left w:val="single" w:sz="4" w:space="0" w:color="D9D9D9"/>
+              <w:bottom w:val="single" w:sz="4" w:space="0" w:color="D9D9D9"/>
+              <w:right w:val="single" w:sz="4" w:space="0" w:color="D9D9D9"/>
             </w:tcBorders>
+            <w:shd w:val="clear" w:color="auto" w:fill="FFFFFF"/>
             <w:tcMar>
               <w:top w:w="75" w:type="dxa"/>
               <w:left w:w="75" w:type="dxa"/>
@@ -3664,30 +3615,28 @@
           </w:tcPr>
           <w:p>
             <w:pPr>
-              <w:spacing w:after="40" w:before="40"/>
+              <w:spacing w:before="40" w:after="40"/>
               <w:jc w:val="center"/>
             </w:pPr>
             <w:r>
               <w:rPr>
-                <w:rFonts w:ascii="Calibri" w:hAnsi="Calibri"/>
-                <w:b w:val="0"/>
                 <w:color w:val="000000"/>
                 <w:sz w:val="20"/>
               </w:rPr>
-              <w:t>Medium</w:t>
+              <w:t>Very low</w:t>
             </w:r>
           </w:p>
         </w:tc>
         <w:tc>
           <w:tcPr>
-            <w:tcW w:type="dxa" w:w="1872"/>
-            <w:shd w:fill="FFFFFF"/>
+            <w:tcW w:w="1872" w:type="dxa"/>
             <w:tcBorders>
-              <w:top w:val="single" w:sz="4" w:color="D9D9D9"/>
-              <w:left w:val="single" w:sz="4" w:color="D9D9D9"/>
-              <w:bottom w:val="single" w:sz="4" w:color="D9D9D9"/>
-              <w:right w:val="single" w:sz="4" w:color="D9D9D9"/>
+              <w:top w:val="single" w:sz="4" w:space="0" w:color="D9D9D9"/>
+              <w:left w:val="single" w:sz="4" w:space="0" w:color="D9D9D9"/>
+              <w:bottom w:val="single" w:sz="4" w:space="0" w:color="D9D9D9"/>
+              <w:right w:val="single" w:sz="4" w:space="0" w:color="D9D9D9"/>
             </w:tcBorders>
+            <w:shd w:val="clear" w:color="auto" w:fill="FFFFFF"/>
             <w:tcMar>
               <w:top w:w="75" w:type="dxa"/>
               <w:left w:w="75" w:type="dxa"/>
@@ -3697,17 +3646,15 @@
           </w:tcPr>
           <w:p>
             <w:pPr>
-              <w:spacing w:after="40" w:before="40"/>
+              <w:spacing w:before="40" w:after="40"/>
               <w:jc w:val="center"/>
             </w:pPr>
             <w:r>
               <w:rPr>
-                <w:rFonts w:ascii="Calibri" w:hAnsi="Calibri"/>
-                <w:b w:val="0"/>
                 <w:color w:val="000000"/>
                 <w:sz w:val="20"/>
               </w:rPr>
-              <w:t>8.0236%</w:t>
+              <w:t>4.0110%</w:t>
             </w:r>
           </w:p>
         </w:tc>
@@ -3718,14 +3665,14 @@
         </w:trPr>
         <w:tc>
           <w:tcPr>
-            <w:tcW w:type="dxa" w:w="6624"/>
-            <w:shd w:fill="F5F7F8"/>
+            <w:tcW w:w="6624" w:type="dxa"/>
             <w:tcBorders>
-              <w:top w:val="single" w:sz="4" w:color="D9D9D9"/>
-              <w:left w:val="single" w:sz="4" w:color="D9D9D9"/>
-              <w:bottom w:val="single" w:sz="4" w:color="D9D9D9"/>
-              <w:right w:val="single" w:sz="4" w:color="D9D9D9"/>
+              <w:top w:val="single" w:sz="4" w:space="0" w:color="D9D9D9"/>
+              <w:left w:val="single" w:sz="4" w:space="0" w:color="D9D9D9"/>
+              <w:bottom w:val="single" w:sz="4" w:space="0" w:color="D9D9D9"/>
+              <w:right w:val="single" w:sz="4" w:space="0" w:color="D9D9D9"/>
             </w:tcBorders>
+            <w:shd w:val="clear" w:color="auto" w:fill="FFFFFF"/>
             <w:tcMar>
               <w:top w:w="75" w:type="dxa"/>
               <w:left w:w="75" w:type="dxa"/>
@@ -3735,29 +3682,27 @@
           </w:tcPr>
           <w:p>
             <w:pPr>
-              <w:spacing w:after="40" w:before="40"/>
+              <w:spacing w:before="40" w:after="40"/>
             </w:pPr>
             <w:r>
               <w:rPr>
-                <w:rFonts w:ascii="Calibri" w:hAnsi="Calibri"/>
-                <w:b w:val="0"/>
                 <w:color w:val="000000"/>
                 <w:sz w:val="20"/>
               </w:rPr>
-              <w:t>A broad catch label is approximated by compatible named and residual groups</w:t>
+              <w:t>Documented size and habitat support an ecological assignment</w:t>
             </w:r>
           </w:p>
         </w:tc>
         <w:tc>
           <w:tcPr>
-            <w:tcW w:type="dxa" w:w="1512"/>
-            <w:shd w:fill="F5F7F8"/>
+            <w:tcW w:w="1512" w:type="dxa"/>
             <w:tcBorders>
-              <w:top w:val="single" w:sz="4" w:color="D9D9D9"/>
-              <w:left w:val="single" w:sz="4" w:color="D9D9D9"/>
-              <w:bottom w:val="single" w:sz="4" w:color="D9D9D9"/>
-              <w:right w:val="single" w:sz="4" w:color="D9D9D9"/>
+              <w:top w:val="single" w:sz="4" w:space="0" w:color="D9D9D9"/>
+              <w:left w:val="single" w:sz="4" w:space="0" w:color="D9D9D9"/>
+              <w:bottom w:val="single" w:sz="4" w:space="0" w:color="D9D9D9"/>
+              <w:right w:val="single" w:sz="4" w:space="0" w:color="D9D9D9"/>
             </w:tcBorders>
+            <w:shd w:val="clear" w:color="auto" w:fill="FFFFFF"/>
             <w:tcMar>
               <w:top w:w="75" w:type="dxa"/>
               <w:left w:w="75" w:type="dxa"/>
@@ -3767,30 +3712,28 @@
           </w:tcPr>
           <w:p>
             <w:pPr>
-              <w:spacing w:after="40" w:before="40"/>
+              <w:spacing w:before="40" w:after="40"/>
               <w:jc w:val="center"/>
             </w:pPr>
             <w:r>
               <w:rPr>
-                <w:rFonts w:ascii="Calibri" w:hAnsi="Calibri"/>
-                <w:b w:val="0"/>
                 <w:color w:val="000000"/>
                 <w:sz w:val="20"/>
               </w:rPr>
-              <w:t>Very low</w:t>
+              <w:t>Medium</w:t>
             </w:r>
           </w:p>
         </w:tc>
         <w:tc>
           <w:tcPr>
-            <w:tcW w:type="dxa" w:w="1872"/>
-            <w:shd w:fill="F5F7F8"/>
+            <w:tcW w:w="1872" w:type="dxa"/>
             <w:tcBorders>
-              <w:top w:val="single" w:sz="4" w:color="D9D9D9"/>
-              <w:left w:val="single" w:sz="4" w:color="D9D9D9"/>
-              <w:bottom w:val="single" w:sz="4" w:color="D9D9D9"/>
-              <w:right w:val="single" w:sz="4" w:color="D9D9D9"/>
+              <w:top w:val="single" w:sz="4" w:space="0" w:color="D9D9D9"/>
+              <w:left w:val="single" w:sz="4" w:space="0" w:color="D9D9D9"/>
+              <w:bottom w:val="single" w:sz="4" w:space="0" w:color="D9D9D9"/>
+              <w:right w:val="single" w:sz="4" w:space="0" w:color="D9D9D9"/>
             </w:tcBorders>
+            <w:shd w:val="clear" w:color="auto" w:fill="FFFFFF"/>
             <w:tcMar>
               <w:top w:w="75" w:type="dxa"/>
               <w:left w:w="75" w:type="dxa"/>
@@ -3800,17 +3743,15 @@
           </w:tcPr>
           <w:p>
             <w:pPr>
-              <w:spacing w:after="40" w:before="40"/>
+              <w:spacing w:before="40" w:after="40"/>
               <w:jc w:val="center"/>
             </w:pPr>
             <w:r>
               <w:rPr>
-                <w:rFonts w:ascii="Calibri" w:hAnsi="Calibri"/>
-                <w:b w:val="0"/>
                 <w:color w:val="000000"/>
                 <w:sz w:val="20"/>
               </w:rPr>
-              <w:t>4.0110%</w:t>
+              <w:t>1.1153%</w:t>
             </w:r>
           </w:p>
         </w:tc>
@@ -3821,14 +3762,14 @@
         </w:trPr>
         <w:tc>
           <w:tcPr>
-            <w:tcW w:type="dxa" w:w="6624"/>
-            <w:shd w:fill="FFFFFF"/>
+            <w:tcW w:w="6624" w:type="dxa"/>
             <w:tcBorders>
-              <w:top w:val="single" w:sz="4" w:color="D9D9D9"/>
-              <w:left w:val="single" w:sz="4" w:color="D9D9D9"/>
-              <w:bottom w:val="single" w:sz="4" w:color="D9D9D9"/>
-              <w:right w:val="single" w:sz="4" w:color="D9D9D9"/>
+              <w:top w:val="single" w:sz="4" w:space="0" w:color="D9D9D9"/>
+              <w:left w:val="single" w:sz="4" w:space="0" w:color="D9D9D9"/>
+              <w:bottom w:val="single" w:sz="4" w:space="0" w:color="D9D9D9"/>
+              <w:right w:val="single" w:sz="4" w:space="0" w:color="D9D9D9"/>
             </w:tcBorders>
+            <w:shd w:val="clear" w:color="auto" w:fill="FFFFFF"/>
             <w:tcMar>
               <w:top w:w="75" w:type="dxa"/>
               <w:left w:w="75" w:type="dxa"/>
@@ -3838,29 +3779,27 @@
           </w:tcPr>
           <w:p>
             <w:pPr>
-              <w:spacing w:after="40" w:before="40"/>
+              <w:spacing w:before="40" w:after="40"/>
             </w:pPr>
             <w:r>
               <w:rPr>
-                <w:rFonts w:ascii="Calibri" w:hAnsi="Calibri"/>
-                <w:b w:val="0"/>
                 <w:color w:val="000000"/>
                 <w:sz w:val="20"/>
               </w:rPr>
-              <w:t>The closest represented ecological group is used despite a habitat or source-definition mismatch</w:t>
+              <w:t>The closest represented ecological analogue substitutes for an absent group</w:t>
             </w:r>
           </w:p>
         </w:tc>
         <w:tc>
           <w:tcPr>
-            <w:tcW w:type="dxa" w:w="1512"/>
-            <w:shd w:fill="FFFFFF"/>
+            <w:tcW w:w="1512" w:type="dxa"/>
             <w:tcBorders>
-              <w:top w:val="single" w:sz="4" w:color="D9D9D9"/>
-              <w:left w:val="single" w:sz="4" w:color="D9D9D9"/>
-              <w:bottom w:val="single" w:sz="4" w:color="D9D9D9"/>
-              <w:right w:val="single" w:sz="4" w:color="D9D9D9"/>
+              <w:top w:val="single" w:sz="4" w:space="0" w:color="D9D9D9"/>
+              <w:left w:val="single" w:sz="4" w:space="0" w:color="D9D9D9"/>
+              <w:bottom w:val="single" w:sz="4" w:space="0" w:color="D9D9D9"/>
+              <w:right w:val="single" w:sz="4" w:space="0" w:color="D9D9D9"/>
             </w:tcBorders>
+            <w:shd w:val="clear" w:color="auto" w:fill="FFFFFF"/>
             <w:tcMar>
               <w:top w:w="75" w:type="dxa"/>
               <w:left w:w="75" w:type="dxa"/>
@@ -3870,13 +3809,11 @@
           </w:tcPr>
           <w:p>
             <w:pPr>
-              <w:spacing w:after="40" w:before="40"/>
+              <w:spacing w:before="40" w:after="40"/>
               <w:jc w:val="center"/>
             </w:pPr>
             <w:r>
               <w:rPr>
-                <w:rFonts w:ascii="Calibri" w:hAnsi="Calibri"/>
-                <w:b w:val="0"/>
                 <w:color w:val="000000"/>
                 <w:sz w:val="20"/>
               </w:rPr>
@@ -3886,14 +3823,14 @@
         </w:tc>
         <w:tc>
           <w:tcPr>
-            <w:tcW w:type="dxa" w:w="1872"/>
-            <w:shd w:fill="FFFFFF"/>
+            <w:tcW w:w="1872" w:type="dxa"/>
             <w:tcBorders>
-              <w:top w:val="single" w:sz="4" w:color="D9D9D9"/>
-              <w:left w:val="single" w:sz="4" w:color="D9D9D9"/>
-              <w:bottom w:val="single" w:sz="4" w:color="D9D9D9"/>
-              <w:right w:val="single" w:sz="4" w:color="D9D9D9"/>
+              <w:top w:val="single" w:sz="4" w:space="0" w:color="D9D9D9"/>
+              <w:left w:val="single" w:sz="4" w:space="0" w:color="D9D9D9"/>
+              <w:bottom w:val="single" w:sz="4" w:space="0" w:color="D9D9D9"/>
+              <w:right w:val="single" w:sz="4" w:space="0" w:color="D9D9D9"/>
             </w:tcBorders>
+            <w:shd w:val="clear" w:color="auto" w:fill="FFFFFF"/>
             <w:tcMar>
               <w:top w:w="75" w:type="dxa"/>
               <w:left w:w="75" w:type="dxa"/>
@@ -3903,120 +3840,15 @@
           </w:tcPr>
           <w:p>
             <w:pPr>
-              <w:spacing w:after="40" w:before="40"/>
+              <w:spacing w:before="40" w:after="40"/>
               <w:jc w:val="center"/>
             </w:pPr>
             <w:r>
               <w:rPr>
-                <w:rFonts w:ascii="Calibri" w:hAnsi="Calibri"/>
-                <w:b w:val="0"/>
                 <w:color w:val="000000"/>
                 <w:sz w:val="20"/>
               </w:rPr>
-              <w:t>0.8150%</w:t>
-            </w:r>
-          </w:p>
-        </w:tc>
-      </w:tr>
-      <w:tr>
-        <w:trPr>
-          <w:cantSplit/>
-        </w:trPr>
-        <w:tc>
-          <w:tcPr>
-            <w:tcW w:type="dxa" w:w="6624"/>
-            <w:shd w:fill="F5F7F8"/>
-            <w:tcBorders>
-              <w:top w:val="single" w:sz="4" w:color="D9D9D9"/>
-              <w:left w:val="single" w:sz="4" w:color="D9D9D9"/>
-              <w:bottom w:val="single" w:sz="4" w:color="D9D9D9"/>
-              <w:right w:val="single" w:sz="4" w:color="D9D9D9"/>
-            </w:tcBorders>
-            <w:tcMar>
-              <w:top w:w="75" w:type="dxa"/>
-              <w:left w:w="75" w:type="dxa"/>
-              <w:bottom w:w="75" w:type="dxa"/>
-              <w:right w:w="75" w:type="dxa"/>
-            </w:tcMar>
-          </w:tcPr>
-          <w:p>
-            <w:pPr>
-              <w:spacing w:after="40" w:before="40"/>
-            </w:pPr>
-            <w:r>
-              <w:rPr>
-                <w:rFonts w:ascii="Calibri" w:hAnsi="Calibri"/>
-                <w:b w:val="0"/>
-                <w:color w:val="000000"/>
-                <w:sz w:val="20"/>
-              </w:rPr>
-              <w:t>A verified synonym links the catch taxon to explicit source membership</w:t>
-            </w:r>
-          </w:p>
-        </w:tc>
-        <w:tc>
-          <w:tcPr>
-            <w:tcW w:type="dxa" w:w="1512"/>
-            <w:shd w:fill="F5F7F8"/>
-            <w:tcBorders>
-              <w:top w:val="single" w:sz="4" w:color="D9D9D9"/>
-              <w:left w:val="single" w:sz="4" w:color="D9D9D9"/>
-              <w:bottom w:val="single" w:sz="4" w:color="D9D9D9"/>
-              <w:right w:val="single" w:sz="4" w:color="D9D9D9"/>
-            </w:tcBorders>
-            <w:tcMar>
-              <w:top w:w="75" w:type="dxa"/>
-              <w:left w:w="75" w:type="dxa"/>
-              <w:bottom w:w="75" w:type="dxa"/>
-              <w:right w:w="75" w:type="dxa"/>
-            </w:tcMar>
-          </w:tcPr>
-          <w:p>
-            <w:pPr>
-              <w:spacing w:after="40" w:before="40"/>
-              <w:jc w:val="center"/>
-            </w:pPr>
-            <w:r>
-              <w:rPr>
-                <w:rFonts w:ascii="Calibri" w:hAnsi="Calibri"/>
-                <w:b w:val="0"/>
-                <w:color w:val="000000"/>
-                <w:sz w:val="20"/>
-              </w:rPr>
-              <w:t>High</w:t>
-            </w:r>
-          </w:p>
-        </w:tc>
-        <w:tc>
-          <w:tcPr>
-            <w:tcW w:type="dxa" w:w="1872"/>
-            <w:shd w:fill="F5F7F8"/>
-            <w:tcBorders>
-              <w:top w:val="single" w:sz="4" w:color="D9D9D9"/>
-              <w:left w:val="single" w:sz="4" w:color="D9D9D9"/>
-              <w:bottom w:val="single" w:sz="4" w:color="D9D9D9"/>
-              <w:right w:val="single" w:sz="4" w:color="D9D9D9"/>
-            </w:tcBorders>
-            <w:tcMar>
-              <w:top w:w="75" w:type="dxa"/>
-              <w:left w:w="75" w:type="dxa"/>
-              <w:bottom w:w="75" w:type="dxa"/>
-              <w:right w:w="75" w:type="dxa"/>
-            </w:tcMar>
-          </w:tcPr>
-          <w:p>
-            <w:pPr>
-              <w:spacing w:after="40" w:before="40"/>
-              <w:jc w:val="center"/>
-            </w:pPr>
-            <w:r>
-              <w:rPr>
-                <w:rFonts w:ascii="Calibri" w:hAnsi="Calibri"/>
-                <w:b w:val="0"/>
-                <w:color w:val="000000"/>
-                <w:sz w:val="20"/>
-              </w:rPr>
-              <w:t>0.0230%</w:t>
+              <w:t>0.000025%</w:t>
             </w:r>
           </w:p>
         </w:tc>
@@ -4024,34 +3856,38 @@
     </w:tbl>
     <w:p>
       <w:pPr>
-        <w:keepNext w:val="0"/>
-        <w:pageBreakBefore w:val="0"/>
         <w:spacing w:after="120"/>
       </w:pPr>
       <w:r>
-        <w:rPr>
-          <w:rFonts w:ascii="Calibri" w:hAnsi="Calibri"/>
-          <w:b w:val="0"/>
-          <w:color w:val="000000"/>
-          <w:sz w:val="21"/>
-        </w:rPr>
-      </w:r>
-      <w:r>
         <w:t xml:space="preserve">Membership sources: </w:t>
       </w:r>
-      <w:hyperlink r:id="rIdValidation2">
+      <w:hyperlink r:id="rId30" w:anchor="page=337">
         <w:r>
           <w:rPr>
             <w:color w:val="175E72"/>
             <w:u w:val="single"/>
           </w:rPr>
-          <w:t>Cheung group definitions</w:t>
+          <w:t xml:space="preserve">Cheung group </w:t>
+        </w:r>
+        <w:r>
+          <w:rPr>
+            <w:color w:val="175E72"/>
+            <w:u w:val="single"/>
+          </w:rPr>
+          <w:t>d</w:t>
+        </w:r>
+        <w:r>
+          <w:rPr>
+            <w:color w:val="175E72"/>
+            <w:u w:val="single"/>
+          </w:rPr>
+          <w:t>efinitions</w:t>
         </w:r>
       </w:hyperlink>
       <w:r>
         <w:t xml:space="preserve">; </w:t>
       </w:r>
-      <w:hyperlink r:id="rIdValidation3">
+      <w:hyperlink r:id="rId31">
         <w:r>
           <w:rPr>
             <w:color w:val="175E72"/>
@@ -4072,19 +3908,19 @@
       </w:pPr>
       <w:r>
         <w:rPr>
-          <w:rFonts w:ascii="Calibri" w:hAnsi="Calibri"/>
           <w:b/>
           <w:color w:val="000000"/>
           <w:sz w:val="30"/>
         </w:rPr>
+        <w:lastRenderedPageBreak/>
         <w:t>Allocation and mapping uncertainty</w:t>
       </w:r>
     </w:p>
     <w:tbl>
       <w:tblPr>
-        <w:tblW w:type="auto" w:w="0"/>
+        <w:tblW w:w="0" w:type="auto"/>
         <w:tblLayout w:type="fixed"/>
-        <w:tblLook w:firstColumn="1" w:firstRow="1" w:lastColumn="0" w:lastRow="0" w:noHBand="0" w:noVBand="1" w:val="04A0"/>
+        <w:tblLook w:val="04A0" w:firstRow="1" w:lastRow="0" w:firstColumn="1" w:lastColumn="0" w:noHBand="0" w:noVBand="1"/>
       </w:tblPr>
       <w:tblGrid>
         <w:gridCol w:w="6624"/>
@@ -4093,19 +3929,19 @@
       </w:tblGrid>
       <w:tr>
         <w:trPr>
+          <w:cantSplit/>
           <w:tblHeader/>
-          <w:cantSplit/>
         </w:trPr>
         <w:tc>
           <w:tcPr>
-            <w:tcW w:type="dxa" w:w="6624"/>
-            <w:shd w:fill="DDE9EE"/>
+            <w:tcW w:w="6624" w:type="dxa"/>
             <w:tcBorders>
-              <w:top w:val="single" w:sz="4" w:color="D9D9D9"/>
-              <w:left w:val="single" w:sz="4" w:color="D9D9D9"/>
-              <w:bottom w:val="single" w:sz="4" w:color="D9D9D9"/>
-              <w:right w:val="single" w:sz="4" w:color="D9D9D9"/>
+              <w:top w:val="single" w:sz="4" w:space="0" w:color="D9D9D9"/>
+              <w:left w:val="single" w:sz="4" w:space="0" w:color="D9D9D9"/>
+              <w:bottom w:val="single" w:sz="4" w:space="0" w:color="D9D9D9"/>
+              <w:right w:val="single" w:sz="4" w:space="0" w:color="D9D9D9"/>
             </w:tcBorders>
+            <w:shd w:val="clear" w:color="auto" w:fill="DDE9EE"/>
             <w:tcMar>
               <w:top w:w="75" w:type="dxa"/>
               <w:left w:w="75" w:type="dxa"/>
@@ -4115,11 +3951,10 @@
           </w:tcPr>
           <w:p>
             <w:pPr>
-              <w:spacing w:after="40" w:before="40"/>
+              <w:spacing w:before="40" w:after="40"/>
             </w:pPr>
             <w:r>
               <w:rPr>
-                <w:rFonts w:ascii="Calibri" w:hAnsi="Calibri"/>
                 <w:b/>
                 <w:color w:val="000000"/>
                 <w:sz w:val="20"/>
@@ -4130,14 +3965,14 @@
         </w:tc>
         <w:tc>
           <w:tcPr>
-            <w:tcW w:type="dxa" w:w="1512"/>
-            <w:shd w:fill="DDE9EE"/>
+            <w:tcW w:w="1512" w:type="dxa"/>
             <w:tcBorders>
-              <w:top w:val="single" w:sz="4" w:color="D9D9D9"/>
-              <w:left w:val="single" w:sz="4" w:color="D9D9D9"/>
-              <w:bottom w:val="single" w:sz="4" w:color="D9D9D9"/>
-              <w:right w:val="single" w:sz="4" w:color="D9D9D9"/>
+              <w:top w:val="single" w:sz="4" w:space="0" w:color="D9D9D9"/>
+              <w:left w:val="single" w:sz="4" w:space="0" w:color="D9D9D9"/>
+              <w:bottom w:val="single" w:sz="4" w:space="0" w:color="D9D9D9"/>
+              <w:right w:val="single" w:sz="4" w:space="0" w:color="D9D9D9"/>
             </w:tcBorders>
+            <w:shd w:val="clear" w:color="auto" w:fill="DDE9EE"/>
             <w:tcMar>
               <w:top w:w="75" w:type="dxa"/>
               <w:left w:w="75" w:type="dxa"/>
@@ -4147,12 +3982,11 @@
           </w:tcPr>
           <w:p>
             <w:pPr>
-              <w:spacing w:after="40" w:before="40"/>
+              <w:spacing w:before="40" w:after="40"/>
               <w:jc w:val="center"/>
             </w:pPr>
             <w:r>
               <w:rPr>
-                <w:rFonts w:ascii="Calibri" w:hAnsi="Calibri"/>
                 <w:b/>
                 <w:color w:val="000000"/>
                 <w:sz w:val="20"/>
@@ -4163,14 +3997,14 @@
         </w:tc>
         <w:tc>
           <w:tcPr>
-            <w:tcW w:type="dxa" w:w="1872"/>
-            <w:shd w:fill="DDE9EE"/>
+            <w:tcW w:w="1872" w:type="dxa"/>
             <w:tcBorders>
-              <w:top w:val="single" w:sz="4" w:color="D9D9D9"/>
-              <w:left w:val="single" w:sz="4" w:color="D9D9D9"/>
-              <w:bottom w:val="single" w:sz="4" w:color="D9D9D9"/>
-              <w:right w:val="single" w:sz="4" w:color="D9D9D9"/>
+              <w:top w:val="single" w:sz="4" w:space="0" w:color="D9D9D9"/>
+              <w:left w:val="single" w:sz="4" w:space="0" w:color="D9D9D9"/>
+              <w:bottom w:val="single" w:sz="4" w:space="0" w:color="D9D9D9"/>
+              <w:right w:val="single" w:sz="4" w:space="0" w:color="D9D9D9"/>
             </w:tcBorders>
+            <w:shd w:val="clear" w:color="auto" w:fill="DDE9EE"/>
             <w:tcMar>
               <w:top w:w="75" w:type="dxa"/>
               <w:left w:w="75" w:type="dxa"/>
@@ -4180,12 +4014,11 @@
           </w:tcPr>
           <w:p>
             <w:pPr>
-              <w:spacing w:after="40" w:before="40"/>
+              <w:spacing w:before="40" w:after="40"/>
               <w:jc w:val="center"/>
             </w:pPr>
             <w:r>
               <w:rPr>
-                <w:rFonts w:ascii="Calibri" w:hAnsi="Calibri"/>
                 <w:b/>
                 <w:color w:val="000000"/>
                 <w:sz w:val="20"/>
@@ -4201,14 +4034,14 @@
         </w:trPr>
         <w:tc>
           <w:tcPr>
-            <w:tcW w:type="dxa" w:w="6624"/>
-            <w:shd w:fill="FFFFFF"/>
+            <w:tcW w:w="6624" w:type="dxa"/>
             <w:tcBorders>
-              <w:top w:val="single" w:sz="4" w:color="D9D9D9"/>
-              <w:left w:val="single" w:sz="4" w:color="D9D9D9"/>
-              <w:bottom w:val="single" w:sz="4" w:color="D9D9D9"/>
-              <w:right w:val="single" w:sz="4" w:color="D9D9D9"/>
+              <w:top w:val="single" w:sz="4" w:space="0" w:color="D9D9D9"/>
+              <w:left w:val="single" w:sz="4" w:space="0" w:color="D9D9D9"/>
+              <w:bottom w:val="single" w:sz="4" w:space="0" w:color="D9D9D9"/>
+              <w:right w:val="single" w:sz="4" w:space="0" w:color="D9D9D9"/>
             </w:tcBorders>
+            <w:shd w:val="clear" w:color="auto" w:fill="FFFFFF"/>
             <w:tcMar>
               <w:top w:w="75" w:type="dxa"/>
               <w:left w:w="75" w:type="dxa"/>
@@ -4218,12 +4051,10 @@
           </w:tcPr>
           <w:p>
             <w:pPr>
-              <w:spacing w:after="40" w:before="40"/>
+              <w:spacing w:before="40" w:after="40"/>
             </w:pPr>
             <w:r>
               <w:rPr>
-                <w:rFonts w:ascii="Calibri" w:hAnsi="Calibri"/>
-                <w:b w:val="0"/>
                 <w:color w:val="000000"/>
                 <w:sz w:val="20"/>
               </w:rPr>
@@ -4233,14 +4064,14 @@
         </w:tc>
         <w:tc>
           <w:tcPr>
-            <w:tcW w:type="dxa" w:w="1512"/>
-            <w:shd w:fill="FFFFFF"/>
+            <w:tcW w:w="1512" w:type="dxa"/>
             <w:tcBorders>
-              <w:top w:val="single" w:sz="4" w:color="D9D9D9"/>
-              <w:left w:val="single" w:sz="4" w:color="D9D9D9"/>
-              <w:bottom w:val="single" w:sz="4" w:color="D9D9D9"/>
-              <w:right w:val="single" w:sz="4" w:color="D9D9D9"/>
+              <w:top w:val="single" w:sz="4" w:space="0" w:color="D9D9D9"/>
+              <w:left w:val="single" w:sz="4" w:space="0" w:color="D9D9D9"/>
+              <w:bottom w:val="single" w:sz="4" w:space="0" w:color="D9D9D9"/>
+              <w:right w:val="single" w:sz="4" w:space="0" w:color="D9D9D9"/>
             </w:tcBorders>
+            <w:shd w:val="clear" w:color="auto" w:fill="FFFFFF"/>
             <w:tcMar>
               <w:top w:w="75" w:type="dxa"/>
               <w:left w:w="75" w:type="dxa"/>
@@ -4250,13 +4081,11 @@
           </w:tcPr>
           <w:p>
             <w:pPr>
-              <w:spacing w:after="40" w:before="40"/>
+              <w:spacing w:before="40" w:after="40"/>
               <w:jc w:val="center"/>
             </w:pPr>
             <w:r>
               <w:rPr>
-                <w:rFonts w:ascii="Calibri" w:hAnsi="Calibri"/>
-                <w:b w:val="0"/>
                 <w:color w:val="000000"/>
                 <w:sz w:val="20"/>
               </w:rPr>
@@ -4266,14 +4095,14 @@
         </w:tc>
         <w:tc>
           <w:tcPr>
-            <w:tcW w:type="dxa" w:w="1872"/>
-            <w:shd w:fill="FFFFFF"/>
+            <w:tcW w:w="1872" w:type="dxa"/>
             <w:tcBorders>
-              <w:top w:val="single" w:sz="4" w:color="D9D9D9"/>
-              <w:left w:val="single" w:sz="4" w:color="D9D9D9"/>
-              <w:bottom w:val="single" w:sz="4" w:color="D9D9D9"/>
-              <w:right w:val="single" w:sz="4" w:color="D9D9D9"/>
+              <w:top w:val="single" w:sz="4" w:space="0" w:color="D9D9D9"/>
+              <w:left w:val="single" w:sz="4" w:space="0" w:color="D9D9D9"/>
+              <w:bottom w:val="single" w:sz="4" w:space="0" w:color="D9D9D9"/>
+              <w:right w:val="single" w:sz="4" w:space="0" w:color="D9D9D9"/>
             </w:tcBorders>
+            <w:shd w:val="clear" w:color="auto" w:fill="FFFFFF"/>
             <w:tcMar>
               <w:top w:w="75" w:type="dxa"/>
               <w:left w:w="75" w:type="dxa"/>
@@ -4283,13 +4112,11 @@
           </w:tcPr>
           <w:p>
             <w:pPr>
-              <w:spacing w:after="40" w:before="40"/>
+              <w:spacing w:before="40" w:after="40"/>
               <w:jc w:val="center"/>
             </w:pPr>
             <w:r>
               <w:rPr>
-                <w:rFonts w:ascii="Calibri" w:hAnsi="Calibri"/>
-                <w:b w:val="0"/>
                 <w:color w:val="000000"/>
                 <w:sz w:val="20"/>
               </w:rPr>
@@ -4304,14 +4131,14 @@
         </w:trPr>
         <w:tc>
           <w:tcPr>
-            <w:tcW w:type="dxa" w:w="6624"/>
-            <w:shd w:fill="F5F7F8"/>
+            <w:tcW w:w="6624" w:type="dxa"/>
             <w:tcBorders>
-              <w:top w:val="single" w:sz="4" w:color="D9D9D9"/>
-              <w:left w:val="single" w:sz="4" w:color="D9D9D9"/>
-              <w:bottom w:val="single" w:sz="4" w:color="D9D9D9"/>
-              <w:right w:val="single" w:sz="4" w:color="D9D9D9"/>
+              <w:top w:val="single" w:sz="4" w:space="0" w:color="D9D9D9"/>
+              <w:left w:val="single" w:sz="4" w:space="0" w:color="D9D9D9"/>
+              <w:bottom w:val="single" w:sz="4" w:space="0" w:color="D9D9D9"/>
+              <w:right w:val="single" w:sz="4" w:space="0" w:color="D9D9D9"/>
             </w:tcBorders>
+            <w:shd w:val="clear" w:color="auto" w:fill="FFFFFF"/>
             <w:tcMar>
               <w:top w:w="75" w:type="dxa"/>
               <w:left w:w="75" w:type="dxa"/>
@@ -4321,12 +4148,10 @@
           </w:tcPr>
           <w:p>
             <w:pPr>
-              <w:spacing w:after="40" w:before="40"/>
+              <w:spacing w:before="40" w:after="40"/>
             </w:pPr>
             <w:r>
               <w:rPr>
-                <w:rFonts w:ascii="Calibri" w:hAnsi="Calibri"/>
-                <w:b w:val="0"/>
                 <w:color w:val="000000"/>
                 <w:sz w:val="20"/>
               </w:rPr>
@@ -4336,14 +4161,14 @@
         </w:tc>
         <w:tc>
           <w:tcPr>
-            <w:tcW w:type="dxa" w:w="1512"/>
-            <w:shd w:fill="F5F7F8"/>
+            <w:tcW w:w="1512" w:type="dxa"/>
             <w:tcBorders>
-              <w:top w:val="single" w:sz="4" w:color="D9D9D9"/>
-              <w:left w:val="single" w:sz="4" w:color="D9D9D9"/>
-              <w:bottom w:val="single" w:sz="4" w:color="D9D9D9"/>
-              <w:right w:val="single" w:sz="4" w:color="D9D9D9"/>
+              <w:top w:val="single" w:sz="4" w:space="0" w:color="D9D9D9"/>
+              <w:left w:val="single" w:sz="4" w:space="0" w:color="D9D9D9"/>
+              <w:bottom w:val="single" w:sz="4" w:space="0" w:color="D9D9D9"/>
+              <w:right w:val="single" w:sz="4" w:space="0" w:color="D9D9D9"/>
             </w:tcBorders>
+            <w:shd w:val="clear" w:color="auto" w:fill="FFFFFF"/>
             <w:tcMar>
               <w:top w:w="75" w:type="dxa"/>
               <w:left w:w="75" w:type="dxa"/>
@@ -4353,13 +4178,11 @@
           </w:tcPr>
           <w:p>
             <w:pPr>
-              <w:spacing w:after="40" w:before="40"/>
+              <w:spacing w:before="40" w:after="40"/>
               <w:jc w:val="center"/>
             </w:pPr>
             <w:r>
               <w:rPr>
-                <w:rFonts w:ascii="Calibri" w:hAnsi="Calibri"/>
-                <w:b w:val="0"/>
                 <w:color w:val="000000"/>
                 <w:sz w:val="20"/>
               </w:rPr>
@@ -4369,14 +4192,14 @@
         </w:tc>
         <w:tc>
           <w:tcPr>
-            <w:tcW w:type="dxa" w:w="1872"/>
-            <w:shd w:fill="F5F7F8"/>
+            <w:tcW w:w="1872" w:type="dxa"/>
             <w:tcBorders>
-              <w:top w:val="single" w:sz="4" w:color="D9D9D9"/>
-              <w:left w:val="single" w:sz="4" w:color="D9D9D9"/>
-              <w:bottom w:val="single" w:sz="4" w:color="D9D9D9"/>
-              <w:right w:val="single" w:sz="4" w:color="D9D9D9"/>
+              <w:top w:val="single" w:sz="4" w:space="0" w:color="D9D9D9"/>
+              <w:left w:val="single" w:sz="4" w:space="0" w:color="D9D9D9"/>
+              <w:bottom w:val="single" w:sz="4" w:space="0" w:color="D9D9D9"/>
+              <w:right w:val="single" w:sz="4" w:space="0" w:color="D9D9D9"/>
             </w:tcBorders>
+            <w:shd w:val="clear" w:color="auto" w:fill="FFFFFF"/>
             <w:tcMar>
               <w:top w:w="75" w:type="dxa"/>
               <w:left w:w="75" w:type="dxa"/>
@@ -4386,13 +4209,11 @@
           </w:tcPr>
           <w:p>
             <w:pPr>
-              <w:spacing w:after="40" w:before="40"/>
+              <w:spacing w:before="40" w:after="40"/>
               <w:jc w:val="center"/>
             </w:pPr>
             <w:r>
               <w:rPr>
-                <w:rFonts w:ascii="Calibri" w:hAnsi="Calibri"/>
-                <w:b w:val="0"/>
                 <w:color w:val="000000"/>
                 <w:sz w:val="20"/>
               </w:rPr>
@@ -4404,45 +4225,35 @@
     </w:tbl>
     <w:p>
       <w:pPr>
-        <w:keepNext w:val="0"/>
-        <w:pageBreakBefore w:val="0"/>
         <w:spacing w:after="120"/>
       </w:pPr>
       <w:r>
         <w:rPr>
-          <w:rFonts w:ascii="Calibri" w:hAnsi="Calibri"/>
-          <w:b w:val="0"/>
           <w:color w:val="000000"/>
           <w:sz w:val="21"/>
         </w:rPr>
-        <w:t>Each percentage is the known simple-chain PPR associated with taxa using that rule. Ecopath allocation weights do not create classic PPR. The allocation and group-assignment tables are separate descriptions of the same taxa.</w:t>
+        <w:t xml:space="preserve">Each percentage is the simple-chain PPR associated with taxa using that rule.</w:t>
       </w:r>
     </w:p>
     <w:p>
       <w:pPr>
-        <w:keepNext w:val="0"/>
-        <w:pageBreakBefore w:val="0"/>
         <w:spacing w:after="120"/>
       </w:pPr>
       <w:r>
         <w:rPr>
-          <w:rFonts w:ascii="Calibri" w:hAnsi="Calibri"/>
-          <w:b w:val="0"/>
           <w:color w:val="000000"/>
           <w:sz w:val="21"/>
         </w:rPr>
-        <w:t>All 374 catch taxa have an assigned group: 100% of 2019 landings and known simple-chain PPR are mapped. Unresolved taxa: none. This includes 20 Very low assignments covering 12.5661% of landings and 4.8260% of known simple-chain PPR; their exact taxa, weights and reasons are flagged in the Excel appendix.</w:t>
+        <w:t>All 374 catch taxa have an assigned group: 100% of 2019 landings and simple-chain PPR are mapped. Unresolved taxa: none. This includes 10 Very low assignments covering 12.2032% of landings and 4.0110% of simple-chain PPR; their taxa, weights and reasons are flagged in the Excel appendix.</w:t>
       </w:r>
     </w:p>
     <w:p>
       <w:pPr>
         <w:keepNext/>
-        <w:pageBreakBefore w:val="0"/>
         <w:spacing w:after="120"/>
       </w:pPr>
       <w:r>
         <w:rPr>
-          <w:rFonts w:ascii="Calibri" w:hAnsi="Calibri"/>
           <w:b/>
           <w:color w:val="000000"/>
           <w:sz w:val="23"/>
@@ -4452,9 +4263,9 @@
     </w:p>
     <w:tbl>
       <w:tblPr>
-        <w:tblW w:type="auto" w:w="0"/>
+        <w:tblW w:w="0" w:type="auto"/>
         <w:tblLayout w:type="fixed"/>
-        <w:tblLook w:firstColumn="1" w:firstRow="1" w:lastColumn="0" w:lastRow="0" w:noHBand="0" w:noVBand="1" w:val="04A0"/>
+        <w:tblLook w:val="04A0" w:firstRow="1" w:lastRow="0" w:firstColumn="1" w:lastColumn="0" w:noHBand="0" w:noVBand="1"/>
       </w:tblPr>
       <w:tblGrid>
         <w:gridCol w:w="4608"/>
@@ -4462,19 +4273,19 @@
       </w:tblGrid>
       <w:tr>
         <w:trPr>
+          <w:cantSplit/>
           <w:tblHeader/>
-          <w:cantSplit/>
         </w:trPr>
         <w:tc>
           <w:tcPr>
-            <w:tcW w:type="dxa" w:w="4608"/>
-            <w:shd w:fill="DDE9EE"/>
+            <w:tcW w:w="4608" w:type="dxa"/>
             <w:tcBorders>
-              <w:top w:val="single" w:sz="4" w:color="D9D9D9"/>
-              <w:left w:val="single" w:sz="4" w:color="D9D9D9"/>
-              <w:bottom w:val="single" w:sz="4" w:color="D9D9D9"/>
-              <w:right w:val="single" w:sz="4" w:color="D9D9D9"/>
+              <w:top w:val="single" w:sz="4" w:space="0" w:color="D9D9D9"/>
+              <w:left w:val="single" w:sz="4" w:space="0" w:color="D9D9D9"/>
+              <w:bottom w:val="single" w:sz="4" w:space="0" w:color="D9D9D9"/>
+              <w:right w:val="single" w:sz="4" w:space="0" w:color="D9D9D9"/>
             </w:tcBorders>
+            <w:shd w:val="clear" w:color="auto" w:fill="DDE9EE"/>
             <w:tcMar>
               <w:top w:w="75" w:type="dxa"/>
               <w:left w:w="75" w:type="dxa"/>
@@ -4484,11 +4295,10 @@
           </w:tcPr>
           <w:p>
             <w:pPr>
-              <w:spacing w:after="40" w:before="40"/>
+              <w:spacing w:before="40" w:after="40"/>
             </w:pPr>
             <w:r>
               <w:rPr>
-                <w:rFonts w:ascii="Calibri" w:hAnsi="Calibri"/>
                 <w:b/>
                 <w:color w:val="000000"/>
                 <w:sz w:val="20"/>
@@ -4499,14 +4309,14 @@
         </w:tc>
         <w:tc>
           <w:tcPr>
-            <w:tcW w:type="dxa" w:w="5400"/>
-            <w:shd w:fill="DDE9EE"/>
+            <w:tcW w:w="5400" w:type="dxa"/>
             <w:tcBorders>
-              <w:top w:val="single" w:sz="4" w:color="D9D9D9"/>
-              <w:left w:val="single" w:sz="4" w:color="D9D9D9"/>
-              <w:bottom w:val="single" w:sz="4" w:color="D9D9D9"/>
-              <w:right w:val="single" w:sz="4" w:color="D9D9D9"/>
+              <w:top w:val="single" w:sz="4" w:space="0" w:color="D9D9D9"/>
+              <w:left w:val="single" w:sz="4" w:space="0" w:color="D9D9D9"/>
+              <w:bottom w:val="single" w:sz="4" w:space="0" w:color="D9D9D9"/>
+              <w:right w:val="single" w:sz="4" w:space="0" w:color="D9D9D9"/>
             </w:tcBorders>
+            <w:shd w:val="clear" w:color="auto" w:fill="DDE9EE"/>
             <w:tcMar>
               <w:top w:w="75" w:type="dxa"/>
               <w:left w:w="75" w:type="dxa"/>
@@ -4516,12 +4326,11 @@
           </w:tcPr>
           <w:p>
             <w:pPr>
-              <w:spacing w:after="40" w:before="40"/>
+              <w:spacing w:before="40" w:after="40"/>
               <w:jc w:val="center"/>
             </w:pPr>
             <w:r>
               <w:rPr>
-                <w:rFonts w:ascii="Calibri" w:hAnsi="Calibri"/>
                 <w:b/>
                 <w:color w:val="000000"/>
                 <w:sz w:val="20"/>
@@ -4537,14 +4346,14 @@
         </w:trPr>
         <w:tc>
           <w:tcPr>
-            <w:tcW w:type="dxa" w:w="4608"/>
-            <w:shd w:fill="FFFFFF"/>
+            <w:tcW w:w="4608" w:type="dxa"/>
             <w:tcBorders>
-              <w:top w:val="single" w:sz="4" w:color="D9D9D9"/>
-              <w:left w:val="single" w:sz="4" w:color="D9D9D9"/>
-              <w:bottom w:val="single" w:sz="4" w:color="D9D9D9"/>
-              <w:right w:val="single" w:sz="4" w:color="D9D9D9"/>
+              <w:top w:val="single" w:sz="4" w:space="0" w:color="D9D9D9"/>
+              <w:left w:val="single" w:sz="4" w:space="0" w:color="D9D9D9"/>
+              <w:bottom w:val="single" w:sz="4" w:space="0" w:color="D9D9D9"/>
+              <w:right w:val="single" w:sz="4" w:space="0" w:color="D9D9D9"/>
             </w:tcBorders>
+            <w:shd w:val="clear" w:color="auto" w:fill="FFFFFF"/>
             <w:tcMar>
               <w:top w:w="75" w:type="dxa"/>
               <w:left w:w="75" w:type="dxa"/>
@@ -4554,29 +4363,27 @@
           </w:tcPr>
           <w:p>
             <w:pPr>
-              <w:spacing w:after="40" w:before="40"/>
+              <w:spacing w:before="40" w:after="40"/>
             </w:pPr>
             <w:r>
               <w:rPr>
-                <w:rFonts w:ascii="Calibri" w:hAnsi="Calibri"/>
-                <w:b w:val="0"/>
                 <w:color w:val="000000"/>
                 <w:sz w:val="20"/>
               </w:rPr>
-              <w:t>Unidentified marine fish, finfish, groundfish and pelagic fish; Perciformes; Chondrichthyes (6 taxa)</w:t>
+              <w:t>Marine fishes not identified; Perciformes; Marine finfishes not identified; Chondrichthyes; Miscellaneous aquatic invertebrates; Marine groundfishes not identified; Marine pelagic fishes not identified; Gadiformes</w:t>
             </w:r>
           </w:p>
         </w:tc>
         <w:tc>
           <w:tcPr>
-            <w:tcW w:type="dxa" w:w="5400"/>
-            <w:shd w:fill="FFFFFF"/>
+            <w:tcW w:w="5400" w:type="dxa"/>
             <w:tcBorders>
-              <w:top w:val="single" w:sz="4" w:color="D9D9D9"/>
-              <w:left w:val="single" w:sz="4" w:color="D9D9D9"/>
-              <w:bottom w:val="single" w:sz="4" w:color="D9D9D9"/>
-              <w:right w:val="single" w:sz="4" w:color="D9D9D9"/>
+              <w:top w:val="single" w:sz="4" w:space="0" w:color="D9D9D9"/>
+              <w:left w:val="single" w:sz="4" w:space="0" w:color="D9D9D9"/>
+              <w:bottom w:val="single" w:sz="4" w:space="0" w:color="D9D9D9"/>
+              <w:right w:val="single" w:sz="4" w:space="0" w:color="D9D9D9"/>
             </w:tcBorders>
+            <w:shd w:val="clear" w:color="auto" w:fill="FFFFFF"/>
             <w:tcMar>
               <w:top w:w="75" w:type="dxa"/>
               <w:left w:w="75" w:type="dxa"/>
@@ -4586,17 +4393,15 @@
           </w:tcPr>
           <w:p>
             <w:pPr>
-              <w:spacing w:after="40" w:before="40"/>
+              <w:spacing w:before="40" w:after="40"/>
               <w:jc w:val="center"/>
             </w:pPr>
             <w:r>
               <w:rPr>
-                <w:rFonts w:ascii="Calibri" w:hAnsi="Calibri"/>
-                <w:b w:val="0"/>
                 <w:color w:val="000000"/>
                 <w:sz w:val="20"/>
               </w:rPr>
-              <w:t>Unknown species mixtures are approximated by compatible named and residual fish pools. Any chimaera component uses shark/ray analogues.</w:t>
+              <w:t>Catch composition is unknown; compatible named and residual pools provide a broad approximation. Exact candidates and assumptions are in the appendix.</w:t>
             </w:r>
           </w:p>
         </w:tc>
@@ -4607,14 +4412,14 @@
         </w:trPr>
         <w:tc>
           <w:tcPr>
-            <w:tcW w:type="dxa" w:w="4608"/>
-            <w:shd w:fill="F5F7F8"/>
+            <w:tcW w:w="4608" w:type="dxa"/>
             <w:tcBorders>
-              <w:top w:val="single" w:sz="4" w:color="D9D9D9"/>
-              <w:left w:val="single" w:sz="4" w:color="D9D9D9"/>
-              <w:bottom w:val="single" w:sz="4" w:color="D9D9D9"/>
-              <w:right w:val="single" w:sz="4" w:color="D9D9D9"/>
+              <w:top w:val="single" w:sz="4" w:space="0" w:color="D9D9D9"/>
+              <w:left w:val="single" w:sz="4" w:space="0" w:color="D9D9D9"/>
+              <w:bottom w:val="single" w:sz="4" w:space="0" w:color="D9D9D9"/>
+              <w:right w:val="single" w:sz="4" w:space="0" w:color="D9D9D9"/>
             </w:tcBorders>
+            <w:shd w:val="clear" w:color="auto" w:fill="FFFFFF"/>
             <w:tcMar>
               <w:top w:w="75" w:type="dxa"/>
               <w:left w:w="75" w:type="dxa"/>
@@ -4624,29 +4429,27 @@
           </w:tcPr>
           <w:p>
             <w:pPr>
-              <w:spacing w:after="40" w:before="40"/>
+              <w:spacing w:before="40" w:after="40"/>
             </w:pPr>
             <w:r>
               <w:rPr>
-                <w:rFonts w:ascii="Calibri" w:hAnsi="Calibri"/>
-                <w:b w:val="0"/>
                 <w:color w:val="000000"/>
                 <w:sz w:val="20"/>
               </w:rPr>
-              <w:t>Miscellaneous aquatic invertebrates (1 taxon)</w:t>
+              <w:t>Lampris guttatus</w:t>
             </w:r>
           </w:p>
         </w:tc>
         <w:tc>
           <w:tcPr>
-            <w:tcW w:type="dxa" w:w="5400"/>
-            <w:shd w:fill="F5F7F8"/>
+            <w:tcW w:w="5400" w:type="dxa"/>
             <w:tcBorders>
-              <w:top w:val="single" w:sz="4" w:color="D9D9D9"/>
-              <w:left w:val="single" w:sz="4" w:color="D9D9D9"/>
-              <w:bottom w:val="single" w:sz="4" w:color="D9D9D9"/>
-              <w:right w:val="single" w:sz="4" w:color="D9D9D9"/>
+              <w:top w:val="single" w:sz="4" w:space="0" w:color="D9D9D9"/>
+              <w:left w:val="single" w:sz="4" w:space="0" w:color="D9D9D9"/>
+              <w:bottom w:val="single" w:sz="4" w:space="0" w:color="D9D9D9"/>
+              <w:right w:val="single" w:sz="4" w:space="0" w:color="D9D9D9"/>
             </w:tcBorders>
+            <w:shd w:val="clear" w:color="auto" w:fill="FFFFFF"/>
             <w:tcMar>
               <w:top w:w="75" w:type="dxa"/>
               <w:left w:w="75" w:type="dxa"/>
@@ -4656,17 +4459,15 @@
           </w:tcPr>
           <w:p>
             <w:pPr>
-              <w:spacing w:after="40" w:before="40"/>
+              <w:spacing w:before="40" w:after="40"/>
               <w:jc w:val="center"/>
             </w:pPr>
             <w:r>
               <w:rPr>
-                <w:rFonts w:ascii="Calibri" w:hAnsi="Calibri"/>
-                <w:b w:val="0"/>
                 <w:color w:val="000000"/>
                 <w:sz w:val="20"/>
               </w:rPr>
-              <w:t>Demersal invertebrate pools approximate an unknown mixture; cephalopod habitat is mixed.</w:t>
+              <w:t>The historical opah label represents offshore deep-living fishes and a subsequently divided species complex. The adopted shelf large-pelagic pair remains a closest represented analogue without an established link to the source guild's sampled assemblage.</w:t>
             </w:r>
           </w:p>
         </w:tc>
@@ -4677,14 +4478,14 @@
         </w:trPr>
         <w:tc>
           <w:tcPr>
-            <w:tcW w:type="dxa" w:w="4608"/>
-            <w:shd w:fill="FFFFFF"/>
+            <w:tcW w:w="4608" w:type="dxa"/>
             <w:tcBorders>
-              <w:top w:val="single" w:sz="4" w:color="D9D9D9"/>
-              <w:left w:val="single" w:sz="4" w:color="D9D9D9"/>
-              <w:bottom w:val="single" w:sz="4" w:color="D9D9D9"/>
-              <w:right w:val="single" w:sz="4" w:color="D9D9D9"/>
+              <w:top w:val="single" w:sz="4" w:space="0" w:color="D9D9D9"/>
+              <w:left w:val="single" w:sz="4" w:space="0" w:color="D9D9D9"/>
+              <w:bottom w:val="single" w:sz="4" w:space="0" w:color="D9D9D9"/>
+              <w:right w:val="single" w:sz="4" w:space="0" w:color="D9D9D9"/>
             </w:tcBorders>
+            <w:shd w:val="clear" w:color="auto" w:fill="FFFFFF"/>
             <w:tcMar>
               <w:top w:w="75" w:type="dxa"/>
               <w:left w:w="75" w:type="dxa"/>
@@ -4694,29 +4495,27 @@
           </w:tcPr>
           <w:p>
             <w:pPr>
-              <w:spacing w:after="40" w:before="40"/>
+              <w:spacing w:before="40" w:after="40"/>
             </w:pPr>
             <w:r>
               <w:rPr>
-                <w:rFonts w:ascii="Calibri" w:hAnsi="Calibri"/>
-                <w:b w:val="0"/>
                 <w:color w:val="000000"/>
                 <w:sz w:val="20"/>
               </w:rPr>
-              <w:t>Billfishes (9 taxa); Lampris guttatus; Lepidocybium flavobrunneum (11 taxa)</w:t>
+              <w:t>Lepidocybium flavobrunneum</w:t>
             </w:r>
           </w:p>
         </w:tc>
         <w:tc>
           <w:tcPr>
-            <w:tcW w:type="dxa" w:w="5400"/>
-            <w:shd w:fill="FFFFFF"/>
+            <w:tcW w:w="5400" w:type="dxa"/>
             <w:tcBorders>
-              <w:top w:val="single" w:sz="4" w:color="D9D9D9"/>
-              <w:left w:val="single" w:sz="4" w:color="D9D9D9"/>
-              <w:bottom w:val="single" w:sz="4" w:color="D9D9D9"/>
-              <w:right w:val="single" w:sz="4" w:color="D9D9D9"/>
+              <w:top w:val="single" w:sz="4" w:space="0" w:color="D9D9D9"/>
+              <w:left w:val="single" w:sz="4" w:space="0" w:color="D9D9D9"/>
+              <w:bottom w:val="single" w:sz="4" w:space="0" w:color="D9D9D9"/>
+              <w:right w:val="single" w:sz="4" w:space="0" w:color="D9D9D9"/>
             </w:tcBorders>
+            <w:shd w:val="clear" w:color="auto" w:fill="FFFFFF"/>
             <w:tcMar>
               <w:top w:w="75" w:type="dxa"/>
               <w:left w:w="75" w:type="dxa"/>
@@ -4726,87 +4525,15 @@
           </w:tcPr>
           <w:p>
             <w:pPr>
-              <w:spacing w:after="40" w:before="40"/>
+              <w:spacing w:before="40" w:after="40"/>
               <w:jc w:val="center"/>
             </w:pPr>
             <w:r>
               <w:rPr>
-                <w:rFonts w:ascii="Calibri" w:hAnsi="Calibri"/>
-                <w:b w:val="0"/>
                 <w:color w:val="000000"/>
                 <w:sz w:val="20"/>
               </w:rPr>
-              <w:t>Large pelagic groups substitute for absent oceanic/deep-water compartments; source stage boundaries are weak transfers.</w:t>
-            </w:r>
-          </w:p>
-        </w:tc>
-      </w:tr>
-      <w:tr>
-        <w:trPr>
-          <w:cantSplit/>
-        </w:trPr>
-        <w:tc>
-          <w:tcPr>
-            <w:tcW w:type="dxa" w:w="4608"/>
-            <w:shd w:fill="F5F7F8"/>
-            <w:tcBorders>
-              <w:top w:val="single" w:sz="4" w:color="D9D9D9"/>
-              <w:left w:val="single" w:sz="4" w:color="D9D9D9"/>
-              <w:bottom w:val="single" w:sz="4" w:color="D9D9D9"/>
-              <w:right w:val="single" w:sz="4" w:color="D9D9D9"/>
-            </w:tcBorders>
-            <w:tcMar>
-              <w:top w:w="75" w:type="dxa"/>
-              <w:left w:w="75" w:type="dxa"/>
-              <w:bottom w:w="75" w:type="dxa"/>
-              <w:right w:w="75" w:type="dxa"/>
-            </w:tcMar>
-          </w:tcPr>
-          <w:p>
-            <w:pPr>
-              <w:spacing w:after="40" w:before="40"/>
-            </w:pPr>
-            <w:r>
-              <w:rPr>
-                <w:rFonts w:ascii="Calibri" w:hAnsi="Calibri"/>
-                <w:b w:val="0"/>
-                <w:color w:val="000000"/>
-                <w:sz w:val="20"/>
-              </w:rPr>
-              <w:t>Ruvettus pretiosus; Gadiformes (2 taxa)</w:t>
-            </w:r>
-          </w:p>
-        </w:tc>
-        <w:tc>
-          <w:tcPr>
-            <w:tcW w:type="dxa" w:w="5400"/>
-            <w:shd w:fill="F5F7F8"/>
-            <w:tcBorders>
-              <w:top w:val="single" w:sz="4" w:color="D9D9D9"/>
-              <w:left w:val="single" w:sz="4" w:color="D9D9D9"/>
-              <w:bottom w:val="single" w:sz="4" w:color="D9D9D9"/>
-              <w:right w:val="single" w:sz="4" w:color="D9D9D9"/>
-            </w:tcBorders>
-            <w:tcMar>
-              <w:top w:w="75" w:type="dxa"/>
-              <w:left w:w="75" w:type="dxa"/>
-              <w:bottom w:w="75" w:type="dxa"/>
-              <w:right w:w="75" w:type="dxa"/>
-            </w:tcMar>
-          </w:tcPr>
-          <w:p>
-            <w:pPr>
-              <w:spacing w:after="40" w:before="40"/>
-              <w:jc w:val="center"/>
-            </w:pPr>
-            <w:r>
-              <w:rPr>
-                <w:rFonts w:ascii="Calibri" w:hAnsi="Calibri"/>
-                <w:b w:val="0"/>
-                <w:color w:val="000000"/>
-                <w:sz w:val="20"/>
-              </w:rPr>
-              <w:t>The single benthopelagic pool is a habitat analogue; depth and source pool aggregation remain uncertain.</w:t>
+              <w:t>Escolar is principally a continental-slope fish below 200 m with upward night movements. The adopted shelf large-pelagic pair remains a weak analogue; a competing benthopelagic interpretation and the missing deep-water compartment are unresolved.</w:t>
             </w:r>
           </w:p>
         </w:tc>
@@ -4814,38 +4541,24 @@
     </w:tbl>
     <w:p>
       <w:pPr>
-        <w:keepNext w:val="0"/>
-        <w:pageBreakBefore w:val="0"/>
         <w:spacing w:after="120"/>
       </w:pPr>
       <w:r>
         <w:rPr>
-          <w:rFonts w:ascii="Calibri" w:hAnsi="Calibri"/>
-          <w:b w:val="0"/>
           <w:color w:val="000000"/>
           <w:sz w:val="21"/>
         </w:rPr>
-        <w:t>Whole model-pool catch proportions are assumed representative of regional taxon catches across 1950–2019 and all catch bases. These are not observed target-catch mixtures. Another 108 taxa retain Low confidence because of membership or stage-definition limitations.</w:t>
+        <w:t>Whole model-pool catch proportions are assumed representative of regional taxon catches across 1950–2019 and all catch bases. These are not observed target-catch mixtures. Another 89 taxa retain Low confidence because of size, habitat or source-group ambiguity.</w:t>
       </w:r>
     </w:p>
     <w:p>
       <w:pPr>
-        <w:keepNext w:val="0"/>
-        <w:pageBreakBefore w:val="0"/>
         <w:spacing w:after="120"/>
       </w:pPr>
       <w:r>
-        <w:rPr>
-          <w:rFonts w:ascii="Calibri" w:hAnsi="Calibri"/>
-          <w:b w:val="0"/>
-          <w:color w:val="000000"/>
-          <w:sz w:val="21"/>
-        </w:rPr>
-      </w:r>
-      <w:r>
         <w:t xml:space="preserve">Allocation sources: </w:t>
       </w:r>
-      <w:hyperlink r:id="rIdValidation4">
+      <w:hyperlink r:id="rId32">
         <w:r>
           <w:rPr>
             <w:color w:val="175E72"/>
@@ -4857,7 +4570,7 @@
       <w:r>
         <w:t xml:space="preserve">; </w:t>
       </w:r>
-      <w:hyperlink r:id="rIdValidation5">
+      <w:hyperlink r:id="rId33">
         <w:r>
           <w:rPr>
             <w:color w:val="175E72"/>
@@ -4872,14 +4585,10 @@
     </w:p>
     <w:p>
       <w:pPr>
-        <w:keepNext w:val="0"/>
-        <w:pageBreakBefore w:val="0"/>
         <w:spacing w:after="120"/>
       </w:pPr>
       <w:r>
         <w:rPr>
-          <w:rFonts w:ascii="Calibri" w:hAnsi="Calibri"/>
-          <w:b w:val="0"/>
           <w:color w:val="000000"/>
           <w:sz w:val="21"/>
         </w:rPr>
@@ -4899,11 +4608,10 @@
     <w:p>
       <w:r>
         <w:rPr>
-          <w:rFonts w:ascii="Calibri" w:hAnsi="Calibri"/>
+          <w:color w:val="000000"/>
           <w:sz w:val="21"/>
-          <w:color w:val="000000"/>
         </w:rPr>
-        <w:t xml:space="preserve">R is LME036; S is the northern shelf coast-to-broken-line area in Cheung Figure 6.1. The grid and shared coastal landmarks support the approximate ranges above.</w:t>
+        <w:t>R is LME036; S is the northern shelf coast-to-broken-line area in Cheung Figure 6.1. The grid and shared coastal landmarks support the approximate ranges above.</w:t>
       </w:r>
     </w:p>
     <w:p>
@@ -5010,7 +4718,7 @@
                           <pic:cNvPicPr/>
                         </pic:nvPicPr>
                         <pic:blipFill>
-                          <a:blip r:embed="rId30"/>
+                          <a:blip r:embed="rId34"/>
                           <a:stretch>
                             <a:fillRect/>
                           </a:stretch>
@@ -5038,7 +4746,7 @@
       <w:r>
         <w:t xml:space="preserve">LME_036 South China Sea (R). Retained researcher figure drawn from </w:t>
       </w:r>
-      <w:hyperlink r:id="rId31">
+      <w:hyperlink r:id="rId35">
         <w:r>
           <w:rPr>
             <w:color w:val="0563C1"/>
@@ -5050,7 +4758,7 @@
       <w:r>
         <w:t xml:space="preserve">; dataset release/date not recorded. </w:t>
       </w:r>
-      <w:hyperlink r:id="rId32">
+      <w:hyperlink r:id="rId36">
         <w:r>
           <w:rPr>
             <w:color w:val="0563C1"/>
@@ -5062,7 +4770,7 @@
       <w:r>
         <w:t xml:space="preserve"> | </w:t>
       </w:r>
-      <w:hyperlink r:id="rId33">
+      <w:hyperlink r:id="rId37">
         <w:r>
           <w:rPr>
             <w:color w:val="0563C1"/>
@@ -5181,7 +4889,7 @@
                           <pic:cNvPicPr/>
                         </pic:nvPicPr>
                         <pic:blipFill>
-                          <a:blip r:embed="rId34"/>
+                          <a:blip r:embed="rId38"/>
                           <a:stretch>
                             <a:fillRect/>
                           </a:stretch>
@@ -5209,7 +4917,7 @@
       <w:r>
         <w:t xml:space="preserve">Cheung (2007), Figure 6.1, printed p.170 / PDF p.185. Northern South China Sea shelf (S), 2000s selected model; coast to broken line. </w:t>
       </w:r>
-      <w:hyperlink r:id="rId35" w:anchor="page%3D185">
+      <w:hyperlink r:id="rId39" w:anchor="page%3D185">
         <w:r>
           <w:rPr>
             <w:color w:val="0563C1"/>
@@ -5221,7 +4929,7 @@
       <w:r>
         <w:t xml:space="preserve"> | </w:t>
       </w:r>
-      <w:hyperlink r:id="rId36">
+      <w:hyperlink r:id="rId40">
         <w:r>
           <w:rPr>
             <w:color w:val="0563C1"/>
@@ -5233,7 +4941,7 @@
       <w:r>
         <w:t xml:space="preserve"> | </w:t>
       </w:r>
-      <w:hyperlink r:id="rId37">
+      <w:hyperlink r:id="rId41">
         <w:r>
           <w:rPr>
             <w:color w:val="0563C1"/>
@@ -5249,11 +4957,10 @@
     <w:p>
       <w:r>
         <w:rPr>
-          <w:rFonts w:ascii="Calibri" w:hAnsi="Calibri"/>
+          <w:color w:val="000000"/>
           <w:sz w:val="21"/>
-          <w:color w:val="000000"/>
         </w:rPr>
-        <w:t xml:space="preserve">Visual estimates transfer geographic landmarks between maps; raw screenshot pixel areas were not compared. Boundary interpretation near Taiwan and differing map scales limit precision.</w:t>
+        <w:t>Visual estimates transfer geographic landmarks between maps; raw screenshot pixel areas were not compared. Boundary interpretation near Taiwan and differing map scales limit precision.</w:t>
       </w:r>
     </w:p>
     <w:sectPr>
@@ -5261,7 +4968,6 @@
       <w:pgMar w:top="936" w:right="936" w:bottom="936" w:left="936" w:header="720" w:footer="720" w:gutter="0"/>
       <w:cols w:space="720"/>
       <w:docGrid w:linePitch="360"/>
-      <w:type w:val="nextPage"/>
     </w:sectPr>
   </w:body>
 </w:document>
@@ -5974,7 +5680,7 @@
   <w:style w:type="paragraph" w:default="1" w:styleId="a1">
     <w:name w:val="Normal"/>
     <w:qFormat/>
-    <w:rsid w:val="00FC693F"/>
+    <w:rsid w:val="0005224C"/>
     <w:pPr>
       <w:spacing w:after="100" w:line="247" w:lineRule="auto"/>
     </w:pPr>
@@ -6194,7 +5900,6 @@
   <w:style w:type="character" w:default="1" w:styleId="a2">
     <w:name w:val="Default Paragraph Font"/>
     <w:uiPriority w:val="1"/>
-    <w:semiHidden/>
     <w:unhideWhenUsed/>
   </w:style>
   <w:style w:type="table" w:default="1" w:styleId="a3">

</xml_diff>

<commit_message>
Save researcher edits to LME036 validation report and remove superseded report
</commit_message>
<xml_diff>
--- a/regions/LME_036/Model_validation_36_1_South_China_Sea_SCS-2007_Northern_South_China_Sea_(2000s).docx
+++ b/regions/LME_036/Model_validation_36_1_South_China_Sea_SCS-2007_Northern_South_China_Sea_(2000s).docx
@@ -367,7 +367,21 @@
               <w:rPr>
                 <w:sz w:val="21"/>
               </w:rPr>
-              <w:t xml:space="preserve">Cheung, Wai Lung (2007). Vulnerability of marine fishes to fishing: from global overview to the northern South China Sea. UBC doctoral thesis. </w:t>
+              <w:t xml:space="preserve">Cheung, Wai Lung (2007). Vulnerability of marine fishes to </w:t>
+            </w:r>
+            <w:proofErr w:type="gramStart"/>
+            <w:r>
+              <w:rPr>
+                <w:sz w:val="21"/>
+              </w:rPr>
+              <w:t>fishing:</w:t>
+            </w:r>
+            <w:proofErr w:type="gramEnd"/>
+            <w:r>
+              <w:rPr>
+                <w:sz w:val="21"/>
+              </w:rPr>
+              <w:t xml:space="preserve"> from global overview to the northern South China Sea. UBC doctoral thesis. </w:t>
             </w:r>
             <w:hyperlink r:id="rId10">
               <w:r>
@@ -592,35 +606,7 @@
               <w:rPr>
                 <w:sz w:val="21"/>
               </w:rPr>
-              <w:t xml:space="preserve">• Jiang et al. (2023). A preliminary model of the mangrove ecosystem of </w:t>
-            </w:r>
-            <w:proofErr w:type="spellStart"/>
-            <w:r>
-              <w:rPr>
-                <w:sz w:val="21"/>
-              </w:rPr>
-              <w:t>Dongzhaigang</w:t>
-            </w:r>
-            <w:proofErr w:type="spellEnd"/>
-            <w:r>
-              <w:rPr>
-                <w:sz w:val="21"/>
-              </w:rPr>
-              <w:t xml:space="preserve"> Bay, Hainan, (China) based on Ecopath and </w:t>
-            </w:r>
-            <w:proofErr w:type="spellStart"/>
-            <w:r>
-              <w:rPr>
-                <w:sz w:val="21"/>
-              </w:rPr>
-              <w:t>Ecospace</w:t>
-            </w:r>
-            <w:proofErr w:type="spellEnd"/>
-            <w:r>
-              <w:rPr>
-                <w:sz w:val="21"/>
-              </w:rPr>
-              <w:t xml:space="preserve">. </w:t>
+              <w:t xml:space="preserve">• Jiang et al. (2023). A preliminary model of the mangrove ecosystem of Dongzhaigang Bay, Hainan, (China) based on Ecopath and Ecospace. </w:t>
             </w:r>
             <w:hyperlink r:id="rId19">
               <w:r>
@@ -657,21 +643,7 @@
               <w:rPr>
                 <w:sz w:val="21"/>
               </w:rPr>
-              <w:t xml:space="preserve">• Feng et al. (2026). Ecosystem characteristics and ecological carrying capacity of a subtropical marine ranch in the pearl river estuary: an </w:t>
-            </w:r>
-            <w:proofErr w:type="spellStart"/>
-            <w:r>
-              <w:rPr>
-                <w:sz w:val="21"/>
-              </w:rPr>
-              <w:t>ecopath</w:t>
-            </w:r>
-            <w:proofErr w:type="spellEnd"/>
-            <w:r>
-              <w:rPr>
-                <w:sz w:val="21"/>
-              </w:rPr>
-              <w:t xml:space="preserve"> modeling approach. </w:t>
+              <w:t xml:space="preserve">• Feng et al. (2026). Ecosystem characteristics and ecological carrying capacity of a subtropical marine ranch in the pearl river estuary: an ecopath modeling approach. </w:t>
             </w:r>
             <w:hyperlink r:id="rId21">
               <w:r>
@@ -960,8 +932,16 @@
               <w:rPr>
                 <w:sz w:val="21"/>
               </w:rPr>
-              <w:t>Article – ?</w:t>
+              <w:t xml:space="preserve">Article </w:t>
             </w:r>
+            <w:proofErr w:type="gramStart"/>
+            <w:r>
+              <w:rPr>
+                <w:sz w:val="21"/>
+              </w:rPr>
+              <w:t>– ?</w:t>
+            </w:r>
+            <w:proofErr w:type="gramEnd"/>
           </w:p>
           <w:p>
             <w:pPr>
@@ -1154,7 +1134,21 @@
               <w:rPr>
                 <w:sz w:val="21"/>
               </w:rPr>
-              <w:t>, 0 for producers/detritus/import groups</w:t>
+              <w:t xml:space="preserve">, 0 for </w:t>
+            </w:r>
+            <w:proofErr w:type="gramStart"/>
+            <w:r>
+              <w:rPr>
+                <w:sz w:val="21"/>
+              </w:rPr>
+              <w:t>producers</w:t>
+            </w:r>
+            <w:proofErr w:type="gramEnd"/>
+            <w:r>
+              <w:rPr>
+                <w:sz w:val="21"/>
+              </w:rPr>
+              <w:t>/detritus/import groups</w:t>
             </w:r>
           </w:p>
           <w:p>
@@ -1286,23 +1280,7 @@
               <w:spacing w:after="40"/>
             </w:pPr>
             <w:r>
-              <w:t xml:space="preserve">seabirds (TE&lt;0.1%, TL=3.4, </w:t>
-            </w:r>
-            <w:proofErr w:type="spellStart"/>
-            <w:r>
-              <w:t>sppr_TE</w:t>
-            </w:r>
-            <w:proofErr w:type="spellEnd"/>
-            <w:r>
-              <w:t xml:space="preserve">=3.75M, </w:t>
-            </w:r>
-            <w:proofErr w:type="spellStart"/>
-            <w:r>
-              <w:t>sppr_GE</w:t>
-            </w:r>
-            <w:proofErr w:type="spellEnd"/>
-            <w:r>
-              <w:t>=21K)</w:t>
+              <w:t>seabirds (TE&lt;0.1%, TL=3.4, sppr_TE=3.75M, sppr_GE=21K)</w:t>
             </w:r>
           </w:p>
           <w:p>
@@ -1315,23 +1293,7 @@
               <w:spacing w:after="40"/>
             </w:pPr>
             <w:r>
-              <w:t xml:space="preserve">other mammals (TE&lt;0.1%, TL=3.9, </w:t>
-            </w:r>
-            <w:proofErr w:type="spellStart"/>
-            <w:r>
-              <w:t>sppr_TE</w:t>
-            </w:r>
-            <w:proofErr w:type="spellEnd"/>
-            <w:r>
-              <w:t xml:space="preserve">=800K, </w:t>
-            </w:r>
-            <w:proofErr w:type="spellStart"/>
-            <w:r>
-              <w:t>sppr_GE</w:t>
-            </w:r>
-            <w:proofErr w:type="spellEnd"/>
-            <w:r>
-              <w:t>=13K)</w:t>
+              <w:t>other mammals (TE&lt;0.1%, TL=3.9, sppr_TE=800K, sppr_GE=13K)</w:t>
             </w:r>
           </w:p>
           <w:p>
@@ -1344,23 +1306,7 @@
               <w:spacing w:after="40"/>
             </w:pPr>
             <w:r>
-              <w:t xml:space="preserve">Pinnipeds (TE&lt;0.1%, TL=4.1, </w:t>
-            </w:r>
-            <w:proofErr w:type="spellStart"/>
-            <w:r>
-              <w:t>sppr_TE</w:t>
-            </w:r>
-            <w:proofErr w:type="spellEnd"/>
-            <w:r>
-              <w:t xml:space="preserve">=340K, </w:t>
-            </w:r>
-            <w:proofErr w:type="spellStart"/>
-            <w:r>
-              <w:t>sppr_GE</w:t>
-            </w:r>
-            <w:proofErr w:type="spellEnd"/>
-            <w:r>
-              <w:t>=3400)</w:t>
+              <w:t>Pinnipeds (TE&lt;0.1%, TL=4.1, sppr_TE=340K, sppr_GE=3400)</w:t>
             </w:r>
           </w:p>
           <w:p>
@@ -1373,23 +1319,7 @@
               <w:spacing w:after="40"/>
             </w:pPr>
             <w:r>
-              <w:t xml:space="preserve">Marine Turtles (TE&lt;1%, TL=3, </w:t>
-            </w:r>
-            <w:proofErr w:type="spellStart"/>
-            <w:r>
-              <w:t>sppr_TE</w:t>
-            </w:r>
-            <w:proofErr w:type="spellEnd"/>
-            <w:r>
-              <w:t xml:space="preserve">=20K, </w:t>
-            </w:r>
-            <w:proofErr w:type="spellStart"/>
-            <w:r>
-              <w:t>sppr_GE</w:t>
-            </w:r>
-            <w:proofErr w:type="spellEnd"/>
-            <w:r>
-              <w:t>=724)</w:t>
+              <w:t>Marine Turtles (TE&lt;1%, TL=3, sppr_TE=20K, sppr_GE=724)</w:t>
             </w:r>
           </w:p>
         </w:tc>
@@ -1554,21 +1484,12 @@
             <w:pPr>
               <w:spacing w:after="45" w:line="240" w:lineRule="auto"/>
             </w:pPr>
-            <w:proofErr w:type="spellStart"/>
             <w:r>
               <w:rPr>
                 <w:color w:val="000000"/>
                 <w:sz w:val="21"/>
               </w:rPr>
-              <w:t>rho_living</w:t>
-            </w:r>
-            <w:proofErr w:type="spellEnd"/>
-            <w:r>
-              <w:rPr>
-                <w:color w:val="000000"/>
-                <w:sz w:val="21"/>
-              </w:rPr>
-              <w:t xml:space="preserve"> = 0.3209187537609611; b = 0.00408138212364339.</w:t>
+              <w:t>rho_living = 0.3209187537609611; b = 0.00408138212364339.</w:t>
             </w:r>
           </w:p>
           <w:p>
@@ -1662,21 +1583,12 @@
             <w:pPr>
               <w:spacing w:after="45" w:line="240" w:lineRule="auto"/>
             </w:pPr>
-            <w:proofErr w:type="spellStart"/>
             <w:r>
               <w:rPr>
                 <w:color w:val="000000"/>
                 <w:sz w:val="21"/>
               </w:rPr>
-              <w:t>rho_living</w:t>
-            </w:r>
-            <w:proofErr w:type="spellEnd"/>
-            <w:r>
-              <w:rPr>
-                <w:color w:val="000000"/>
-                <w:sz w:val="21"/>
-              </w:rPr>
-              <w:t xml:space="preserve"> = 0.6163296517365333.</w:t>
+              <w:t>rho_living = 0.6163296517365333.</w:t>
             </w:r>
           </w:p>
           <w:p>
@@ -1995,16 +1907,6 @@
               <w:t>Add article selection reason when we review other articles</w:t>
             </w:r>
           </w:p>
-          <w:p>
-            <w:pPr>
-              <w:pStyle w:val="ae"/>
-              <w:numPr>
-                <w:ilvl w:val="0"/>
-                <w:numId w:val="10"/>
-              </w:numPr>
-              <w:spacing w:after="40"/>
-            </w:pPr>
-          </w:p>
         </w:tc>
       </w:tr>
       <w:tr>
@@ -2188,21 +2090,7 @@
           <w:color w:val="000000"/>
           <w:sz w:val="21"/>
         </w:rPr>
-        <w:t xml:space="preserve"> lack an assigned trophic level</w:t>
-      </w:r>
-      <w:r>
-        <w:rPr>
-          <w:color w:val="000000"/>
-          <w:sz w:val="21"/>
-        </w:rPr>
-        <w:t xml:space="preserve"> </w:t>
-      </w:r>
-      <w:r>
-        <w:rPr>
-          <w:color w:val="000000"/>
-          <w:sz w:val="21"/>
-        </w:rPr>
-        <w:t>have zero landings that year and therefore contribute zero PPR.</w:t>
+        <w:t xml:space="preserve"> lack an assigned trophic level have zero landings that year and therefore contribute zero PPR.</w:t>
       </w:r>
     </w:p>
     <w:p>
@@ -3398,7 +3286,23 @@
                 <w:color w:val="000000"/>
                 <w:sz w:val="20"/>
               </w:rPr>
-              <w:t>The source explicitly assigns the taxon to the model group</w:t>
+              <w:t xml:space="preserve">The source explicitly assigns </w:t>
+            </w:r>
+            <w:proofErr w:type="gramStart"/>
+            <w:r>
+              <w:rPr>
+                <w:color w:val="000000"/>
+                <w:sz w:val="20"/>
+              </w:rPr>
+              <w:t>the taxon</w:t>
+            </w:r>
+            <w:proofErr w:type="gramEnd"/>
+            <w:r>
+              <w:rPr>
+                <w:color w:val="000000"/>
+                <w:sz w:val="20"/>
+              </w:rPr>
+              <w:t xml:space="preserve"> to the model group</w:t>
             </w:r>
           </w:p>
         </w:tc>
@@ -3867,21 +3771,7 @@
             <w:color w:val="175E72"/>
             <w:u w:val="single"/>
           </w:rPr>
-          <w:t xml:space="preserve">Cheung group </w:t>
-        </w:r>
-        <w:r>
-          <w:rPr>
-            <w:color w:val="175E72"/>
-            <w:u w:val="single"/>
-          </w:rPr>
-          <w:t>d</w:t>
-        </w:r>
-        <w:r>
-          <w:rPr>
-            <w:color w:val="175E72"/>
-            <w:u w:val="single"/>
-          </w:rPr>
-          <w:t>efinitions</w:t>
+          <w:t>Cheung group definitions</w:t>
         </w:r>
       </w:hyperlink>
       <w:r>
@@ -4232,7 +4122,7 @@
           <w:color w:val="000000"/>
           <w:sz w:val="21"/>
         </w:rPr>
-        <w:t xml:space="preserve">Each percentage is the simple-chain PPR associated with taxa using that rule.</w:t>
+        <w:t>Each percentage is the simple-chain PPR associated with taxa using that rule.</w:t>
       </w:r>
     </w:p>
     <w:p>
@@ -5900,6 +5790,7 @@
   <w:style w:type="character" w:default="1" w:styleId="a2">
     <w:name w:val="Default Paragraph Font"/>
     <w:uiPriority w:val="1"/>
+    <w:semiHidden/>
     <w:unhideWhenUsed/>
   </w:style>
   <w:style w:type="table" w:default="1" w:styleId="a3">

</xml_diff>

<commit_message>
Record researcher validations and update model review workflow
</commit_message>
<xml_diff>
--- a/regions/LME_036/Model_validation_36_1_South_China_Sea_SCS-2007_Northern_South_China_Sea_(2000s).docx
+++ b/regions/LME_036/Model_validation_36_1_South_China_Sea_SCS-2007_Northern_South_China_Sea_(2000s).docx
@@ -12,19 +12,26 @@
     </w:p>
     <w:p>
       <w:r>
-        <w:t xml:space="preserve">Completed regional review for the selected 2000s northern South China Sea model. All 374 taxa were reviewed; 36 supported group corrections are adopted regionally. The linked appendix records confidence and assumptions. Estimates remain provisional.</w:t>
+        <w:t>Completed regional review for the selected 2000s northern South China Sea model. All 374 taxa were reviewed; 36 supported group corrections are adopted regionally. The linked appendix records confidence and assumptions</w:t>
+      </w:r>
+      <w:r>
+        <w:t xml:space="preserve"> of group mappings</w:t>
+      </w:r>
+      <w:r>
+        <w:t>.</w:t>
       </w:r>
     </w:p>
     <w:tbl>
       <w:tblPr>
-        <w:tblW w:w="0" w:type="auto"/>
+        <w:tblW w:w="10440" w:type="dxa"/>
         <w:jc w:val="center"/>
         <w:tblLayout w:type="fixed"/>
         <w:tblLook w:val="04A0" w:firstRow="1" w:lastRow="0" w:firstColumn="1" w:lastColumn="0" w:noHBand="0" w:noVBand="1"/>
       </w:tblPr>
       <w:tblGrid>
         <w:gridCol w:w="2203"/>
-        <w:gridCol w:w="8237"/>
+        <w:gridCol w:w="7834"/>
+        <w:gridCol w:w="403"/>
       </w:tblGrid>
       <w:tr>
         <w:trPr>
@@ -34,7 +41,7 @@
         </w:trPr>
         <w:tc>
           <w:tcPr>
-            <w:tcW w:w="1800" w:type="dxa"/>
+            <w:tcW w:w="2203" w:type="dxa"/>
             <w:tcBorders>
               <w:top w:val="single" w:sz="5" w:space="0" w:color="D9D9D9"/>
               <w:left w:val="single" w:sz="5" w:space="0" w:color="D9D9D9"/>
@@ -66,6 +73,7 @@
         <w:tc>
           <w:tcPr>
             <w:tcW w:w="8237" w:type="dxa"/>
+            <w:gridSpan w:val="2"/>
             <w:tcBorders>
               <w:top w:val="single" w:sz="5" w:space="0" w:color="D9D9D9"/>
               <w:left w:val="single" w:sz="5" w:space="0" w:color="D9D9D9"/>
@@ -103,7 +111,7 @@
         </w:trPr>
         <w:tc>
           <w:tcPr>
-            <w:tcW w:w="1800" w:type="dxa"/>
+            <w:tcW w:w="2203" w:type="dxa"/>
             <w:tcBorders>
               <w:top w:val="single" w:sz="5" w:space="0" w:color="D9D9D9"/>
               <w:left w:val="single" w:sz="5" w:space="0" w:color="D9D9D9"/>
@@ -135,6 +143,7 @@
         <w:tc>
           <w:tcPr>
             <w:tcW w:w="8237" w:type="dxa"/>
+            <w:gridSpan w:val="2"/>
             <w:tcBorders>
               <w:top w:val="single" w:sz="5" w:space="0" w:color="D9D9D9"/>
               <w:left w:val="single" w:sz="5" w:space="0" w:color="D9D9D9"/>
@@ -180,7 +189,7 @@
         </w:trPr>
         <w:tc>
           <w:tcPr>
-            <w:tcW w:w="1800" w:type="dxa"/>
+            <w:tcW w:w="2203" w:type="dxa"/>
             <w:tcBorders>
               <w:top w:val="single" w:sz="5" w:space="0" w:color="D9D9D9"/>
               <w:left w:val="single" w:sz="5" w:space="0" w:color="D9D9D9"/>
@@ -212,6 +221,7 @@
         <w:tc>
           <w:tcPr>
             <w:tcW w:w="8237" w:type="dxa"/>
+            <w:gridSpan w:val="2"/>
             <w:tcBorders>
               <w:top w:val="single" w:sz="5" w:space="0" w:color="D9D9D9"/>
               <w:left w:val="single" w:sz="5" w:space="0" w:color="D9D9D9"/>
@@ -312,7 +322,7 @@
         </w:trPr>
         <w:tc>
           <w:tcPr>
-            <w:tcW w:w="1800" w:type="dxa"/>
+            <w:tcW w:w="2203" w:type="dxa"/>
             <w:tcBorders>
               <w:top w:val="single" w:sz="5" w:space="0" w:color="D9D9D9"/>
               <w:left w:val="single" w:sz="5" w:space="0" w:color="D9D9D9"/>
@@ -344,6 +354,7 @@
         <w:tc>
           <w:tcPr>
             <w:tcW w:w="8237" w:type="dxa"/>
+            <w:gridSpan w:val="2"/>
             <w:tcBorders>
               <w:top w:val="single" w:sz="5" w:space="0" w:color="D9D9D9"/>
               <w:left w:val="single" w:sz="5" w:space="0" w:color="D9D9D9"/>
@@ -435,7 +446,7 @@
         </w:trPr>
         <w:tc>
           <w:tcPr>
-            <w:tcW w:w="1800" w:type="dxa"/>
+            <w:tcW w:w="2203" w:type="dxa"/>
             <w:tcBorders>
               <w:top w:val="single" w:sz="5" w:space="0" w:color="D9D9D9"/>
               <w:left w:val="single" w:sz="5" w:space="0" w:color="D9D9D9"/>
@@ -467,6 +478,7 @@
         <w:tc>
           <w:tcPr>
             <w:tcW w:w="8237" w:type="dxa"/>
+            <w:gridSpan w:val="2"/>
             <w:tcBorders>
               <w:top w:val="single" w:sz="5" w:space="0" w:color="D9D9D9"/>
               <w:left w:val="single" w:sz="5" w:space="0" w:color="D9D9D9"/>
@@ -606,7 +618,35 @@
               <w:rPr>
                 <w:sz w:val="21"/>
               </w:rPr>
-              <w:t xml:space="preserve">• Jiang et al. (2023). A preliminary model of the mangrove ecosystem of Dongzhaigang Bay, Hainan, (China) based on Ecopath and Ecospace. </w:t>
+              <w:t xml:space="preserve">• Jiang et al. (2023). A preliminary model of the mangrove ecosystem of </w:t>
+            </w:r>
+            <w:proofErr w:type="spellStart"/>
+            <w:r>
+              <w:rPr>
+                <w:sz w:val="21"/>
+              </w:rPr>
+              <w:t>Dongzhaigang</w:t>
+            </w:r>
+            <w:proofErr w:type="spellEnd"/>
+            <w:r>
+              <w:rPr>
+                <w:sz w:val="21"/>
+              </w:rPr>
+              <w:t xml:space="preserve"> Bay, Hainan, (China) based on Ecopath and </w:t>
+            </w:r>
+            <w:proofErr w:type="spellStart"/>
+            <w:r>
+              <w:rPr>
+                <w:sz w:val="21"/>
+              </w:rPr>
+              <w:t>Ecospace</w:t>
+            </w:r>
+            <w:proofErr w:type="spellEnd"/>
+            <w:r>
+              <w:rPr>
+                <w:sz w:val="21"/>
+              </w:rPr>
+              <w:t xml:space="preserve">. </w:t>
             </w:r>
             <w:hyperlink r:id="rId19">
               <w:r>
@@ -643,7 +683,21 @@
               <w:rPr>
                 <w:sz w:val="21"/>
               </w:rPr>
-              <w:t xml:space="preserve">• Feng et al. (2026). Ecosystem characteristics and ecological carrying capacity of a subtropical marine ranch in the pearl river estuary: an ecopath modeling approach. </w:t>
+              <w:t xml:space="preserve">• Feng et al. (2026). Ecosystem characteristics and ecological carrying capacity of a subtropical marine ranch in the pearl river estuary: an </w:t>
+            </w:r>
+            <w:proofErr w:type="spellStart"/>
+            <w:r>
+              <w:rPr>
+                <w:sz w:val="21"/>
+              </w:rPr>
+              <w:t>ecopath</w:t>
+            </w:r>
+            <w:proofErr w:type="spellEnd"/>
+            <w:r>
+              <w:rPr>
+                <w:sz w:val="21"/>
+              </w:rPr>
+              <w:t xml:space="preserve"> modeling approach. </w:t>
             </w:r>
             <w:hyperlink r:id="rId21">
               <w:r>
@@ -681,7 +735,7 @@
         </w:trPr>
         <w:tc>
           <w:tcPr>
-            <w:tcW w:w="1800" w:type="dxa"/>
+            <w:tcW w:w="2203" w:type="dxa"/>
             <w:tcBorders>
               <w:top w:val="single" w:sz="5" w:space="0" w:color="D9D9D9"/>
               <w:left w:val="single" w:sz="5" w:space="0" w:color="D9D9D9"/>
@@ -713,6 +767,7 @@
         <w:tc>
           <w:tcPr>
             <w:tcW w:w="8237" w:type="dxa"/>
+            <w:gridSpan w:val="2"/>
             <w:tcBorders>
               <w:top w:val="single" w:sz="5" w:space="0" w:color="D9D9D9"/>
               <w:left w:val="single" w:sz="5" w:space="0" w:color="D9D9D9"/>
@@ -753,9 +808,8 @@
               <w:r>
                 <w:rPr>
                   <w:rStyle w:val="Hyperlink"/>
+                  <w:color w:val="0563C1"/>
                   <w:sz w:val="21"/>
-                  <w:color w:val="0563C1"/>
-                  <w:u w:val="single"/>
                 </w:rPr>
                 <w:t>Folder</w:t>
               </w:r>
@@ -770,9 +824,8 @@
               <w:r>
                 <w:rPr>
                   <w:rStyle w:val="Hyperlink"/>
+                  <w:color w:val="0563C1"/>
                   <w:sz w:val="21"/>
-                  <w:color w:val="0563C1"/>
-                  <w:u w:val="single"/>
                 </w:rPr>
                 <w:t>JSON</w:t>
               </w:r>
@@ -841,7 +894,8 @@
         </w:tc>
         <w:tc>
           <w:tcPr>
-            <w:tcW w:w="7834" w:type="dxa"/>
+            <w:tcW w:w="8237" w:type="dxa"/>
+            <w:gridSpan w:val="2"/>
             <w:tcBorders>
               <w:top w:val="single" w:sz="5" w:space="0" w:color="D9D9D9"/>
               <w:left w:val="single" w:sz="5" w:space="0" w:color="D9D9D9"/>
@@ -867,546 +921,6 @@
                 <w:sz w:val="21"/>
               </w:rPr>
               <w:t>Northern South China Sea (1970s): same northern shelf and 38 source groups; earlier biomass, mortality and catch parameterization with adult-heavy stages. Kept separately from the selected 2000s model.</w:t>
-            </w:r>
-          </w:p>
-        </w:tc>
-      </w:tr>
-      <w:tr>
-        <w:trPr>
-          <w:cantSplit/>
-          <w:jc w:val="center"/>
-        </w:trPr>
-        <w:tc>
-          <w:tcPr>
-            <w:tcW w:w="1800" w:type="dxa"/>
-            <w:tcBorders>
-              <w:top w:val="single" w:sz="5" w:space="0" w:color="D9D9D9"/>
-              <w:left w:val="single" w:sz="5" w:space="0" w:color="D9D9D9"/>
-              <w:bottom w:val="single" w:sz="5" w:space="0" w:color="D9D9D9"/>
-              <w:right w:val="single" w:sz="5" w:space="0" w:color="D9D9D9"/>
-            </w:tcBorders>
-            <w:shd w:val="clear" w:color="auto" w:fill="FFFFFF"/>
-            <w:tcMar>
-              <w:top w:w="90" w:type="dxa"/>
-              <w:left w:w="110" w:type="dxa"/>
-              <w:bottom w:w="90" w:type="dxa"/>
-              <w:right w:w="110" w:type="dxa"/>
-            </w:tcMar>
-            <w:vAlign w:val="center"/>
-          </w:tcPr>
-          <w:p>
-            <w:pPr>
-              <w:spacing w:after="40"/>
-            </w:pPr>
-            <w:r>
-              <w:rPr>
-                <w:b/>
-                <w:sz w:val="21"/>
-              </w:rPr>
-              <w:t>Selection rationale</w:t>
-            </w:r>
-          </w:p>
-        </w:tc>
-        <w:tc>
-          <w:tcPr>
-            <w:tcW w:w="8237" w:type="dxa"/>
-            <w:tcBorders>
-              <w:top w:val="single" w:sz="5" w:space="0" w:color="D9D9D9"/>
-              <w:left w:val="single" w:sz="5" w:space="0" w:color="D9D9D9"/>
-              <w:bottom w:val="single" w:sz="5" w:space="0" w:color="D9D9D9"/>
-              <w:right w:val="single" w:sz="5" w:space="0" w:color="D9D9D9"/>
-            </w:tcBorders>
-            <w:shd w:val="clear" w:color="auto" w:fill="FFFFFF"/>
-            <w:tcMar>
-              <w:top w:w="90" w:type="dxa"/>
-              <w:left w:w="110" w:type="dxa"/>
-              <w:bottom w:w="90" w:type="dxa"/>
-              <w:right w:w="110" w:type="dxa"/>
-            </w:tcMar>
-            <w:vAlign w:val="center"/>
-          </w:tcPr>
-          <w:p>
-            <w:pPr>
-              <w:spacing w:after="40"/>
-              <w:rPr>
-                <w:sz w:val="21"/>
-              </w:rPr>
-            </w:pPr>
-            <w:r>
-              <w:rPr>
-                <w:sz w:val="21"/>
-              </w:rPr>
-              <w:t xml:space="preserve">Article </w:t>
-            </w:r>
-            <w:proofErr w:type="gramStart"/>
-            <w:r>
-              <w:rPr>
-                <w:sz w:val="21"/>
-              </w:rPr>
-              <w:t>– ?</w:t>
-            </w:r>
-            <w:proofErr w:type="gramEnd"/>
-          </w:p>
-          <w:p>
-            <w:pPr>
-              <w:spacing w:after="40"/>
-            </w:pPr>
-            <w:r>
-              <w:rPr>
-                <w:sz w:val="21"/>
-              </w:rPr>
-              <w:t>Model – newer model (2000 vs 1970)</w:t>
-            </w:r>
-          </w:p>
-        </w:tc>
-      </w:tr>
-      <w:tr>
-        <w:trPr>
-          <w:cantSplit/>
-          <w:jc w:val="center"/>
-        </w:trPr>
-        <w:tc>
-          <w:tcPr>
-            <w:tcW w:w="1800" w:type="dxa"/>
-            <w:tcBorders>
-              <w:top w:val="single" w:sz="5" w:space="0" w:color="D9D9D9"/>
-              <w:left w:val="single" w:sz="5" w:space="0" w:color="D9D9D9"/>
-              <w:bottom w:val="single" w:sz="5" w:space="0" w:color="D9D9D9"/>
-              <w:right w:val="single" w:sz="5" w:space="0" w:color="D9D9D9"/>
-            </w:tcBorders>
-            <w:shd w:val="clear" w:color="auto" w:fill="FFFFFF"/>
-            <w:tcMar>
-              <w:top w:w="90" w:type="dxa"/>
-              <w:left w:w="110" w:type="dxa"/>
-              <w:bottom w:w="90" w:type="dxa"/>
-              <w:right w:w="110" w:type="dxa"/>
-            </w:tcMar>
-            <w:vAlign w:val="center"/>
-          </w:tcPr>
-          <w:p>
-            <w:pPr>
-              <w:spacing w:after="40"/>
-            </w:pPr>
-            <w:r>
-              <w:rPr>
-                <w:b/>
-                <w:sz w:val="21"/>
-              </w:rPr>
-              <w:t>Model extraction</w:t>
-            </w:r>
-          </w:p>
-        </w:tc>
-        <w:tc>
-          <w:tcPr>
-            <w:tcW w:w="8237" w:type="dxa"/>
-            <w:tcBorders>
-              <w:top w:val="single" w:sz="5" w:space="0" w:color="D9D9D9"/>
-              <w:left w:val="single" w:sz="5" w:space="0" w:color="D9D9D9"/>
-              <w:bottom w:val="single" w:sz="5" w:space="0" w:color="D9D9D9"/>
-              <w:right w:val="single" w:sz="5" w:space="0" w:color="D9D9D9"/>
-            </w:tcBorders>
-            <w:shd w:val="clear" w:color="auto" w:fill="FFFFFF"/>
-            <w:tcMar>
-              <w:top w:w="90" w:type="dxa"/>
-              <w:left w:w="110" w:type="dxa"/>
-              <w:bottom w:w="90" w:type="dxa"/>
-              <w:right w:w="110" w:type="dxa"/>
-            </w:tcMar>
-            <w:vAlign w:val="center"/>
-          </w:tcPr>
-          <w:p>
-            <w:pPr>
-              <w:spacing w:after="40"/>
-              <w:rPr>
-                <w:sz w:val="21"/>
-              </w:rPr>
-            </w:pPr>
-            <w:hyperlink r:id="rId26">
-              <w:r>
-                <w:rPr>
-                  <w:color w:val="0563C1"/>
-                  <w:sz w:val="21"/>
-                  <w:u w:val="single"/>
-                </w:rPr>
-                <w:t>source reconstruction report</w:t>
-              </w:r>
-            </w:hyperlink>
-            <w:r>
-              <w:rPr>
-                <w:sz w:val="21"/>
-              </w:rPr>
-              <w:t xml:space="preserve"> </w:t>
-            </w:r>
-          </w:p>
-          <w:p>
-            <w:pPr>
-              <w:pStyle w:val="ae"/>
-              <w:numPr>
-                <w:ilvl w:val="0"/>
-                <w:numId w:val="10"/>
-              </w:numPr>
-              <w:spacing w:after="40"/>
-              <w:rPr>
-                <w:sz w:val="21"/>
-              </w:rPr>
-            </w:pPr>
-            <w:r>
-              <w:rPr>
-                <w:sz w:val="21"/>
-              </w:rPr>
-              <w:t>several internal conflicts within the paper</w:t>
-            </w:r>
-            <w:r>
-              <w:rPr>
-                <w:sz w:val="21"/>
-              </w:rPr>
-              <w:t>.</w:t>
-            </w:r>
-            <w:r>
-              <w:rPr>
-                <w:sz w:val="21"/>
-              </w:rPr>
-              <w:t xml:space="preserve"> </w:t>
-            </w:r>
-            <w:hyperlink r:id="rId27">
-              <w:r>
-                <w:rPr>
-                  <w:color w:val="0563C1"/>
-                  <w:sz w:val="21"/>
-                  <w:u w:val="single"/>
-                </w:rPr>
-                <w:t>Full conflict report</w:t>
-              </w:r>
-            </w:hyperlink>
-            <w:r>
-              <w:rPr>
-                <w:sz w:val="21"/>
-              </w:rPr>
-              <w:t>.</w:t>
-            </w:r>
-          </w:p>
-          <w:p>
-            <w:pPr>
-              <w:pStyle w:val="ae"/>
-              <w:numPr>
-                <w:ilvl w:val="0"/>
-                <w:numId w:val="10"/>
-              </w:numPr>
-              <w:spacing w:after="40"/>
-              <w:rPr>
-                <w:sz w:val="21"/>
-              </w:rPr>
-            </w:pPr>
-            <w:r>
-              <w:rPr>
-                <w:sz w:val="21"/>
-              </w:rPr>
-              <w:t>Diet Sums – only rounding errors.</w:t>
-            </w:r>
-            <w:r>
-              <w:rPr>
-                <w:sz w:val="21"/>
-              </w:rPr>
-              <w:br/>
-            </w:r>
-            <w:r>
-              <w:rPr>
-                <w:sz w:val="21"/>
-              </w:rPr>
-              <w:t>max error = 0.0011, group 33 (Pelagic sharks and rays).</w:t>
-            </w:r>
-          </w:p>
-          <w:p>
-            <w:pPr>
-              <w:pStyle w:val="ae"/>
-              <w:numPr>
-                <w:ilvl w:val="0"/>
-                <w:numId w:val="10"/>
-              </w:numPr>
-              <w:spacing w:after="40"/>
-              <w:rPr>
-                <w:sz w:val="21"/>
-              </w:rPr>
-            </w:pPr>
-            <w:r>
-              <w:rPr>
-                <w:sz w:val="21"/>
-              </w:rPr>
-              <w:t>GS not reported; defaulted to 0.2 for all consumer groups</w:t>
-            </w:r>
-            <w:r>
-              <w:rPr>
-                <w:sz w:val="21"/>
-              </w:rPr>
-              <w:t xml:space="preserve">, 0 for </w:t>
-            </w:r>
-            <w:proofErr w:type="gramStart"/>
-            <w:r>
-              <w:rPr>
-                <w:sz w:val="21"/>
-              </w:rPr>
-              <w:t>producers</w:t>
-            </w:r>
-            <w:proofErr w:type="gramEnd"/>
-            <w:r>
-              <w:rPr>
-                <w:sz w:val="21"/>
-              </w:rPr>
-              <w:t>/detritus/import groups</w:t>
-            </w:r>
-          </w:p>
-          <w:p>
-            <w:pPr>
-              <w:pStyle w:val="ae"/>
-              <w:numPr>
-                <w:ilvl w:val="0"/>
-                <w:numId w:val="10"/>
-              </w:numPr>
-              <w:spacing w:after="40"/>
-              <w:rPr>
-                <w:sz w:val="21"/>
-              </w:rPr>
-            </w:pPr>
-            <w:r>
-              <w:rPr>
-                <w:sz w:val="21"/>
-              </w:rPr>
-              <w:t>BA not reported; auto completed through LIM</w:t>
-            </w:r>
-          </w:p>
-          <w:p>
-            <w:pPr>
-              <w:pStyle w:val="ae"/>
-              <w:numPr>
-                <w:ilvl w:val="0"/>
-                <w:numId w:val="10"/>
-              </w:numPr>
-              <w:spacing w:after="40"/>
-              <w:rPr>
-                <w:sz w:val="21"/>
-              </w:rPr>
-            </w:pPr>
-            <w:hyperlink r:id="rId28">
-              <w:r>
-                <w:rPr>
-                  <w:color w:val="0563C1"/>
-                  <w:sz w:val="21"/>
-                  <w:u w:val="single"/>
-                </w:rPr>
-                <w:t>state comparison</w:t>
-              </w:r>
-            </w:hyperlink>
-            <w:r>
-              <w:rPr>
-                <w:sz w:val="21"/>
-              </w:rPr>
-              <w:t>.</w:t>
-            </w:r>
-          </w:p>
-        </w:tc>
-      </w:tr>
-      <w:tr>
-        <w:trPr>
-          <w:cantSplit/>
-          <w:jc w:val="center"/>
-        </w:trPr>
-        <w:tc>
-          <w:tcPr>
-            <w:tcW w:w="1800" w:type="dxa"/>
-            <w:tcBorders>
-              <w:top w:val="single" w:sz="5" w:space="0" w:color="D9D9D9"/>
-              <w:left w:val="single" w:sz="5" w:space="0" w:color="D9D9D9"/>
-              <w:bottom w:val="single" w:sz="5" w:space="0" w:color="D9D9D9"/>
-              <w:right w:val="single" w:sz="5" w:space="0" w:color="D9D9D9"/>
-            </w:tcBorders>
-            <w:shd w:val="clear" w:color="auto" w:fill="FFFFFF"/>
-            <w:tcMar>
-              <w:top w:w="90" w:type="dxa"/>
-              <w:left w:w="110" w:type="dxa"/>
-              <w:bottom w:w="90" w:type="dxa"/>
-              <w:right w:w="110" w:type="dxa"/>
-            </w:tcMar>
-            <w:vAlign w:val="center"/>
-          </w:tcPr>
-          <w:p>
-            <w:pPr>
-              <w:spacing w:after="40"/>
-            </w:pPr>
-            <w:r>
-              <w:rPr>
-                <w:b/>
-                <w:sz w:val="21"/>
-              </w:rPr>
-              <w:lastRenderedPageBreak/>
-              <w:t>SPPR calculation</w:t>
-            </w:r>
-          </w:p>
-        </w:tc>
-        <w:tc>
-          <w:tcPr>
-            <w:tcW w:w="8237" w:type="dxa"/>
-            <w:tcBorders>
-              <w:top w:val="single" w:sz="5" w:space="0" w:color="D9D9D9"/>
-              <w:left w:val="single" w:sz="5" w:space="0" w:color="D9D9D9"/>
-              <w:bottom w:val="single" w:sz="5" w:space="0" w:color="D9D9D9"/>
-              <w:right w:val="single" w:sz="5" w:space="0" w:color="D9D9D9"/>
-            </w:tcBorders>
-            <w:shd w:val="clear" w:color="auto" w:fill="FFFFFF"/>
-            <w:tcMar>
-              <w:top w:w="90" w:type="dxa"/>
-              <w:left w:w="110" w:type="dxa"/>
-              <w:bottom w:w="90" w:type="dxa"/>
-              <w:right w:w="110" w:type="dxa"/>
-            </w:tcMar>
-            <w:vAlign w:val="center"/>
-          </w:tcPr>
-          <w:p>
-            <w:pPr>
-              <w:spacing w:after="40"/>
-              <w:rPr>
-                <w:sz w:val="21"/>
-              </w:rPr>
-            </w:pPr>
-            <w:r>
-              <w:rPr>
-                <w:sz w:val="21"/>
-              </w:rPr>
-              <w:t>Removed groups from calculation:</w:t>
-            </w:r>
-          </w:p>
-          <w:p>
-            <w:pPr>
-              <w:pStyle w:val="ae"/>
-              <w:numPr>
-                <w:ilvl w:val="0"/>
-                <w:numId w:val="10"/>
-              </w:numPr>
-              <w:spacing w:after="40"/>
-            </w:pPr>
-            <w:r>
-              <w:t>seabirds (TE&lt;0.1%, TL=3.4, sppr_TE=3.75M, sppr_GE=21K)</w:t>
-            </w:r>
-          </w:p>
-          <w:p>
-            <w:pPr>
-              <w:pStyle w:val="ae"/>
-              <w:numPr>
-                <w:ilvl w:val="0"/>
-                <w:numId w:val="10"/>
-              </w:numPr>
-              <w:spacing w:after="40"/>
-            </w:pPr>
-            <w:r>
-              <w:t>other mammals (TE&lt;0.1%, TL=3.9, sppr_TE=800K, sppr_GE=13K)</w:t>
-            </w:r>
-          </w:p>
-          <w:p>
-            <w:pPr>
-              <w:pStyle w:val="ae"/>
-              <w:numPr>
-                <w:ilvl w:val="0"/>
-                <w:numId w:val="10"/>
-              </w:numPr>
-              <w:spacing w:after="40"/>
-            </w:pPr>
-            <w:r>
-              <w:t>Pinnipeds (TE&lt;0.1%, TL=4.1, sppr_TE=340K, sppr_GE=3400)</w:t>
-            </w:r>
-          </w:p>
-          <w:p>
-            <w:pPr>
-              <w:pStyle w:val="ae"/>
-              <w:numPr>
-                <w:ilvl w:val="0"/>
-                <w:numId w:val="10"/>
-              </w:numPr>
-              <w:spacing w:after="40"/>
-            </w:pPr>
-            <w:r>
-              <w:t>Marine Turtles (TE&lt;1%, TL=3, sppr_TE=20K, sppr_GE=724)</w:t>
-            </w:r>
-          </w:p>
-        </w:tc>
-      </w:tr>
-    </w:tbl>
-    <w:p/>
-    <w:tbl>
-      <w:tblPr>
-        <w:tblW w:w="0" w:type="auto"/>
-        <w:jc w:val="center"/>
-        <w:tblLayout w:type="fixed"/>
-        <w:tblLook w:val="04A0" w:firstRow="1" w:lastRow="0" w:firstColumn="1" w:lastColumn="0" w:noHBand="0" w:noVBand="1"/>
-      </w:tblPr>
-      <w:tblGrid>
-        <w:gridCol w:w="2203"/>
-        <w:gridCol w:w="7834"/>
-      </w:tblGrid>
-      <w:tr>
-        <w:trPr>
-          <w:cantSplit/>
-          <w:tblHeader/>
-          <w:jc w:val="center"/>
-        </w:trPr>
-        <w:tc>
-          <w:tcPr>
-            <w:tcW w:w="2203" w:type="dxa"/>
-            <w:tcBorders>
-              <w:top w:val="single" w:sz="5" w:space="0" w:color="D9D9D9"/>
-              <w:left w:val="single" w:sz="5" w:space="0" w:color="D9D9D9"/>
-              <w:bottom w:val="single" w:sz="5" w:space="0" w:color="D9D9D9"/>
-              <w:right w:val="single" w:sz="5" w:space="0" w:color="D9D9D9"/>
-            </w:tcBorders>
-            <w:shd w:val="clear" w:color="auto" w:fill="E5ECF0"/>
-            <w:tcMar>
-              <w:top w:w="90" w:type="dxa"/>
-              <w:left w:w="110" w:type="dxa"/>
-              <w:bottom w:w="90" w:type="dxa"/>
-              <w:right w:w="110" w:type="dxa"/>
-            </w:tcMar>
-            <w:vAlign w:val="center"/>
-          </w:tcPr>
-          <w:p>
-            <w:pPr>
-              <w:spacing w:after="40"/>
-            </w:pPr>
-            <w:r>
-              <w:rPr>
-                <w:b/>
-                <w:sz w:val="21"/>
-              </w:rPr>
-              <w:t>Field</w:t>
-            </w:r>
-          </w:p>
-        </w:tc>
-        <w:tc>
-          <w:tcPr>
-            <w:tcW w:w="7834" w:type="dxa"/>
-            <w:tcBorders>
-              <w:top w:val="single" w:sz="5" w:space="0" w:color="D9D9D9"/>
-              <w:left w:val="single" w:sz="5" w:space="0" w:color="D9D9D9"/>
-              <w:bottom w:val="single" w:sz="5" w:space="0" w:color="D9D9D9"/>
-              <w:right w:val="single" w:sz="5" w:space="0" w:color="D9D9D9"/>
-            </w:tcBorders>
-            <w:shd w:val="clear" w:color="auto" w:fill="E5ECF0"/>
-            <w:tcMar>
-              <w:top w:w="90" w:type="dxa"/>
-              <w:left w:w="110" w:type="dxa"/>
-              <w:bottom w:w="90" w:type="dxa"/>
-              <w:right w:w="110" w:type="dxa"/>
-            </w:tcMar>
-            <w:vAlign w:val="center"/>
-          </w:tcPr>
-          <w:p>
-            <w:pPr>
-              <w:spacing w:after="45" w:line="240" w:lineRule="auto"/>
-            </w:pPr>
-            <w:r>
-              <w:rPr>
-                <w:b/>
-                <w:color w:val="000000"/>
-                <w:sz w:val="21"/>
-              </w:rPr>
-              <w:t>Entry</w:t>
             </w:r>
           </w:p>
         </w:tc>
@@ -1443,13 +957,14 @@
                 <w:b/>
                 <w:sz w:val="21"/>
               </w:rPr>
-              <w:t>GE diagnostics</w:t>
+              <w:t>Selection rationale</w:t>
             </w:r>
           </w:p>
         </w:tc>
         <w:tc>
           <w:tcPr>
-            <w:tcW w:w="7834" w:type="dxa"/>
+            <w:tcW w:w="8237" w:type="dxa"/>
+            <w:gridSpan w:val="2"/>
             <w:tcBorders>
               <w:top w:val="single" w:sz="5" w:space="0" w:color="D9D9D9"/>
               <w:left w:val="single" w:sz="5" w:space="0" w:color="D9D9D9"/>
@@ -1467,14 +982,35 @@
           </w:tcPr>
           <w:p>
             <w:pPr>
-              <w:spacing w:after="45" w:line="240" w:lineRule="auto"/>
+              <w:spacing w:after="40"/>
+              <w:rPr>
+                <w:sz w:val="21"/>
+              </w:rPr>
             </w:pPr>
             <w:r>
               <w:rPr>
-                <w:color w:val="000000"/>
                 <w:sz w:val="21"/>
               </w:rPr>
-              <w:t xml:space="preserve">WARN: near-zero efficiency in seabirds (34). No negative SPPR across basal-source columns. rho_living = 0.3209187537609611; b = 0.00408138212364339. Detritus (38): SPPR = 1.007782936216668. Strict model and SPPR balance flags are true.</w:t>
+              <w:t xml:space="preserve">Article </w:t>
+            </w:r>
+            <w:proofErr w:type="gramStart"/>
+            <w:r>
+              <w:rPr>
+                <w:sz w:val="21"/>
+              </w:rPr>
+              <w:t>– ?</w:t>
+            </w:r>
+            <w:proofErr w:type="gramEnd"/>
+          </w:p>
+          <w:p>
+            <w:pPr>
+              <w:spacing w:after="40"/>
+            </w:pPr>
+            <w:r>
+              <w:rPr>
+                <w:sz w:val="21"/>
+              </w:rPr>
+              <w:t>Model – newer model (2000 vs 1970)</w:t>
             </w:r>
           </w:p>
         </w:tc>
@@ -1511,13 +1047,14 @@
                 <w:b/>
                 <w:sz w:val="21"/>
               </w:rPr>
-              <w:t>TE diagnostics</w:t>
+              <w:t>Model extraction</w:t>
             </w:r>
           </w:p>
         </w:tc>
         <w:tc>
           <w:tcPr>
-            <w:tcW w:w="7834" w:type="dxa"/>
+            <w:tcW w:w="8237" w:type="dxa"/>
+            <w:gridSpan w:val="2"/>
             <w:tcBorders>
               <w:top w:val="single" w:sz="5" w:space="0" w:color="D9D9D9"/>
               <w:left w:val="single" w:sz="5" w:space="0" w:color="D9D9D9"/>
@@ -1535,14 +1072,177 @@
           </w:tcPr>
           <w:p>
             <w:pPr>
-              <w:spacing w:after="45" w:line="240" w:lineRule="auto"/>
+              <w:spacing w:after="40"/>
+              <w:rPr>
+                <w:sz w:val="21"/>
+              </w:rPr>
             </w:pPr>
-            <w:r>
-              <w:rPr>
-                <w:color w:val="000000"/>
+            <w:hyperlink r:id="rId26">
+              <w:r>
+                <w:rPr>
+                  <w:color w:val="0563C1"/>
+                  <w:sz w:val="21"/>
+                  <w:u w:val="single"/>
+                </w:rPr>
+                <w:t>source reconstruction report</w:t>
+              </w:r>
+            </w:hyperlink>
+            <w:r>
+              <w:rPr>
                 <w:sz w:val="21"/>
               </w:rPr>
-              <w:t xml:space="preserve">WARN: near-zero efficiency in seabirds, other mammals and pinnipeds (34–36). No negative SPPR across basal-source columns. rho_living = 0.6163296517365333. Detritus (38): SPPR = 0.995222499887902. Strict model and SPPR balance flags are true.</w:t>
+              <w:t xml:space="preserve"> </w:t>
+            </w:r>
+          </w:p>
+          <w:p>
+            <w:pPr>
+              <w:pStyle w:val="ae"/>
+              <w:numPr>
+                <w:ilvl w:val="0"/>
+                <w:numId w:val="10"/>
+              </w:numPr>
+              <w:spacing w:after="40"/>
+              <w:rPr>
+                <w:sz w:val="21"/>
+              </w:rPr>
+            </w:pPr>
+            <w:r>
+              <w:rPr>
+                <w:sz w:val="21"/>
+              </w:rPr>
+              <w:t>several internal conflicts within the paper</w:t>
+            </w:r>
+            <w:r>
+              <w:rPr>
+                <w:sz w:val="21"/>
+              </w:rPr>
+              <w:t>.</w:t>
+            </w:r>
+            <w:r>
+              <w:rPr>
+                <w:sz w:val="21"/>
+              </w:rPr>
+              <w:t xml:space="preserve"> </w:t>
+            </w:r>
+            <w:hyperlink r:id="rId27">
+              <w:r>
+                <w:rPr>
+                  <w:color w:val="0563C1"/>
+                  <w:sz w:val="21"/>
+                  <w:u w:val="single"/>
+                </w:rPr>
+                <w:t>Full conflict report</w:t>
+              </w:r>
+            </w:hyperlink>
+            <w:r>
+              <w:rPr>
+                <w:sz w:val="21"/>
+              </w:rPr>
+              <w:t>.</w:t>
+            </w:r>
+          </w:p>
+          <w:p>
+            <w:pPr>
+              <w:pStyle w:val="ae"/>
+              <w:numPr>
+                <w:ilvl w:val="0"/>
+                <w:numId w:val="10"/>
+              </w:numPr>
+              <w:spacing w:after="40"/>
+              <w:rPr>
+                <w:sz w:val="21"/>
+              </w:rPr>
+            </w:pPr>
+            <w:r>
+              <w:rPr>
+                <w:sz w:val="21"/>
+              </w:rPr>
+              <w:t>Diet Sums – only rounding errors.</w:t>
+            </w:r>
+            <w:r>
+              <w:rPr>
+                <w:sz w:val="21"/>
+              </w:rPr>
+              <w:br/>
+            </w:r>
+            <w:r>
+              <w:rPr>
+                <w:sz w:val="21"/>
+              </w:rPr>
+              <w:t>max error = 0.0011, group 33 (Pelagic sharks and rays).</w:t>
+            </w:r>
+          </w:p>
+          <w:p>
+            <w:pPr>
+              <w:pStyle w:val="ae"/>
+              <w:numPr>
+                <w:ilvl w:val="0"/>
+                <w:numId w:val="10"/>
+              </w:numPr>
+              <w:spacing w:after="40"/>
+              <w:rPr>
+                <w:sz w:val="21"/>
+              </w:rPr>
+            </w:pPr>
+            <w:r>
+              <w:rPr>
+                <w:sz w:val="21"/>
+              </w:rPr>
+              <w:t xml:space="preserve">GS not reported; </w:t>
+            </w:r>
+            <w:r>
+              <w:rPr>
+                <w:sz w:val="21"/>
+              </w:rPr>
+              <w:t>default runtime values are filled.</w:t>
+            </w:r>
+          </w:p>
+          <w:p>
+            <w:pPr>
+              <w:pStyle w:val="ae"/>
+              <w:numPr>
+                <w:ilvl w:val="0"/>
+                <w:numId w:val="10"/>
+              </w:numPr>
+              <w:spacing w:after="40"/>
+              <w:rPr>
+                <w:sz w:val="21"/>
+              </w:rPr>
+            </w:pPr>
+            <w:r>
+              <w:rPr>
+                <w:sz w:val="21"/>
+              </w:rPr>
+              <w:t>BA not reported; auto completed through LIM</w:t>
+            </w:r>
+          </w:p>
+          <w:p>
+            <w:pPr>
+              <w:pStyle w:val="ae"/>
+              <w:numPr>
+                <w:ilvl w:val="0"/>
+                <w:numId w:val="10"/>
+              </w:numPr>
+              <w:spacing w:after="40"/>
+              <w:rPr>
+                <w:sz w:val="21"/>
+              </w:rPr>
+            </w:pPr>
+            <w:hyperlink r:id="rId28">
+              <w:r>
+                <w:rPr>
+                  <w:color w:val="0563C1"/>
+                  <w:sz w:val="21"/>
+                  <w:u w:val="single"/>
+                </w:rPr>
+                <w:t>state comparison</w:t>
+              </w:r>
+            </w:hyperlink>
+            <w:r>
+              <w:rPr>
+                <w:sz w:val="21"/>
+              </w:rPr>
+              <w:t>.</w:t>
             </w:r>
           </w:p>
         </w:tc>
@@ -1579,13 +1279,15 @@
                 <w:b/>
                 <w:sz w:val="21"/>
               </w:rPr>
-              <w:t>Geographic fit</w:t>
+              <w:lastRenderedPageBreak/>
+              <w:t>GE diagnostics</w:t>
             </w:r>
           </w:p>
         </w:tc>
         <w:tc>
           <w:tcPr>
-            <w:tcW w:w="7834" w:type="dxa"/>
+            <w:tcW w:w="8237" w:type="dxa"/>
+            <w:gridSpan w:val="2"/>
             <w:tcBorders>
               <w:top w:val="single" w:sz="5" w:space="0" w:color="D9D9D9"/>
               <w:left w:val="single" w:sz="5" w:space="0" w:color="D9D9D9"/>
@@ -1604,25 +1306,102 @@
           <w:p>
             <w:pPr>
               <w:spacing w:after="45" w:line="240" w:lineRule="auto"/>
-            </w:pPr>
-            <w:r>
               <w:rPr>
                 <w:color w:val="000000"/>
                 <w:sz w:val="21"/>
               </w:rPr>
-              <w:t>A. Region covered by study: approximately 15–25%.</w:t>
+            </w:pPr>
+            <w:r>
+              <w:rPr>
+                <w:color w:val="000000"/>
+                <w:sz w:val="21"/>
+              </w:rPr>
+              <w:t>WARN: near-zero efficiency in (34) seabirds (GE&lt;0.01%) and Pinnipeds (GE&lt;0.1%)</w:t>
             </w:r>
           </w:p>
           <w:p>
             <w:pPr>
               <w:spacing w:after="45" w:line="240" w:lineRule="auto"/>
-            </w:pPr>
-            <w:r>
               <w:rPr>
                 <w:color w:val="000000"/>
                 <w:sz w:val="21"/>
               </w:rPr>
-              <w:t>B. Study area covered by region: approximately 90–100%.</w:t>
+            </w:pPr>
+            <w:r>
+              <w:rPr>
+                <w:color w:val="000000"/>
+                <w:sz w:val="21"/>
+              </w:rPr>
+              <w:t xml:space="preserve">No negative SPPR across basal-source columns. </w:t>
+            </w:r>
+          </w:p>
+          <w:p>
+            <w:pPr>
+              <w:spacing w:after="45" w:line="240" w:lineRule="auto"/>
+              <w:rPr>
+                <w:color w:val="000000"/>
+                <w:sz w:val="21"/>
+              </w:rPr>
+            </w:pPr>
+            <w:proofErr w:type="spellStart"/>
+            <w:r>
+              <w:rPr>
+                <w:color w:val="000000"/>
+                <w:sz w:val="21"/>
+              </w:rPr>
+              <w:t>rho_living</w:t>
+            </w:r>
+            <w:proofErr w:type="spellEnd"/>
+            <w:r>
+              <w:rPr>
+                <w:color w:val="000000"/>
+                <w:sz w:val="21"/>
+              </w:rPr>
+              <w:t xml:space="preserve"> = 0.32</w:t>
+            </w:r>
+          </w:p>
+          <w:p>
+            <w:pPr>
+              <w:spacing w:after="45" w:line="240" w:lineRule="auto"/>
+              <w:rPr>
+                <w:color w:val="000000"/>
+                <w:sz w:val="21"/>
+              </w:rPr>
+            </w:pPr>
+            <w:r>
+              <w:rPr>
+                <w:color w:val="000000"/>
+                <w:sz w:val="21"/>
+              </w:rPr>
+              <w:t>b = 0.004</w:t>
+            </w:r>
+          </w:p>
+          <w:p>
+            <w:pPr>
+              <w:spacing w:after="45" w:line="240" w:lineRule="auto"/>
+              <w:rPr>
+                <w:color w:val="000000"/>
+                <w:sz w:val="21"/>
+              </w:rPr>
+            </w:pPr>
+            <w:r>
+              <w:rPr>
+                <w:color w:val="000000"/>
+                <w:sz w:val="21"/>
+              </w:rPr>
+              <w:t xml:space="preserve">Detritus (38): SPPR = 1.008. </w:t>
+            </w:r>
+          </w:p>
+          <w:p>
+            <w:pPr>
+              <w:spacing w:after="40"/>
+            </w:pPr>
+            <w:r>
+              <w:rPr>
+                <w:color w:val="000000"/>
+                <w:sz w:val="21"/>
+              </w:rPr>
+              <w:t>Sppr calculation is balanced (inflow=outflow).</w:t>
             </w:r>
           </w:p>
         </w:tc>
@@ -1653,19 +1432,24 @@
           <w:p>
             <w:pPr>
               <w:spacing w:after="40"/>
-            </w:pPr>
-            <w:r>
               <w:rPr>
                 <w:b/>
                 <w:sz w:val="21"/>
               </w:rPr>
-              <w:t>Temporal fit</w:t>
+            </w:pPr>
+            <w:r>
+              <w:rPr>
+                <w:b/>
+                <w:sz w:val="21"/>
+              </w:rPr>
+              <w:t>TE diagnostics</w:t>
             </w:r>
           </w:p>
         </w:tc>
         <w:tc>
           <w:tcPr>
-            <w:tcW w:w="7834" w:type="dxa"/>
+            <w:tcW w:w="8237" w:type="dxa"/>
+            <w:gridSpan w:val="2"/>
             <w:tcBorders>
               <w:top w:val="single" w:sz="5" w:space="0" w:color="D9D9D9"/>
               <w:left w:val="single" w:sz="5" w:space="0" w:color="D9D9D9"/>
@@ -1684,12 +1468,88 @@
           <w:p>
             <w:pPr>
               <w:spacing w:after="40"/>
+              <w:rPr>
+                <w:sz w:val="21"/>
+              </w:rPr>
             </w:pPr>
             <w:r>
               <w:rPr>
+                <w:color w:val="000000"/>
                 <w:sz w:val="21"/>
               </w:rPr>
-              <w:t>Model period: 2000s (no verified single model year). Fixed coefficients and stage weights are applied to catch years 1950–2019, including the 2019 reference. They do not reconstruct annual ecosystems and transfer a northern-shelf model to whole-LME catch.</w:t>
+              <w:t>WARN: near-zero efficiency in seabirds, other mammals and pinnipeds (34–36).</w:t>
+            </w:r>
+          </w:p>
+          <w:p>
+            <w:pPr>
+              <w:spacing w:after="45" w:line="240" w:lineRule="auto"/>
+              <w:rPr>
+                <w:color w:val="000000"/>
+                <w:sz w:val="21"/>
+              </w:rPr>
+            </w:pPr>
+            <w:r>
+              <w:rPr>
+                <w:color w:val="000000"/>
+                <w:sz w:val="21"/>
+              </w:rPr>
+              <w:t>No negative SPPR across basal-source columns.</w:t>
+            </w:r>
+          </w:p>
+          <w:p>
+            <w:pPr>
+              <w:spacing w:after="45" w:line="240" w:lineRule="auto"/>
+              <w:rPr>
+                <w:color w:val="000000"/>
+                <w:sz w:val="21"/>
+              </w:rPr>
+            </w:pPr>
+            <w:proofErr w:type="spellStart"/>
+            <w:r>
+              <w:rPr>
+                <w:color w:val="000000"/>
+                <w:sz w:val="21"/>
+              </w:rPr>
+              <w:t>rho_living</w:t>
+            </w:r>
+            <w:proofErr w:type="spellEnd"/>
+            <w:r>
+              <w:rPr>
+                <w:color w:val="000000"/>
+                <w:sz w:val="21"/>
+              </w:rPr>
+              <w:t xml:space="preserve"> = 0.616. </w:t>
+            </w:r>
+          </w:p>
+          <w:p>
+            <w:pPr>
+              <w:spacing w:after="45" w:line="240" w:lineRule="auto"/>
+              <w:rPr>
+                <w:color w:val="000000"/>
+                <w:sz w:val="21"/>
+              </w:rPr>
+            </w:pPr>
+            <w:r>
+              <w:rPr>
+                <w:color w:val="000000"/>
+                <w:sz w:val="21"/>
+              </w:rPr>
+              <w:t xml:space="preserve">Detritus (38): SPPR = 0.995. </w:t>
+            </w:r>
+          </w:p>
+          <w:p>
+            <w:pPr>
+              <w:spacing w:after="40"/>
+              <w:rPr>
+                <w:sz w:val="21"/>
+              </w:rPr>
+            </w:pPr>
+            <w:r>
+              <w:rPr>
+                <w:color w:val="000000"/>
+                <w:sz w:val="21"/>
+              </w:rPr>
+              <w:t>Sppr calculation is balanced (inflow=outflow).</w:t>
             </w:r>
           </w:p>
         </w:tc>
@@ -1720,13 +1580,459 @@
           <w:p>
             <w:pPr>
               <w:spacing w:after="40"/>
-            </w:pPr>
-            <w:r>
               <w:rPr>
                 <w:b/>
                 <w:sz w:val="21"/>
               </w:rPr>
+            </w:pPr>
+            <w:r>
+              <w:rPr>
+                <w:b/>
+                <w:sz w:val="21"/>
+              </w:rPr>
+              <w:t>SPPR calculation</w:t>
+            </w:r>
+          </w:p>
+        </w:tc>
+        <w:tc>
+          <w:tcPr>
+            <w:tcW w:w="8237" w:type="dxa"/>
+            <w:gridSpan w:val="2"/>
+            <w:tcBorders>
+              <w:top w:val="single" w:sz="5" w:space="0" w:color="D9D9D9"/>
+              <w:left w:val="single" w:sz="5" w:space="0" w:color="D9D9D9"/>
+              <w:bottom w:val="single" w:sz="5" w:space="0" w:color="D9D9D9"/>
+              <w:right w:val="single" w:sz="5" w:space="0" w:color="D9D9D9"/>
+            </w:tcBorders>
+            <w:shd w:val="clear" w:color="auto" w:fill="FFFFFF"/>
+            <w:tcMar>
+              <w:top w:w="90" w:type="dxa"/>
+              <w:left w:w="110" w:type="dxa"/>
+              <w:bottom w:w="90" w:type="dxa"/>
+              <w:right w:w="110" w:type="dxa"/>
+            </w:tcMar>
+            <w:vAlign w:val="center"/>
+          </w:tcPr>
+          <w:p>
+            <w:pPr>
+              <w:spacing w:after="40"/>
+              <w:rPr>
+                <w:sz w:val="21"/>
+              </w:rPr>
+            </w:pPr>
+            <w:r>
+              <w:rPr>
+                <w:sz w:val="21"/>
+              </w:rPr>
+              <w:t>Model-input is mass-balanced.</w:t>
+            </w:r>
+          </w:p>
+          <w:p>
+            <w:pPr>
+              <w:spacing w:after="40"/>
+              <w:rPr>
+                <w:sz w:val="21"/>
+              </w:rPr>
+            </w:pPr>
+            <w:r>
+              <w:rPr>
+                <w:sz w:val="21"/>
+              </w:rPr>
+              <w:t>DC rows sum to 1.</w:t>
+            </w:r>
+          </w:p>
+          <w:p>
+            <w:pPr>
+              <w:spacing w:after="40"/>
+              <w:rPr>
+                <w:sz w:val="21"/>
+              </w:rPr>
+            </w:pPr>
+          </w:p>
+          <w:p>
+            <w:pPr>
+              <w:spacing w:after="40"/>
+              <w:rPr>
+                <w:sz w:val="21"/>
+              </w:rPr>
+            </w:pPr>
+            <w:r>
+              <w:rPr>
+                <w:sz w:val="21"/>
+              </w:rPr>
+              <w:t>Removed groups from calculation:</w:t>
+            </w:r>
+          </w:p>
+          <w:p>
+            <w:pPr>
+              <w:pStyle w:val="ae"/>
+              <w:numPr>
+                <w:ilvl w:val="0"/>
+                <w:numId w:val="10"/>
+              </w:numPr>
+              <w:spacing w:after="40"/>
+            </w:pPr>
+            <w:r>
+              <w:t xml:space="preserve">seabirds (GE&lt;0.01%, EE=5%, TL=3.4, </w:t>
+            </w:r>
+            <w:proofErr w:type="spellStart"/>
+            <w:r>
+              <w:t>sppr_TE</w:t>
+            </w:r>
+            <w:proofErr w:type="spellEnd"/>
+            <w:r>
+              <w:t xml:space="preserve">=3.75M, </w:t>
+            </w:r>
+            <w:proofErr w:type="spellStart"/>
+            <w:r>
+              <w:t>sppr_GE</w:t>
+            </w:r>
+            <w:proofErr w:type="spellEnd"/>
+            <w:r>
+              <w:t>=21K)</w:t>
+            </w:r>
+          </w:p>
+          <w:p>
+            <w:pPr>
+              <w:pStyle w:val="ae"/>
+              <w:numPr>
+                <w:ilvl w:val="0"/>
+                <w:numId w:val="10"/>
+              </w:numPr>
+              <w:spacing w:after="40"/>
+            </w:pPr>
+            <w:r>
+              <w:t xml:space="preserve">Pinnipeds (GE&lt;0.1%, EE=30%, TL=4.1, </w:t>
+            </w:r>
+            <w:proofErr w:type="spellStart"/>
+            <w:r>
+              <w:t>sppr_TE</w:t>
+            </w:r>
+            <w:proofErr w:type="spellEnd"/>
+            <w:r>
+              <w:t xml:space="preserve">=340K, </w:t>
+            </w:r>
+            <w:proofErr w:type="spellStart"/>
+            <w:r>
+              <w:t>sppr_GE</w:t>
+            </w:r>
+            <w:proofErr w:type="spellEnd"/>
+            <w:r>
+              <w:t>=3400)</w:t>
+            </w:r>
+          </w:p>
+          <w:p>
+            <w:pPr>
+              <w:pStyle w:val="ae"/>
+              <w:numPr>
+                <w:ilvl w:val="0"/>
+                <w:numId w:val="10"/>
+              </w:numPr>
+              <w:spacing w:after="40"/>
+            </w:pPr>
+            <w:r>
+              <w:t xml:space="preserve">other mammals (GE=1%, EE=3%, TL=3.9, </w:t>
+            </w:r>
+            <w:proofErr w:type="spellStart"/>
+            <w:r>
+              <w:t>sppr_TE</w:t>
+            </w:r>
+            <w:proofErr w:type="spellEnd"/>
+            <w:r>
+              <w:t xml:space="preserve">=800K, </w:t>
+            </w:r>
+            <w:proofErr w:type="spellStart"/>
+            <w:r>
+              <w:t>sppr_GE</w:t>
+            </w:r>
+            <w:proofErr w:type="spellEnd"/>
+            <w:r>
+              <w:t>=13K)</w:t>
+            </w:r>
+          </w:p>
+          <w:p>
+            <w:pPr>
+              <w:pStyle w:val="ae"/>
+              <w:numPr>
+                <w:ilvl w:val="0"/>
+                <w:numId w:val="10"/>
+              </w:numPr>
+              <w:spacing w:after="40"/>
+              <w:rPr>
+                <w:sz w:val="21"/>
+              </w:rPr>
+            </w:pPr>
+            <w:r>
+              <w:t xml:space="preserve">Marine Turtles (GE=3%, EE=30%, TL=3, </w:t>
+            </w:r>
+            <w:proofErr w:type="spellStart"/>
+            <w:r>
+              <w:t>sppr_TE</w:t>
+            </w:r>
+            <w:proofErr w:type="spellEnd"/>
+            <w:r>
+              <w:t xml:space="preserve">=20K, </w:t>
+            </w:r>
+            <w:proofErr w:type="spellStart"/>
+            <w:r>
+              <w:t>sppr_GE</w:t>
+            </w:r>
+            <w:proofErr w:type="spellEnd"/>
+            <w:r>
+              <w:t>=724)</w:t>
+            </w:r>
+          </w:p>
+        </w:tc>
+      </w:tr>
+      <w:tr>
+        <w:trPr>
+          <w:gridAfter w:val="1"/>
+          <w:wAfter w:w="403" w:type="dxa"/>
+          <w:cantSplit/>
+          <w:jc w:val="center"/>
+        </w:trPr>
+        <w:tc>
+          <w:tcPr>
+            <w:tcW w:w="2203" w:type="dxa"/>
+            <w:tcBorders>
+              <w:top w:val="single" w:sz="5" w:space="0" w:color="D9D9D9"/>
+              <w:left w:val="single" w:sz="5" w:space="0" w:color="D9D9D9"/>
+              <w:bottom w:val="single" w:sz="5" w:space="0" w:color="D9D9D9"/>
+              <w:right w:val="single" w:sz="5" w:space="0" w:color="D9D9D9"/>
+            </w:tcBorders>
+            <w:shd w:val="clear" w:color="auto" w:fill="FFFFFF"/>
+            <w:tcMar>
+              <w:top w:w="90" w:type="dxa"/>
+              <w:left w:w="110" w:type="dxa"/>
+              <w:bottom w:w="90" w:type="dxa"/>
+              <w:right w:w="110" w:type="dxa"/>
+            </w:tcMar>
+            <w:vAlign w:val="center"/>
+          </w:tcPr>
+          <w:p>
+            <w:pPr>
+              <w:spacing w:after="40"/>
+            </w:pPr>
+            <w:r>
+              <w:rPr>
+                <w:b/>
+                <w:sz w:val="21"/>
+              </w:rPr>
+              <w:t>Geographic fit</w:t>
+            </w:r>
+          </w:p>
+        </w:tc>
+        <w:tc>
+          <w:tcPr>
+            <w:tcW w:w="7834" w:type="dxa"/>
+            <w:tcBorders>
+              <w:top w:val="single" w:sz="5" w:space="0" w:color="D9D9D9"/>
+              <w:left w:val="single" w:sz="5" w:space="0" w:color="D9D9D9"/>
+              <w:bottom w:val="single" w:sz="5" w:space="0" w:color="D9D9D9"/>
+              <w:right w:val="single" w:sz="5" w:space="0" w:color="D9D9D9"/>
+            </w:tcBorders>
+            <w:shd w:val="clear" w:color="auto" w:fill="FFFFFF"/>
+            <w:tcMar>
+              <w:top w:w="90" w:type="dxa"/>
+              <w:left w:w="110" w:type="dxa"/>
+              <w:bottom w:w="90" w:type="dxa"/>
+              <w:right w:w="110" w:type="dxa"/>
+            </w:tcMar>
+            <w:vAlign w:val="center"/>
+          </w:tcPr>
+          <w:p>
+            <w:pPr>
+              <w:spacing w:after="45" w:line="240" w:lineRule="auto"/>
+            </w:pPr>
+            <w:r>
+              <w:rPr>
+                <w:color w:val="000000"/>
+                <w:sz w:val="21"/>
+              </w:rPr>
+              <w:t>A. Region covered by study: approximately 15–25%.</w:t>
+            </w:r>
+          </w:p>
+          <w:p>
+            <w:pPr>
+              <w:spacing w:after="45" w:line="240" w:lineRule="auto"/>
+            </w:pPr>
+            <w:r>
+              <w:rPr>
+                <w:color w:val="000000"/>
+                <w:sz w:val="21"/>
+              </w:rPr>
+              <w:t>B. Study area covered by region: approximately 90–100%.</w:t>
+            </w:r>
+          </w:p>
+        </w:tc>
+      </w:tr>
+      <w:tr>
+        <w:trPr>
+          <w:gridAfter w:val="1"/>
+          <w:wAfter w:w="403" w:type="dxa"/>
+          <w:cantSplit/>
+          <w:jc w:val="center"/>
+        </w:trPr>
+        <w:tc>
+          <w:tcPr>
+            <w:tcW w:w="2203" w:type="dxa"/>
+            <w:tcBorders>
+              <w:top w:val="single" w:sz="5" w:space="0" w:color="D9D9D9"/>
+              <w:left w:val="single" w:sz="5" w:space="0" w:color="D9D9D9"/>
+              <w:bottom w:val="single" w:sz="5" w:space="0" w:color="D9D9D9"/>
+              <w:right w:val="single" w:sz="5" w:space="0" w:color="D9D9D9"/>
+            </w:tcBorders>
+            <w:shd w:val="clear" w:color="auto" w:fill="FFFFFF"/>
+            <w:tcMar>
+              <w:top w:w="90" w:type="dxa"/>
+              <w:left w:w="110" w:type="dxa"/>
+              <w:bottom w:w="90" w:type="dxa"/>
+              <w:right w:w="110" w:type="dxa"/>
+            </w:tcMar>
+            <w:vAlign w:val="center"/>
+          </w:tcPr>
+          <w:p>
+            <w:pPr>
+              <w:spacing w:after="40"/>
+            </w:pPr>
+            <w:r>
+              <w:rPr>
+                <w:b/>
+                <w:sz w:val="21"/>
+              </w:rPr>
+              <w:t>Temporal fit</w:t>
+            </w:r>
+          </w:p>
+        </w:tc>
+        <w:tc>
+          <w:tcPr>
+            <w:tcW w:w="7834" w:type="dxa"/>
+            <w:tcBorders>
+              <w:top w:val="single" w:sz="5" w:space="0" w:color="D9D9D9"/>
+              <w:left w:val="single" w:sz="5" w:space="0" w:color="D9D9D9"/>
+              <w:bottom w:val="single" w:sz="5" w:space="0" w:color="D9D9D9"/>
+              <w:right w:val="single" w:sz="5" w:space="0" w:color="D9D9D9"/>
+            </w:tcBorders>
+            <w:shd w:val="clear" w:color="auto" w:fill="FFFFFF"/>
+            <w:tcMar>
+              <w:top w:w="90" w:type="dxa"/>
+              <w:left w:w="110" w:type="dxa"/>
+              <w:bottom w:w="90" w:type="dxa"/>
+              <w:right w:w="110" w:type="dxa"/>
+            </w:tcMar>
+            <w:vAlign w:val="center"/>
+          </w:tcPr>
+          <w:p>
+            <w:pPr>
+              <w:spacing w:after="40"/>
+            </w:pPr>
+            <w:r>
+              <w:rPr>
+                <w:sz w:val="21"/>
+              </w:rPr>
+              <w:t>Model period: 2000s (no verified single model year). Fixed coefficients and stage weights are applied to catch years 1950–2019, including the 2019 reference. They do not reconstruct annual ecosystems and transfer a northern-shelf model to whole-LME catch.</w:t>
+            </w:r>
+          </w:p>
+        </w:tc>
+      </w:tr>
+      <w:tr>
+        <w:trPr>
+          <w:gridAfter w:val="1"/>
+          <w:wAfter w:w="403" w:type="dxa"/>
+          <w:cantSplit/>
+          <w:jc w:val="center"/>
+        </w:trPr>
+        <w:tc>
+          <w:tcPr>
+            <w:tcW w:w="2203" w:type="dxa"/>
+            <w:tcBorders>
+              <w:top w:val="single" w:sz="5" w:space="0" w:color="D9D9D9"/>
+              <w:left w:val="single" w:sz="5" w:space="0" w:color="D9D9D9"/>
+              <w:bottom w:val="single" w:sz="5" w:space="0" w:color="D9D9D9"/>
+              <w:right w:val="single" w:sz="5" w:space="0" w:color="D9D9D9"/>
+            </w:tcBorders>
+            <w:shd w:val="clear" w:color="auto" w:fill="FFFFFF"/>
+            <w:tcMar>
+              <w:top w:w="90" w:type="dxa"/>
+              <w:left w:w="110" w:type="dxa"/>
+              <w:bottom w:w="90" w:type="dxa"/>
+              <w:right w:w="110" w:type="dxa"/>
+            </w:tcMar>
+            <w:vAlign w:val="center"/>
+          </w:tcPr>
+          <w:p>
+            <w:pPr>
+              <w:spacing w:after="40"/>
+            </w:pPr>
+            <w:r>
+              <w:rPr>
+                <w:b/>
+                <w:sz w:val="21"/>
+              </w:rPr>
               <w:t>Other</w:t>
+            </w:r>
+          </w:p>
+        </w:tc>
+        <w:tc>
+          <w:tcPr>
+            <w:tcW w:w="7834" w:type="dxa"/>
+            <w:tcBorders>
+              <w:top w:val="single" w:sz="5" w:space="0" w:color="D9D9D9"/>
+              <w:left w:val="single" w:sz="5" w:space="0" w:color="D9D9D9"/>
+              <w:bottom w:val="single" w:sz="5" w:space="0" w:color="D9D9D9"/>
+              <w:right w:val="single" w:sz="5" w:space="0" w:color="D9D9D9"/>
+            </w:tcBorders>
+            <w:shd w:val="clear" w:color="auto" w:fill="FFFFFF"/>
+            <w:tcMar>
+              <w:top w:w="90" w:type="dxa"/>
+              <w:left w:w="110" w:type="dxa"/>
+              <w:bottom w:w="90" w:type="dxa"/>
+              <w:right w:w="110" w:type="dxa"/>
+            </w:tcMar>
+            <w:vAlign w:val="center"/>
+          </w:tcPr>
+          <w:p>
+            <w:pPr>
+              <w:spacing w:after="40"/>
+            </w:pPr>
+          </w:p>
+        </w:tc>
+      </w:tr>
+      <w:tr>
+        <w:trPr>
+          <w:gridAfter w:val="1"/>
+          <w:wAfter w:w="403" w:type="dxa"/>
+          <w:cantSplit/>
+          <w:jc w:val="center"/>
+        </w:trPr>
+        <w:tc>
+          <w:tcPr>
+            <w:tcW w:w="2203" w:type="dxa"/>
+            <w:tcBorders>
+              <w:top w:val="single" w:sz="5" w:space="0" w:color="D9D9D9"/>
+              <w:left w:val="single" w:sz="5" w:space="0" w:color="D9D9D9"/>
+              <w:bottom w:val="single" w:sz="5" w:space="0" w:color="D9D9D9"/>
+              <w:right w:val="single" w:sz="5" w:space="0" w:color="D9D9D9"/>
+            </w:tcBorders>
+            <w:shd w:val="clear" w:color="auto" w:fill="FFFFFF"/>
+            <w:tcMar>
+              <w:top w:w="90" w:type="dxa"/>
+              <w:left w:w="110" w:type="dxa"/>
+              <w:bottom w:w="90" w:type="dxa"/>
+              <w:right w:w="110" w:type="dxa"/>
+            </w:tcMar>
+            <w:vAlign w:val="center"/>
+          </w:tcPr>
+          <w:p>
+            <w:pPr>
+              <w:spacing w:after="40"/>
+            </w:pPr>
+            <w:r>
+              <w:rPr>
+                <w:b/>
+                <w:sz w:val="21"/>
+              </w:rPr>
+              <w:t>Open issues and next action</w:t>
             </w:r>
           </w:p>
         </w:tc>
@@ -1758,13 +2064,34 @@
               <w:spacing w:after="40"/>
             </w:pPr>
             <w:r>
-              <w:t xml:space="preserve">The accepted saved and reproduced outputs retain groups 34–37 (seabirds, other mammals, pinnipeds and turtles), all with finite direct SPPR. The researcher removal note describes a different configuration. With Egestion returns OK. All three complete source matrices have no negative or nonfinite entries, including unfished groups.</w:t>
+              <w:rPr>
+                <w:sz w:val="21"/>
+              </w:rPr>
+              <w:t>Test how much SPPR and PPR values change when using the 1970 model.</w:t>
+            </w:r>
+          </w:p>
+          <w:p>
+            <w:pPr>
+              <w:pStyle w:val="ae"/>
+              <w:numPr>
+                <w:ilvl w:val="0"/>
+                <w:numId w:val="10"/>
+              </w:numPr>
+              <w:spacing w:after="40"/>
+            </w:pPr>
+            <w:r>
+              <w:rPr>
+                <w:sz w:val="21"/>
+              </w:rPr>
+              <w:t>Add article selection reason when we review other articles</w:t>
             </w:r>
           </w:p>
         </w:tc>
       </w:tr>
       <w:tr>
         <w:trPr>
+          <w:gridAfter w:val="1"/>
+          <w:wAfter w:w="403" w:type="dxa"/>
           <w:cantSplit/>
           <w:jc w:val="center"/>
         </w:trPr>
@@ -1795,94 +2122,6 @@
                 <w:b/>
                 <w:sz w:val="21"/>
               </w:rPr>
-              <w:t>Open issues and next action</w:t>
-            </w:r>
-          </w:p>
-        </w:tc>
-        <w:tc>
-          <w:tcPr>
-            <w:tcW w:w="7834" w:type="dxa"/>
-            <w:tcBorders>
-              <w:top w:val="single" w:sz="5" w:space="0" w:color="D9D9D9"/>
-              <w:left w:val="single" w:sz="5" w:space="0" w:color="D9D9D9"/>
-              <w:bottom w:val="single" w:sz="5" w:space="0" w:color="D9D9D9"/>
-              <w:right w:val="single" w:sz="5" w:space="0" w:color="D9D9D9"/>
-            </w:tcBorders>
-            <w:shd w:val="clear" w:color="auto" w:fill="FFFFFF"/>
-            <w:tcMar>
-              <w:top w:w="90" w:type="dxa"/>
-              <w:left w:w="110" w:type="dxa"/>
-              <w:bottom w:w="90" w:type="dxa"/>
-              <w:right w:w="110" w:type="dxa"/>
-            </w:tcMar>
-            <w:vAlign w:val="center"/>
-          </w:tcPr>
-          <w:p>
-            <w:pPr>
-              <w:pStyle w:val="ae"/>
-              <w:numPr>
-                <w:ilvl w:val="0"/>
-                <w:numId w:val="10"/>
-              </w:numPr>
-              <w:spacing w:after="40"/>
-            </w:pPr>
-            <w:r>
-              <w:rPr>
-                <w:sz w:val="21"/>
-              </w:rPr>
-              <w:t>Test how much SPPR and PPR values change when using the 1970 model.</w:t>
-            </w:r>
-          </w:p>
-          <w:p>
-            <w:pPr>
-              <w:pStyle w:val="ae"/>
-              <w:numPr>
-                <w:ilvl w:val="0"/>
-                <w:numId w:val="10"/>
-              </w:numPr>
-              <w:spacing w:after="40"/>
-            </w:pPr>
-            <w:r>
-              <w:rPr>
-                <w:sz w:val="21"/>
-              </w:rPr>
-              <w:t>Add article selection reason when we review other articles</w:t>
-            </w:r>
-          </w:p>
-        </w:tc>
-      </w:tr>
-      <w:tr>
-        <w:trPr>
-          <w:cantSplit/>
-          <w:jc w:val="center"/>
-        </w:trPr>
-        <w:tc>
-          <w:tcPr>
-            <w:tcW w:w="2203" w:type="dxa"/>
-            <w:tcBorders>
-              <w:top w:val="single" w:sz="5" w:space="0" w:color="D9D9D9"/>
-              <w:left w:val="single" w:sz="5" w:space="0" w:color="D9D9D9"/>
-              <w:bottom w:val="single" w:sz="5" w:space="0" w:color="D9D9D9"/>
-              <w:right w:val="single" w:sz="5" w:space="0" w:color="D9D9D9"/>
-            </w:tcBorders>
-            <w:shd w:val="clear" w:color="auto" w:fill="FFFFFF"/>
-            <w:tcMar>
-              <w:top w:w="90" w:type="dxa"/>
-              <w:left w:w="110" w:type="dxa"/>
-              <w:bottom w:w="90" w:type="dxa"/>
-              <w:right w:w="110" w:type="dxa"/>
-            </w:tcMar>
-            <w:vAlign w:val="center"/>
-          </w:tcPr>
-          <w:p>
-            <w:pPr>
-              <w:spacing w:after="40"/>
-            </w:pPr>
-            <w:r>
-              <w:rPr>
-                <w:b/>
-                <w:sz w:val="21"/>
-              </w:rPr>
               <w:t>Review and reproducibility</w:t>
             </w:r>
           </w:p>
@@ -1935,6 +2174,32 @@
                 <w:sz w:val="21"/>
               </w:rPr>
               <w:t>30/09/2026</w:t>
+            </w:r>
+          </w:p>
+          <w:p>
+            <w:pPr>
+              <w:spacing w:after="40"/>
+              <w:rPr>
+                <w:sz w:val="21"/>
+              </w:rPr>
+            </w:pPr>
+          </w:p>
+          <w:p>
+            <w:pPr>
+              <w:spacing w:after="40"/>
+              <w:rPr>
+                <w:b/>
+                <w:bCs/>
+                <w:sz w:val="21"/>
+              </w:rPr>
+            </w:pPr>
+            <w:r>
+              <w:rPr>
+                <w:b/>
+                <w:bCs/>
+                <w:sz w:val="21"/>
+              </w:rPr>
+              <w:t>MODEL VALIDATED</w:t>
             </w:r>
           </w:p>
         </w:tc>
@@ -2032,7 +2297,7 @@
           <w:color w:val="000000"/>
           <w:sz w:val="21"/>
         </w:rPr>
-        <w:t xml:space="preserve"> lack an assigned trophic level have zero landings that year and therefore contribute zero PPR.</w:t>
+        <w:t xml:space="preserve"> lack an assigned trophic level have zero landings and therefore contribute zero PPR.</w:t>
       </w:r>
     </w:p>
     <w:p>
@@ -2246,7 +2511,7 @@
                 <w:color w:val="000000"/>
                 <w:sz w:val="20"/>
               </w:rPr>
-              <w:t xml:space="preserve">High</w:t>
+              <w:t>High</w:t>
             </w:r>
           </w:p>
         </w:tc>
@@ -2277,7 +2542,7 @@
                 <w:color w:val="000000"/>
                 <w:sz w:val="20"/>
               </w:rPr>
-              <w:t xml:space="preserve">142</w:t>
+              <w:t>142</w:t>
             </w:r>
           </w:p>
         </w:tc>
@@ -2308,7 +2573,7 @@
                 <w:color w:val="000000"/>
                 <w:sz w:val="20"/>
               </w:rPr>
-              <w:t xml:space="preserve">39.0208%</w:t>
+              <w:t>39.0208%</w:t>
             </w:r>
           </w:p>
         </w:tc>
@@ -2339,7 +2604,7 @@
                 <w:color w:val="000000"/>
                 <w:sz w:val="20"/>
               </w:rPr>
-              <w:t xml:space="preserve">31.8829%</w:t>
+              <w:t>31.8829%</w:t>
             </w:r>
           </w:p>
         </w:tc>
@@ -2374,7 +2639,7 @@
                 <w:color w:val="000000"/>
                 <w:sz w:val="20"/>
               </w:rPr>
-              <w:t xml:space="preserve">Medium</w:t>
+              <w:t>Medium</w:t>
             </w:r>
           </w:p>
         </w:tc>
@@ -2405,7 +2670,7 @@
                 <w:color w:val="000000"/>
                 <w:sz w:val="20"/>
               </w:rPr>
-              <w:t xml:space="preserve">165</w:t>
+              <w:t>165</w:t>
             </w:r>
           </w:p>
         </w:tc>
@@ -2436,7 +2701,7 @@
                 <w:color w:val="000000"/>
                 <w:sz w:val="20"/>
               </w:rPr>
-              <w:t xml:space="preserve">29.8334%</w:t>
+              <w:t>29.8334%</w:t>
             </w:r>
           </w:p>
         </w:tc>
@@ -2467,7 +2732,7 @@
                 <w:color w:val="000000"/>
                 <w:sz w:val="20"/>
               </w:rPr>
-              <w:t xml:space="preserve">47.7207%</w:t>
+              <w:t>47.7207%</w:t>
             </w:r>
           </w:p>
         </w:tc>
@@ -2502,7 +2767,7 @@
                 <w:color w:val="000000"/>
                 <w:sz w:val="20"/>
               </w:rPr>
-              <w:t xml:space="preserve">Low</w:t>
+              <w:t>Low</w:t>
             </w:r>
           </w:p>
         </w:tc>
@@ -2533,7 +2798,7 @@
                 <w:color w:val="000000"/>
                 <w:sz w:val="20"/>
               </w:rPr>
-              <w:t xml:space="preserve">57</w:t>
+              <w:t>57</w:t>
             </w:r>
           </w:p>
         </w:tc>
@@ -2564,7 +2829,7 @@
                 <w:color w:val="000000"/>
                 <w:sz w:val="20"/>
               </w:rPr>
-              <w:t xml:space="preserve">18.9426%</w:t>
+              <w:t>18.9426%</w:t>
             </w:r>
           </w:p>
         </w:tc>
@@ -2595,7 +2860,7 @@
                 <w:color w:val="000000"/>
                 <w:sz w:val="20"/>
               </w:rPr>
-              <w:t xml:space="preserve">16.3853%</w:t>
+              <w:t>16.3853%</w:t>
             </w:r>
           </w:p>
         </w:tc>
@@ -2630,7 +2895,7 @@
                 <w:color w:val="000000"/>
                 <w:sz w:val="20"/>
               </w:rPr>
-              <w:t xml:space="preserve">Very low</w:t>
+              <w:t>Very low</w:t>
             </w:r>
           </w:p>
         </w:tc>
@@ -2661,7 +2926,7 @@
                 <w:color w:val="000000"/>
                 <w:sz w:val="20"/>
               </w:rPr>
-              <w:t xml:space="preserve">10</w:t>
+              <w:t>10</w:t>
             </w:r>
           </w:p>
         </w:tc>
@@ -2692,7 +2957,7 @@
                 <w:color w:val="000000"/>
                 <w:sz w:val="20"/>
               </w:rPr>
-              <w:t xml:space="preserve">12.2032%</w:t>
+              <w:t>12.2032%</w:t>
             </w:r>
           </w:p>
         </w:tc>
@@ -2723,7 +2988,7 @@
                 <w:color w:val="000000"/>
                 <w:sz w:val="20"/>
               </w:rPr>
-              <w:t xml:space="preserve">4.0110%</w:t>
+              <w:t>4.0110%</w:t>
             </w:r>
           </w:p>
         </w:tc>
@@ -2758,7 +3023,7 @@
                 <w:color w:val="000000"/>
                 <w:sz w:val="20"/>
               </w:rPr>
-              <w:t xml:space="preserve">Unresolved</w:t>
+              <w:t>Unresolved</w:t>
             </w:r>
           </w:p>
         </w:tc>
@@ -2789,7 +3054,7 @@
                 <w:color w:val="000000"/>
                 <w:sz w:val="20"/>
               </w:rPr>
-              <w:t xml:space="preserve">0</w:t>
+              <w:t>0</w:t>
             </w:r>
           </w:p>
         </w:tc>
@@ -2820,7 +3085,7 @@
                 <w:color w:val="000000"/>
                 <w:sz w:val="20"/>
               </w:rPr>
-              <w:t xml:space="preserve">0.0000%</w:t>
+              <w:t>0.0000%</w:t>
             </w:r>
           </w:p>
         </w:tc>
@@ -2851,7 +3116,7 @@
                 <w:color w:val="000000"/>
                 <w:sz w:val="20"/>
               </w:rPr>
-              <w:t xml:space="preserve">0.0000%</w:t>
+              <w:t>0.0000%</w:t>
             </w:r>
           </w:p>
         </w:tc>
@@ -3034,7 +3299,7 @@
                 <w:color w:val="000000"/>
                 <w:sz w:val="20"/>
               </w:rPr>
-              <w:t xml:space="preserve">Documented taxonomy and ecology unambiguously meet the group definition</w:t>
+              <w:t>Documented taxonomy and ecology unambiguously meet the group definition</w:t>
             </w:r>
           </w:p>
         </w:tc>
@@ -3065,7 +3330,7 @@
                 <w:color w:val="000000"/>
                 <w:sz w:val="20"/>
               </w:rPr>
-              <w:t xml:space="preserve">High</w:t>
+              <w:t>High</w:t>
             </w:r>
           </w:p>
         </w:tc>
@@ -3096,7 +3361,7 @@
                 <w:color w:val="000000"/>
                 <w:sz w:val="20"/>
               </w:rPr>
-              <w:t xml:space="preserve">48.1160%</w:t>
+              <w:t>48.1160%</w:t>
             </w:r>
           </w:p>
         </w:tc>
@@ -3131,7 +3396,7 @@
                 <w:color w:val="000000"/>
                 <w:sz w:val="20"/>
               </w:rPr>
-              <w:t xml:space="preserve">Ecological fit is partial or the source definition is conflicting</w:t>
+              <w:t>Ecological fit is partial or the source definition is conflicting</w:t>
             </w:r>
           </w:p>
         </w:tc>
@@ -3162,7 +3427,7 @@
                 <w:color w:val="000000"/>
                 <w:sz w:val="20"/>
               </w:rPr>
-              <w:t xml:space="preserve">Low</w:t>
+              <w:t>Low</w:t>
             </w:r>
           </w:p>
         </w:tc>
@@ -3193,7 +3458,7 @@
                 <w:color w:val="000000"/>
                 <w:sz w:val="20"/>
               </w:rPr>
-              <w:t xml:space="preserve">16.3853%</w:t>
+              <w:t>16.3853%</w:t>
             </w:r>
           </w:p>
         </w:tc>
@@ -3228,7 +3493,7 @@
                 <w:color w:val="000000"/>
                 <w:sz w:val="20"/>
               </w:rPr>
-              <w:t xml:space="preserve">The source explicitly assigns the taxon to the model group</w:t>
+              <w:t>The source explicitly assigns the taxon to the model group</w:t>
             </w:r>
           </w:p>
         </w:tc>
@@ -3259,7 +3524,7 @@
                 <w:color w:val="000000"/>
                 <w:sz w:val="20"/>
               </w:rPr>
-              <w:t xml:space="preserve">High</w:t>
+              <w:t>High</w:t>
             </w:r>
           </w:p>
         </w:tc>
@@ -3290,7 +3555,7 @@
                 <w:color w:val="000000"/>
                 <w:sz w:val="20"/>
               </w:rPr>
-              <w:t xml:space="preserve">15.2077%</w:t>
+              <w:t>15.2077%</w:t>
             </w:r>
           </w:p>
         </w:tc>
@@ -3325,7 +3590,7 @@
                 <w:color w:val="000000"/>
                 <w:sz w:val="20"/>
               </w:rPr>
-              <w:t xml:space="preserve">Taxonomy, ecology and group definitions support the eligible group set</w:t>
+              <w:t>Taxonomy, ecology and group definitions support the eligible group set</w:t>
             </w:r>
           </w:p>
         </w:tc>
@@ -3356,7 +3621,7 @@
                 <w:color w:val="000000"/>
                 <w:sz w:val="20"/>
               </w:rPr>
-              <w:t xml:space="preserve">Medium</w:t>
+              <w:t>Medium</w:t>
             </w:r>
           </w:p>
         </w:tc>
@@ -3387,7 +3652,7 @@
                 <w:color w:val="000000"/>
                 <w:sz w:val="20"/>
               </w:rPr>
-              <w:t xml:space="preserve">15.1324%</w:t>
+              <w:t>15.1324%</w:t>
             </w:r>
           </w:p>
         </w:tc>
@@ -3422,7 +3687,7 @@
                 <w:color w:val="000000"/>
                 <w:sz w:val="20"/>
               </w:rPr>
-              <w:t xml:space="preserve">A broad catch label is approximated by compatible model groups</w:t>
+              <w:t>A broad catch label is approximated by compatible model groups</w:t>
             </w:r>
           </w:p>
         </w:tc>
@@ -3453,7 +3718,7 @@
                 <w:color w:val="000000"/>
                 <w:sz w:val="20"/>
               </w:rPr>
-              <w:t xml:space="preserve">Very low</w:t>
+              <w:t>Very low</w:t>
             </w:r>
           </w:p>
         </w:tc>
@@ -3484,7 +3749,7 @@
                 <w:color w:val="000000"/>
                 <w:sz w:val="20"/>
               </w:rPr>
-              <w:t xml:space="preserve">4.0110%</w:t>
+              <w:t>4.0110%</w:t>
             </w:r>
           </w:p>
         </w:tc>
@@ -3519,7 +3784,7 @@
                 <w:color w:val="000000"/>
                 <w:sz w:val="20"/>
               </w:rPr>
-              <w:t xml:space="preserve">Documented size and habitat support an ecological assignment</w:t>
+              <w:t>Documented size and habitat support an ecological assignment</w:t>
             </w:r>
           </w:p>
         </w:tc>
@@ -3550,7 +3815,7 @@
                 <w:color w:val="000000"/>
                 <w:sz w:val="20"/>
               </w:rPr>
-              <w:t xml:space="preserve">Medium</w:t>
+              <w:t>Medium</w:t>
             </w:r>
           </w:p>
         </w:tc>
@@ -3581,7 +3846,7 @@
                 <w:color w:val="000000"/>
                 <w:sz w:val="20"/>
               </w:rPr>
-              <w:t xml:space="preserve">1.1476%</w:t>
+              <w:t>1.1476%</w:t>
             </w:r>
           </w:p>
         </w:tc>
@@ -3616,7 +3881,7 @@
                 <w:color w:val="000000"/>
                 <w:sz w:val="20"/>
               </w:rPr>
-              <w:t xml:space="preserve">The closest represented ecological analogue substitutes for an absent group</w:t>
+              <w:t>The closest represented ecological analogue substitutes for an absent group</w:t>
             </w:r>
           </w:p>
         </w:tc>
@@ -3647,7 +3912,7 @@
                 <w:color w:val="000000"/>
                 <w:sz w:val="20"/>
               </w:rPr>
-              <w:t xml:space="preserve">Very low</w:t>
+              <w:t>Very low</w:t>
             </w:r>
           </w:p>
         </w:tc>
@@ -3678,7 +3943,7 @@
                 <w:color w:val="000000"/>
                 <w:sz w:val="20"/>
               </w:rPr>
-              <w:t xml:space="preserve">0.0000%</w:t>
+              <w:t>0.0000%</w:t>
             </w:r>
           </w:p>
         </w:tc>
@@ -3874,7 +4139,7 @@
                 <w:color w:val="000000"/>
                 <w:sz w:val="20"/>
               </w:rPr>
-              <w:t xml:space="preserve">Model catch proportions supply an assumed allocation across eligible groups</w:t>
+              <w:t>Model catch proportions supply an assumed allocation across eligible groups</w:t>
             </w:r>
           </w:p>
         </w:tc>
@@ -3905,7 +4170,7 @@
                 <w:color w:val="000000"/>
                 <w:sz w:val="20"/>
               </w:rPr>
-              <w:t xml:space="preserve">Medium</w:t>
+              <w:t>Medium</w:t>
             </w:r>
           </w:p>
         </w:tc>
@@ -3936,7 +4201,7 @@
                 <w:color w:val="000000"/>
                 <w:sz w:val="20"/>
               </w:rPr>
-              <w:t xml:space="preserve">65.0799%</w:t>
+              <w:t>65.0799%</w:t>
             </w:r>
           </w:p>
         </w:tc>
@@ -3971,7 +4236,7 @@
                 <w:color w:val="000000"/>
                 <w:sz w:val="20"/>
               </w:rPr>
-              <w:t xml:space="preserve">The taxon is assigned to one group and needs no split</w:t>
+              <w:t>The taxon is assigned to one group and needs no split</w:t>
             </w:r>
           </w:p>
         </w:tc>
@@ -4002,7 +4267,7 @@
                 <w:color w:val="000000"/>
                 <w:sz w:val="20"/>
               </w:rPr>
-              <w:t xml:space="preserve">High</w:t>
+              <w:t>High</w:t>
             </w:r>
           </w:p>
         </w:tc>
@@ -4033,7 +4298,7 @@
                 <w:color w:val="000000"/>
                 <w:sz w:val="20"/>
               </w:rPr>
-              <w:t xml:space="preserve">34.9201%</w:t>
+              <w:t>34.9201%</w:t>
             </w:r>
           </w:p>
         </w:tc>
@@ -4186,8 +4451,33 @@
                 <w:color w:val="000000"/>
                 <w:sz w:val="20"/>
               </w:rPr>
-              <w:t>Marine fishes not identified; Perciformes; Marine finfishes not identified; Chondrichthyes; Miscellaneous aquatic invertebrates; Marine groundfishes not identified; Marine pelagic fishes not identified; Gadiformes</w:t>
-            </w:r>
+              <w:t xml:space="preserve">Marine fishes not identified; Perciformes; Marine finfishes not identified; Chondrichthyes; Miscellaneous aquatic invertebrates; Marine </w:t>
+            </w:r>
+            <w:proofErr w:type="spellStart"/>
+            <w:r>
+              <w:rPr>
+                <w:color w:val="000000"/>
+                <w:sz w:val="20"/>
+              </w:rPr>
+              <w:t>groundfishes</w:t>
+            </w:r>
+            <w:proofErr w:type="spellEnd"/>
+            <w:r>
+              <w:rPr>
+                <w:color w:val="000000"/>
+                <w:sz w:val="20"/>
+              </w:rPr>
+              <w:t xml:space="preserve"> not identified; Marine pelagic fishes not identified; </w:t>
+            </w:r>
+            <w:proofErr w:type="spellStart"/>
+            <w:r>
+              <w:rPr>
+                <w:color w:val="000000"/>
+                <w:sz w:val="20"/>
+              </w:rPr>
+              <w:t>Gadiformes</w:t>
+            </w:r>
+            <w:proofErr w:type="spellEnd"/>
           </w:p>
         </w:tc>
         <w:tc>
@@ -4210,7 +4500,6 @@
           <w:p>
             <w:pPr>
               <w:spacing w:before="40" w:after="40"/>
-              <w:jc w:val="center"/>
             </w:pPr>
             <w:r>
               <w:rPr>
@@ -4276,7 +4565,6 @@
           <w:p>
             <w:pPr>
               <w:spacing w:before="40" w:after="40"/>
-              <w:jc w:val="center"/>
             </w:pPr>
             <w:r>
               <w:rPr>
@@ -4342,7 +4630,6 @@
           <w:p>
             <w:pPr>
               <w:spacing w:before="40" w:after="40"/>
-              <w:jc w:val="center"/>
             </w:pPr>
             <w:r>
               <w:rPr>
@@ -4364,12 +4651,12 @@
           <w:color w:val="000000"/>
           <w:sz w:val="21"/>
         </w:rPr>
-        <w:t xml:space="preserve">Whole model-pool catch proportions are assumed representative of regional taxon catches across 1950–2019 and all catch bases. These are not observed target-catch mixtures. Another 57 taxa retain Low confidence because of size, habitat or source-group ambiguity.</w:t>
+        <w:t>Whole model-pool catch proportions are assumed representative of regional taxon catches across 1950–2019 and all catch bases. These are not observed target-catch mixtures. Another 57 taxa retain Low confidence because of size, habitat or source-group ambiguity.</w:t>
       </w:r>
       <w:r>
         <w:t xml:space="preserve"> The four residual fish labels follow verified bony-fish reporting scope; dedicated demersal and pelagic shark/ray pools are excluded. Unknown composition and whole-region transfer remain Very low; complete source catch supplies Medium allocation weights. </w:t>
       </w:r>
-      <w:hyperlink r:id="rId44">
+      <w:hyperlink r:id="rId32">
         <w:r>
           <w:rPr>
             <w:color w:val="0563C1"/>
@@ -4386,7 +4673,7 @@
       <w:r>
         <w:t xml:space="preserve">Allocation sources: </w:t>
       </w:r>
-      <w:hyperlink r:id="rId32">
+      <w:hyperlink r:id="rId33">
         <w:r>
           <w:rPr>
             <w:color w:val="0563C1"/>
@@ -4398,7 +4685,7 @@
       <w:r>
         <w:t xml:space="preserve">; </w:t>
       </w:r>
-      <w:hyperlink r:id="rId33">
+      <w:hyperlink r:id="rId34">
         <w:r>
           <w:rPr>
             <w:color w:val="0563C1"/>
@@ -4420,7 +4707,7 @@
           <w:color w:val="000000"/>
           <w:sz w:val="21"/>
         </w:rPr>
-        <w:t xml:space="preserve">High mapping coverage does not establish model validity. The northern shelf model is extrapolated to the wider region; source-group ambiguity and the diagnostic WARN conditions above remain.</w:t>
+        <w:t>High mapping coverage does not establish model validity. The northern shelf model is extrapolated to the wider region; source-group ambiguity and the diagnostic WARN conditions above remain.</w:t>
       </w:r>
     </w:p>
     <w:p>
@@ -4546,7 +4833,7 @@
                           <pic:cNvPicPr/>
                         </pic:nvPicPr>
                         <pic:blipFill>
-                          <a:blip r:embed="rId34"/>
+                          <a:blip r:embed="rId35"/>
                           <a:stretch>
                             <a:fillRect/>
                           </a:stretch>
@@ -4574,7 +4861,7 @@
       <w:r>
         <w:t xml:space="preserve">LME_036 South China Sea (R). Retained researcher figure drawn from </w:t>
       </w:r>
-      <w:hyperlink r:id="rId35">
+      <w:hyperlink r:id="rId36">
         <w:r>
           <w:rPr>
             <w:color w:val="0563C1"/>
@@ -4586,7 +4873,7 @@
       <w:r>
         <w:t xml:space="preserve">; dataset release/date not recorded. </w:t>
       </w:r>
-      <w:hyperlink r:id="rId36">
+      <w:hyperlink r:id="rId37">
         <w:r>
           <w:rPr>
             <w:color w:val="0563C1"/>
@@ -4598,7 +4885,7 @@
       <w:r>
         <w:t xml:space="preserve"> | </w:t>
       </w:r>
-      <w:hyperlink r:id="rId37">
+      <w:hyperlink r:id="rId38">
         <w:r>
           <w:rPr>
             <w:color w:val="0563C1"/>
@@ -4717,7 +5004,7 @@
                           <pic:cNvPicPr/>
                         </pic:nvPicPr>
                         <pic:blipFill>
-                          <a:blip r:embed="rId38"/>
+                          <a:blip r:embed="rId39"/>
                           <a:stretch>
                             <a:fillRect/>
                           </a:stretch>
@@ -4745,7 +5032,7 @@
       <w:r>
         <w:t xml:space="preserve">Cheung (2007), Figure 6.1, printed p.170 / PDF p.185. Northern South China Sea shelf (S), 2000s selected model; coast to broken line. </w:t>
       </w:r>
-      <w:hyperlink r:id="rId39" w:anchor="page%3D185">
+      <w:hyperlink r:id="rId40" w:anchor="page%3D185">
         <w:r>
           <w:rPr>
             <w:color w:val="0563C1"/>
@@ -4757,7 +5044,7 @@
       <w:r>
         <w:t xml:space="preserve"> | </w:t>
       </w:r>
-      <w:hyperlink r:id="rId40">
+      <w:hyperlink r:id="rId41">
         <w:r>
           <w:rPr>
             <w:color w:val="0563C1"/>
@@ -4769,7 +5056,7 @@
       <w:r>
         <w:t xml:space="preserve"> | </w:t>
       </w:r>
-      <w:hyperlink r:id="rId41">
+      <w:hyperlink r:id="rId42">
         <w:r>
           <w:rPr>
             <w:color w:val="0563C1"/>

</xml_diff>

<commit_message>
Apply two-significant-digit percentages to LME036 validation
</commit_message>
<xml_diff>
--- a/regions/LME_036/Model_validation_36_1_South_China_Sea_SCS-2007_Northern_South_China_Sea_(2000s).docx
+++ b/regions/LME_036/Model_validation_36_1_South_China_Sea_SCS-2007_Northern_South_China_Sea_(2000s).docx
@@ -1316,7 +1316,7 @@
                 <w:color w:val="000000"/>
                 <w:sz w:val="21"/>
               </w:rPr>
-              <w:t>WARN: near-zero efficiency in (34) seabirds (GE&lt;0.01%) and Pinnipeds (GE&lt;0.1%)</w:t>
+              <w:t>WARN: near-zero efficiency in (34) seabirds (GE&lt;0.010%) and Pinnipeds (GE&lt;0.10%)</w:t>
             </w:r>
           </w:p>
           <w:p>
@@ -1624,42 +1624,6 @@
               <w:rPr>
                 <w:sz w:val="21"/>
               </w:rPr>
-              <w:t>Model-input is mass-balanced.</w:t>
-            </w:r>
-          </w:p>
-          <w:p>
-            <w:pPr>
-              <w:spacing w:after="40"/>
-              <w:rPr>
-                <w:sz w:val="21"/>
-              </w:rPr>
-            </w:pPr>
-            <w:r>
-              <w:rPr>
-                <w:sz w:val="21"/>
-              </w:rPr>
-              <w:t>DC rows sum to 1.</w:t>
-            </w:r>
-          </w:p>
-          <w:p>
-            <w:pPr>
-              <w:spacing w:after="40"/>
-              <w:rPr>
-                <w:sz w:val="21"/>
-              </w:rPr>
-            </w:pPr>
-          </w:p>
-          <w:p>
-            <w:pPr>
-              <w:spacing w:after="40"/>
-              <w:rPr>
-                <w:sz w:val="21"/>
-              </w:rPr>
-            </w:pPr>
-            <w:r>
-              <w:rPr>
-                <w:sz w:val="21"/>
-              </w:rPr>
               <w:t>Removed groups from calculation:</w:t>
             </w:r>
           </w:p>
@@ -1673,7 +1637,7 @@
               <w:spacing w:after="40"/>
             </w:pPr>
             <w:r>
-              <w:t xml:space="preserve">seabirds (GE&lt;0.01%, EE=5%, TL=3.4, </w:t>
+              <w:t xml:space="preserve">seabirds (GE&lt;0.010%, EE=5.0%, TL=3.4, </w:t>
             </w:r>
             <w:proofErr w:type="spellStart"/>
             <w:r>
@@ -1702,7 +1666,7 @@
               <w:spacing w:after="40"/>
             </w:pPr>
             <w:r>
-              <w:t xml:space="preserve">Pinnipeds (GE&lt;0.1%, EE=30%, TL=4.1, </w:t>
+              <w:t xml:space="preserve">Pinnipeds (GE&lt;0.10%, EE=30%, TL=4.1, </w:t>
             </w:r>
             <w:proofErr w:type="spellStart"/>
             <w:r>
@@ -1731,7 +1695,7 @@
               <w:spacing w:after="40"/>
             </w:pPr>
             <w:r>
-              <w:t xml:space="preserve">other mammals (GE=1%, EE=3%, TL=3.9, </w:t>
+              <w:t xml:space="preserve">other mammals (GE=1.0%, EE=3.0%, TL=3.9, </w:t>
             </w:r>
             <w:proofErr w:type="spellStart"/>
             <w:r>
@@ -1763,7 +1727,7 @@
               </w:rPr>
             </w:pPr>
             <w:r>
-              <w:t xml:space="preserve">Marine Turtles (GE=3%, EE=30%, TL=3, </w:t>
+              <w:t xml:space="preserve">Marine Turtles (GE=3.0%, EE=30%, TL=3, </w:t>
             </w:r>
             <w:proofErr w:type="spellStart"/>
             <w:r>
@@ -2573,7 +2537,7 @@
                 <w:color w:val="000000"/>
                 <w:sz w:val="20"/>
               </w:rPr>
-              <w:t>39.0208%</w:t>
+              <w:t>39%</w:t>
             </w:r>
           </w:p>
         </w:tc>
@@ -2604,7 +2568,7 @@
                 <w:color w:val="000000"/>
                 <w:sz w:val="20"/>
               </w:rPr>
-              <w:t>31.8829%</w:t>
+              <w:t>32%</w:t>
             </w:r>
           </w:p>
         </w:tc>
@@ -2701,7 +2665,7 @@
                 <w:color w:val="000000"/>
                 <w:sz w:val="20"/>
               </w:rPr>
-              <w:t>29.8334%</w:t>
+              <w:t>30%</w:t>
             </w:r>
           </w:p>
         </w:tc>
@@ -2732,7 +2696,7 @@
                 <w:color w:val="000000"/>
                 <w:sz w:val="20"/>
               </w:rPr>
-              <w:t>47.7207%</w:t>
+              <w:t>48%</w:t>
             </w:r>
           </w:p>
         </w:tc>
@@ -2829,7 +2793,7 @@
                 <w:color w:val="000000"/>
                 <w:sz w:val="20"/>
               </w:rPr>
-              <w:t>18.9426%</w:t>
+              <w:t>19%</w:t>
             </w:r>
           </w:p>
         </w:tc>
@@ -2860,7 +2824,7 @@
                 <w:color w:val="000000"/>
                 <w:sz w:val="20"/>
               </w:rPr>
-              <w:t>16.3853%</w:t>
+              <w:t>16%</w:t>
             </w:r>
           </w:p>
         </w:tc>
@@ -2957,7 +2921,7 @@
                 <w:color w:val="000000"/>
                 <w:sz w:val="20"/>
               </w:rPr>
-              <w:t>12.2032%</w:t>
+              <w:t>12%</w:t>
             </w:r>
           </w:p>
         </w:tc>
@@ -2988,7 +2952,7 @@
                 <w:color w:val="000000"/>
                 <w:sz w:val="20"/>
               </w:rPr>
-              <w:t>4.0110%</w:t>
+              <w:t>4.0%</w:t>
             </w:r>
           </w:p>
         </w:tc>
@@ -3085,7 +3049,7 @@
                 <w:color w:val="000000"/>
                 <w:sz w:val="20"/>
               </w:rPr>
-              <w:t>0.0000%</w:t>
+              <w:t>0%</w:t>
             </w:r>
           </w:p>
         </w:tc>
@@ -3116,7 +3080,7 @@
                 <w:color w:val="000000"/>
                 <w:sz w:val="20"/>
               </w:rPr>
-              <w:t>0.0000%</w:t>
+              <w:t>0%</w:t>
             </w:r>
           </w:p>
         </w:tc>
@@ -3361,7 +3325,7 @@
                 <w:color w:val="000000"/>
                 <w:sz w:val="20"/>
               </w:rPr>
-              <w:t>48.1160%</w:t>
+              <w:t>48%</w:t>
             </w:r>
           </w:p>
         </w:tc>
@@ -3458,7 +3422,7 @@
                 <w:color w:val="000000"/>
                 <w:sz w:val="20"/>
               </w:rPr>
-              <w:t>16.3853%</w:t>
+              <w:t>16%</w:t>
             </w:r>
           </w:p>
         </w:tc>
@@ -3555,7 +3519,7 @@
                 <w:color w:val="000000"/>
                 <w:sz w:val="20"/>
               </w:rPr>
-              <w:t>15.2077%</w:t>
+              <w:t>15%</w:t>
             </w:r>
           </w:p>
         </w:tc>
@@ -3652,7 +3616,7 @@
                 <w:color w:val="000000"/>
                 <w:sz w:val="20"/>
               </w:rPr>
-              <w:t>15.1324%</w:t>
+              <w:t>15%</w:t>
             </w:r>
           </w:p>
         </w:tc>
@@ -3749,7 +3713,7 @@
                 <w:color w:val="000000"/>
                 <w:sz w:val="20"/>
               </w:rPr>
-              <w:t>4.0110%</w:t>
+              <w:t>4.0%</w:t>
             </w:r>
           </w:p>
         </w:tc>
@@ -3846,7 +3810,7 @@
                 <w:color w:val="000000"/>
                 <w:sz w:val="20"/>
               </w:rPr>
-              <w:t>1.1476%</w:t>
+              <w:t>1.1%</w:t>
             </w:r>
           </w:p>
         </w:tc>
@@ -3943,7 +3907,7 @@
                 <w:color w:val="000000"/>
                 <w:sz w:val="20"/>
               </w:rPr>
-              <w:t>0.0000%</w:t>
+              <w:t>0%</w:t>
             </w:r>
           </w:p>
         </w:tc>
@@ -4201,7 +4165,7 @@
                 <w:color w:val="000000"/>
                 <w:sz w:val="20"/>
               </w:rPr>
-              <w:t>65.0799%</w:t>
+              <w:t>65%</w:t>
             </w:r>
           </w:p>
         </w:tc>
@@ -4298,7 +4262,7 @@
                 <w:color w:val="000000"/>
                 <w:sz w:val="20"/>
               </w:rPr>
-              <w:t>34.9201%</w:t>
+              <w:t>35%</w:t>
             </w:r>
           </w:p>
         </w:tc>

</xml_diff>